<commit_message>
run/build merge package files of any extension (.rex on Windows); PATH note in manual
Co-Authored-By: Claude Sonnet 5.5 <noreply@anthropic.com>
Claude-Session: https://claude.ai/code/session_012C2HMKLkyaTRCjXA8PHoVA
</commit_message>
<xml_diff>
--- a/docs/RXPIP-Guide.docx
+++ b/docs/RXPIP-Guide.docx
@@ -5456,6 +5456,176 @@
           <w:szCs w:val="21"/>
         </w:rPr>
         <w:t xml:space="preserve">, which finds the REXX file next to itself.</w:t>
+      </w:r>
+    </w:p>
+    <w:p>
+      <w:pPr>
+        <w:spacing w:after="120"/>
+      </w:pPr>
+      <w:r>
+        <w:rPr>
+          <w:rFonts w:ascii="Times New Roman" w:cs="Times New Roman" w:eastAsia="Times New Roman" w:hAnsi="Times New Roman"/>
+          <w:sz w:val="21"/>
+          <w:szCs w:val="21"/>
+        </w:rPr>
+        <w:t xml:space="preserve">To run </w:t>
+      </w:r>
+      <w:r>
+        <w:rPr>
+          <w:rFonts w:ascii="Courier New" w:cs="Courier New" w:eastAsia="Courier New" w:hAnsi="Courier New"/>
+          <w:b w:val="false"/>
+          <w:bCs w:val="false"/>
+          <w:sz w:val="19"/>
+          <w:szCs w:val="19"/>
+        </w:rPr>
+        <w:t xml:space="preserve">rxpip</w:t>
+      </w:r>
+      <w:r>
+        <w:rPr>
+          <w:rFonts w:ascii="Times New Roman" w:cs="Times New Roman" w:eastAsia="Times New Roman" w:hAnsi="Times New Roman"/>
+          <w:sz w:val="21"/>
+          <w:szCs w:val="21"/>
+        </w:rPr>
+        <w:t xml:space="preserve"> from any folder, add its folder to the </w:t>
+      </w:r>
+      <w:r>
+        <w:rPr>
+          <w:rFonts w:ascii="Courier New" w:cs="Courier New" w:eastAsia="Courier New" w:hAnsi="Courier New"/>
+          <w:b w:val="false"/>
+          <w:bCs w:val="false"/>
+          <w:sz w:val="19"/>
+          <w:szCs w:val="19"/>
+        </w:rPr>
+        <w:t xml:space="preserve">PATH</w:t>
+      </w:r>
+      <w:r>
+        <w:rPr>
+          <w:rFonts w:ascii="Times New Roman" w:cs="Times New Roman" w:eastAsia="Times New Roman" w:hAnsi="Times New Roman"/>
+          <w:sz w:val="21"/>
+          <w:szCs w:val="21"/>
+        </w:rPr>
+        <w:t xml:space="preserve"> permanently: </w:t>
+      </w:r>
+      <w:r>
+        <w:rPr>
+          <w:rFonts w:ascii="Courier New" w:cs="Courier New" w:eastAsia="Courier New" w:hAnsi="Courier New"/>
+          <w:b w:val="false"/>
+          <w:bCs w:val="false"/>
+          <w:sz w:val="19"/>
+          <w:szCs w:val="19"/>
+        </w:rPr>
+        <w:t xml:space="preserve">setx PATH "%PATH%;C:\rxpip"</w:t>
+      </w:r>
+      <w:r>
+        <w:rPr>
+          <w:rFonts w:ascii="Times New Roman" w:cs="Times New Roman" w:eastAsia="Times New Roman" w:hAnsi="Times New Roman"/>
+          <w:sz w:val="21"/>
+          <w:szCs w:val="21"/>
+        </w:rPr>
+        <w:t xml:space="preserve"> (then open a new command prompt). Until then, call it by its full path, for example </w:t>
+      </w:r>
+      <w:r>
+        <w:rPr>
+          <w:rFonts w:ascii="Courier New" w:cs="Courier New" w:eastAsia="Courier New" w:hAnsi="Courier New"/>
+          <w:b w:val="false"/>
+          <w:bCs w:val="false"/>
+          <w:sz w:val="19"/>
+          <w:szCs w:val="19"/>
+        </w:rPr>
+        <w:t xml:space="preserve">C:\rxpip\rxpip publish my.rxpkg ...</w:t>
+      </w:r>
+      <w:r>
+        <w:rPr>
+          <w:rFonts w:ascii="Times New Roman" w:cs="Times New Roman" w:eastAsia="Times New Roman" w:hAnsi="Times New Roman"/>
+          <w:sz w:val="21"/>
+          <w:szCs w:val="21"/>
+        </w:rPr>
+        <w:t xml:space="preserve">; package files may live anywhere.</w:t>
+      </w:r>
+    </w:p>
+    <w:p>
+      <w:pPr>
+        <w:spacing w:after="120"/>
+      </w:pPr>
+      <w:r>
+        <w:rPr>
+          <w:rFonts w:ascii="Times New Roman" w:cs="Times New Roman" w:eastAsia="Times New Roman" w:hAnsi="Times New Roman"/>
+          <w:sz w:val="21"/>
+          <w:szCs w:val="21"/>
+        </w:rPr>
+        <w:t xml:space="preserve">Package files may have any extension: </w:t>
+      </w:r>
+      <w:r>
+        <w:rPr>
+          <w:rFonts w:ascii="Courier New" w:cs="Courier New" w:eastAsia="Courier New" w:hAnsi="Courier New"/>
+          <w:b w:val="false"/>
+          <w:bCs w:val="false"/>
+          <w:sz w:val="19"/>
+          <w:szCs w:val="19"/>
+        </w:rPr>
+        <w:t xml:space="preserve">.rexx</w:t>
+      </w:r>
+      <w:r>
+        <w:rPr>
+          <w:rFonts w:ascii="Times New Roman" w:cs="Times New Roman" w:eastAsia="Times New Roman" w:hAnsi="Times New Roman"/>
+          <w:sz w:val="21"/>
+          <w:szCs w:val="21"/>
+        </w:rPr>
+        <w:t xml:space="preserve">, </w:t>
+      </w:r>
+      <w:r>
+        <w:rPr>
+          <w:rFonts w:ascii="Courier New" w:cs="Courier New" w:eastAsia="Courier New" w:hAnsi="Courier New"/>
+          <w:b w:val="false"/>
+          <w:bCs w:val="false"/>
+          <w:sz w:val="19"/>
+          <w:szCs w:val="19"/>
+        </w:rPr>
+        <w:t xml:space="preserve">.rex</w:t>
+      </w:r>
+      <w:r>
+        <w:rPr>
+          <w:rFonts w:ascii="Times New Roman" w:cs="Times New Roman" w:eastAsia="Times New Roman" w:hAnsi="Times New Roman"/>
+          <w:sz w:val="21"/>
+          <w:szCs w:val="21"/>
+        </w:rPr>
+        <w:t xml:space="preserve"> or others. </w:t>
+      </w:r>
+      <w:r>
+        <w:rPr>
+          <w:rFonts w:ascii="Courier New" w:cs="Courier New" w:eastAsia="Courier New" w:hAnsi="Courier New"/>
+          <w:b w:val="false"/>
+          <w:bCs w:val="false"/>
+          <w:sz w:val="19"/>
+          <w:szCs w:val="19"/>
+        </w:rPr>
+        <w:t xml:space="preserve">rxpip run</w:t>
+      </w:r>
+      <w:r>
+        <w:rPr>
+          <w:rFonts w:ascii="Times New Roman" w:cs="Times New Roman" w:eastAsia="Times New Roman" w:hAnsi="Times New Roman"/>
+          <w:sz w:val="21"/>
+          <w:szCs w:val="21"/>
+        </w:rPr>
+        <w:t xml:space="preserve"> and </w:t>
+      </w:r>
+      <w:r>
+        <w:rPr>
+          <w:rFonts w:ascii="Courier New" w:cs="Courier New" w:eastAsia="Courier New" w:hAnsi="Courier New"/>
+          <w:b w:val="false"/>
+          <w:bCs w:val="false"/>
+          <w:sz w:val="19"/>
+          <w:szCs w:val="19"/>
+        </w:rPr>
+        <w:t xml:space="preserve">build</w:t>
+      </w:r>
+      <w:r>
+        <w:rPr>
+          <w:rFonts w:ascii="Times New Roman" w:cs="Times New Roman" w:eastAsia="Times New Roman" w:hAnsi="Times New Roman"/>
+          <w:sz w:val="21"/>
+          <w:szCs w:val="21"/>
+        </w:rPr>
+        <w:t xml:space="preserve"> merge every file of the installed packages, whatever it is called.</w:t>
       </w:r>
     </w:p>
     <w:p>

</xml_diff>

<commit_message>
Install into the current directory by default; add --global/--target/--force and 'rxpip find [--sync]'
Package files are copied into the current directory with a record in ./.rxpip;
--global uses the shared store, run/build keep using it. 'find' locates all
installs below given directories, flags duplicates and older copies, and --sync
updates them. Implemented in the Regina/ooRexx, NetRexx and cREXX clients.

Co-Authored-By: Claude Sonnet 5.5 <noreply@anthropic.com>
Claude-Session: https://claude.ai/code/session_012C2HMKLkyaTRCjXA8PHoVA
</commit_message>
<xml_diff>
--- a/docs/RXPIP-Guide.docx
+++ b/docs/RXPIP-Guide.docx
@@ -501,7 +501,7 @@
           <w:sz w:val="18"/>
           <w:szCs w:val="18"/>
         </w:rPr>
-        <w:t xml:space="preserve">Version requirements	6</w:t>
+        <w:t xml:space="preserve">Version requirements	7</w:t>
       </w:r>
     </w:p>
     <w:p>
@@ -558,7 +558,7 @@
           <w:sz w:val="18"/>
           <w:szCs w:val="18"/>
         </w:rPr>
-        <w:t xml:space="preserve">How the merge works	7</w:t>
+        <w:t xml:space="preserve">How the merge works	8</w:t>
       </w:r>
     </w:p>
     <w:p>
@@ -577,7 +577,7 @@
           <w:sz w:val="21"/>
           <w:szCs w:val="21"/>
         </w:rPr>
-        <w:t xml:space="preserve">Chapter 4. Creating and Publishing a Package	8</w:t>
+        <w:t xml:space="preserve">Chapter 4. Creating and Publishing a Package	9</w:t>
       </w:r>
     </w:p>
     <w:p>
@@ -596,7 +596,7 @@
           <w:sz w:val="18"/>
           <w:szCs w:val="18"/>
         </w:rPr>
-        <w:t xml:space="preserve">What a package is	8</w:t>
+        <w:t xml:space="preserve">What a package is	9</w:t>
       </w:r>
     </w:p>
     <w:p>
@@ -615,7 +615,7 @@
           <w:sz w:val="18"/>
           <w:szCs w:val="18"/>
         </w:rPr>
-        <w:t xml:space="preserve">Writing the routines	8</w:t>
+        <w:t xml:space="preserve">Writing the routines	9</w:t>
       </w:r>
     </w:p>
     <w:p>
@@ -634,7 +634,7 @@
           <w:sz w:val="18"/>
           <w:szCs w:val="18"/>
         </w:rPr>
-        <w:t xml:space="preserve">Building the archive	8</w:t>
+        <w:t xml:space="preserve">Building the archive	9</w:t>
       </w:r>
     </w:p>
     <w:p>
@@ -653,7 +653,7 @@
           <w:sz w:val="18"/>
           <w:szCs w:val="18"/>
         </w:rPr>
-        <w:t xml:space="preserve">Publishing	9</w:t>
+        <w:t xml:space="preserve">Publishing	10</w:t>
       </w:r>
     </w:p>
     <w:p>
@@ -672,7 +672,7 @@
           <w:sz w:val="18"/>
           <w:szCs w:val="18"/>
         </w:rPr>
-        <w:t xml:space="preserve">Packages for NetRexx and cREXX	9</w:t>
+        <w:t xml:space="preserve">Packages for NetRexx and cREXX	10</w:t>
       </w:r>
     </w:p>
     <w:p>
@@ -691,7 +691,7 @@
           <w:sz w:val="18"/>
           <w:szCs w:val="18"/>
         </w:rPr>
-        <w:t xml:space="preserve">Trying a package before you publish it	10</w:t>
+        <w:t xml:space="preserve">Trying a package before you publish it	11</w:t>
       </w:r>
     </w:p>
     <w:p>
@@ -710,7 +710,7 @@
           <w:sz w:val="18"/>
           <w:szCs w:val="18"/>
         </w:rPr>
-        <w:t xml:space="preserve">Common errors	10</w:t>
+        <w:t xml:space="preserve">Common errors	11</w:t>
       </w:r>
     </w:p>
     <w:p>
@@ -729,7 +729,7 @@
           <w:sz w:val="21"/>
           <w:szCs w:val="21"/>
         </w:rPr>
-        <w:t xml:space="preserve">Chapter 5. Accounts, Tokens and Owners	11</w:t>
+        <w:t xml:space="preserve">Chapter 5. Accounts, Tokens and Owners	12</w:t>
       </w:r>
     </w:p>
     <w:p>
@@ -748,7 +748,7 @@
           <w:sz w:val="18"/>
           <w:szCs w:val="18"/>
         </w:rPr>
-        <w:t xml:space="preserve">Getting an account	11</w:t>
+        <w:t xml:space="preserve">Getting an account	12</w:t>
       </w:r>
     </w:p>
     <w:p>
@@ -767,7 +767,7 @@
           <w:sz w:val="18"/>
           <w:szCs w:val="18"/>
         </w:rPr>
-        <w:t xml:space="preserve">Tokens	11</w:t>
+        <w:t xml:space="preserve">Tokens	12</w:t>
       </w:r>
     </w:p>
     <w:p>
@@ -786,7 +786,7 @@
           <w:sz w:val="18"/>
           <w:szCs w:val="18"/>
         </w:rPr>
-        <w:t xml:space="preserve">Owners	11</w:t>
+        <w:t xml:space="preserve">Owners	12</w:t>
       </w:r>
     </w:p>
     <w:p>
@@ -805,7 +805,7 @@
           <w:sz w:val="21"/>
           <w:szCs w:val="21"/>
         </w:rPr>
-        <w:t xml:space="preserve">Chapter 6. The Web Interface	13</w:t>
+        <w:t xml:space="preserve">Chapter 6. The Web Interface	14</w:t>
       </w:r>
     </w:p>
     <w:p>
@@ -824,7 +824,7 @@
           <w:sz w:val="18"/>
           <w:szCs w:val="18"/>
         </w:rPr>
-        <w:t xml:space="preserve">What you can do in a browser	13</w:t>
+        <w:t xml:space="preserve">What you can do in a browser	14</w:t>
       </w:r>
     </w:p>
     <w:p>
@@ -843,7 +843,7 @@
           <w:sz w:val="18"/>
           <w:szCs w:val="18"/>
         </w:rPr>
-        <w:t xml:space="preserve">What needs the client	13</w:t>
+        <w:t xml:space="preserve">What needs the client	14</w:t>
       </w:r>
     </w:p>
     <w:p>
@@ -862,7 +862,7 @@
           <w:sz w:val="18"/>
           <w:szCs w:val="18"/>
         </w:rPr>
-        <w:t xml:space="preserve">Requesting an account	13</w:t>
+        <w:t xml:space="preserve">Requesting an account	14</w:t>
       </w:r>
     </w:p>
     <w:p>
@@ -881,7 +881,7 @@
           <w:sz w:val="18"/>
           <w:szCs w:val="18"/>
         </w:rPr>
-        <w:t xml:space="preserve">Safety of the pages	13</w:t>
+        <w:t xml:space="preserve">Safety of the pages	14</w:t>
       </w:r>
     </w:p>
     <w:p>
@@ -900,7 +900,7 @@
           <w:sz w:val="21"/>
           <w:szCs w:val="21"/>
         </w:rPr>
-        <w:t xml:space="preserve">Chapter 7. Installing the Server	14</w:t>
+        <w:t xml:space="preserve">Chapter 7. Installing the Server	15</w:t>
       </w:r>
     </w:p>
     <w:p>
@@ -919,7 +919,7 @@
           <w:sz w:val="18"/>
           <w:szCs w:val="18"/>
         </w:rPr>
-        <w:t xml:space="preserve">Packages	14</w:t>
+        <w:t xml:space="preserve">Packages	15</w:t>
       </w:r>
     </w:p>
     <w:p>
@@ -938,7 +938,7 @@
           <w:sz w:val="18"/>
           <w:szCs w:val="18"/>
         </w:rPr>
-        <w:t xml:space="preserve">Directories	14</w:t>
+        <w:t xml:space="preserve">Directories	15</w:t>
       </w:r>
     </w:p>
     <w:p>
@@ -957,7 +957,7 @@
           <w:sz w:val="18"/>
           <w:szCs w:val="18"/>
         </w:rPr>
-        <w:t xml:space="preserve">SELinux	14</w:t>
+        <w:t xml:space="preserve">SELinux	15</w:t>
       </w:r>
     </w:p>
     <w:p>
@@ -976,7 +976,7 @@
           <w:sz w:val="18"/>
           <w:szCs w:val="18"/>
         </w:rPr>
-        <w:t xml:space="preserve">Apache	14</w:t>
+        <w:t xml:space="preserve">Apache	15</w:t>
       </w:r>
     </w:p>
     <w:p>
@@ -995,7 +995,7 @@
           <w:sz w:val="18"/>
           <w:szCs w:val="18"/>
         </w:rPr>
-        <w:t xml:space="preserve">Firewall	15</w:t>
+        <w:t xml:space="preserve">Firewall	16</w:t>
       </w:r>
     </w:p>
     <w:p>
@@ -1014,7 +1014,7 @@
           <w:sz w:val="18"/>
           <w:szCs w:val="18"/>
         </w:rPr>
-        <w:t xml:space="preserve">HTTPS	15</w:t>
+        <w:t xml:space="preserve">HTTPS	16</w:t>
       </w:r>
     </w:p>
     <w:p>
@@ -1033,7 +1033,7 @@
           <w:sz w:val="18"/>
           <w:szCs w:val="18"/>
         </w:rPr>
-        <w:t xml:space="preserve">Sign-up mail (optional)	15</w:t>
+        <w:t xml:space="preserve">Sign-up mail (optional)	16</w:t>
       </w:r>
     </w:p>
     <w:p>
@@ -1052,7 +1052,7 @@
           <w:sz w:val="18"/>
           <w:szCs w:val="18"/>
         </w:rPr>
-        <w:t xml:space="preserve">The first account	16</w:t>
+        <w:t xml:space="preserve">The first account	17</w:t>
       </w:r>
     </w:p>
     <w:p>
@@ -1071,7 +1071,7 @@
           <w:sz w:val="21"/>
           <w:szCs w:val="21"/>
         </w:rPr>
-        <w:t xml:space="preserve">Chapter 8. Operating the Server	17</w:t>
+        <w:t xml:space="preserve">Chapter 8. Operating the Server	18</w:t>
       </w:r>
     </w:p>
     <w:p>
@@ -1090,7 +1090,7 @@
           <w:sz w:val="18"/>
           <w:szCs w:val="18"/>
         </w:rPr>
-        <w:t xml:space="preserve">Administration commands	17</w:t>
+        <w:t xml:space="preserve">Administration commands	18</w:t>
       </w:r>
     </w:p>
     <w:p>
@@ -1109,7 +1109,7 @@
           <w:sz w:val="18"/>
           <w:szCs w:val="18"/>
         </w:rPr>
-        <w:t xml:space="preserve">Where things are stored	17</w:t>
+        <w:t xml:space="preserve">Where things are stored	18</w:t>
       </w:r>
     </w:p>
     <w:p>
@@ -1128,7 +1128,7 @@
           <w:sz w:val="18"/>
           <w:szCs w:val="18"/>
         </w:rPr>
-        <w:t xml:space="preserve">Backup and restore	17</w:t>
+        <w:t xml:space="preserve">Backup and restore	18</w:t>
       </w:r>
     </w:p>
     <w:p>
@@ -1147,7 +1147,7 @@
           <w:sz w:val="18"/>
           <w:szCs w:val="18"/>
         </w:rPr>
-        <w:t xml:space="preserve">Upgrading	17</w:t>
+        <w:t xml:space="preserve">Upgrading	18</w:t>
       </w:r>
     </w:p>
     <w:p>
@@ -1166,7 +1166,7 @@
           <w:sz w:val="18"/>
           <w:szCs w:val="18"/>
         </w:rPr>
-        <w:t xml:space="preserve">Limits	17</w:t>
+        <w:t xml:space="preserve">Limits	18</w:t>
       </w:r>
     </w:p>
     <w:p>
@@ -1185,7 +1185,7 @@
           <w:sz w:val="18"/>
           <w:szCs w:val="18"/>
         </w:rPr>
-        <w:t xml:space="preserve">Troubleshooting	18</w:t>
+        <w:t xml:space="preserve">Troubleshooting	19</w:t>
       </w:r>
     </w:p>
     <w:p>
@@ -1204,7 +1204,7 @@
           <w:sz w:val="21"/>
           <w:szCs w:val="21"/>
         </w:rPr>
-        <w:t xml:space="preserve">Chapter 9. Protocol Reference	19</w:t>
+        <w:t xml:space="preserve">Chapter 9. Protocol Reference	20</w:t>
       </w:r>
     </w:p>
     <w:p>
@@ -1223,7 +1223,7 @@
           <w:sz w:val="18"/>
           <w:szCs w:val="18"/>
         </w:rPr>
-        <w:t xml:space="preserve">Response format	19</w:t>
+        <w:t xml:space="preserve">Response format	20</w:t>
       </w:r>
     </w:p>
     <w:p>
@@ -1242,7 +1242,7 @@
           <w:sz w:val="18"/>
           <w:szCs w:val="18"/>
         </w:rPr>
-        <w:t xml:space="preserve">Actions without a login	19</w:t>
+        <w:t xml:space="preserve">Actions without a login	20</w:t>
       </w:r>
     </w:p>
     <w:p>
@@ -1261,7 +1261,7 @@
           <w:sz w:val="18"/>
           <w:szCs w:val="18"/>
         </w:rPr>
-        <w:t xml:space="preserve">Actions that need a token	19</w:t>
+        <w:t xml:space="preserve">Actions that need a token	20</w:t>
       </w:r>
     </w:p>
     <w:p>
@@ -1280,7 +1280,7 @@
           <w:sz w:val="18"/>
           <w:szCs w:val="18"/>
         </w:rPr>
-        <w:t xml:space="preserve">Error codes	20</w:t>
+        <w:t xml:space="preserve">Error codes	21</w:t>
       </w:r>
     </w:p>
     <w:p>
@@ -1299,7 +1299,7 @@
           <w:sz w:val="21"/>
           <w:szCs w:val="21"/>
         </w:rPr>
-        <w:t xml:space="preserve">Chapter 10. Security	21</w:t>
+        <w:t xml:space="preserve">Chapter 10. Security	22</w:t>
       </w:r>
     </w:p>
     <w:p>
@@ -1318,7 +1318,7 @@
           <w:sz w:val="18"/>
           <w:szCs w:val="18"/>
         </w:rPr>
-        <w:t xml:space="preserve">Tokens and invitations	21</w:t>
+        <w:t xml:space="preserve">Tokens and invitations	22</w:t>
       </w:r>
     </w:p>
     <w:p>
@@ -1337,7 +1337,7 @@
           <w:sz w:val="18"/>
           <w:szCs w:val="18"/>
         </w:rPr>
-        <w:t xml:space="preserve">Publishing	21</w:t>
+        <w:t xml:space="preserve">Publishing	22</w:t>
       </w:r>
     </w:p>
     <w:p>
@@ -1356,7 +1356,7 @@
           <w:sz w:val="18"/>
           <w:szCs w:val="18"/>
         </w:rPr>
-        <w:t xml:space="preserve">Sign-up requests	21</w:t>
+        <w:t xml:space="preserve">Sign-up requests	22</w:t>
       </w:r>
     </w:p>
     <w:p>
@@ -1375,7 +1375,7 @@
           <w:sz w:val="18"/>
           <w:szCs w:val="18"/>
         </w:rPr>
-        <w:t xml:space="preserve">The web pages	21</w:t>
+        <w:t xml:space="preserve">The web pages	22</w:t>
       </w:r>
     </w:p>
     <w:p>
@@ -1394,7 +1394,7 @@
           <w:sz w:val="18"/>
           <w:szCs w:val="18"/>
         </w:rPr>
-        <w:t xml:space="preserve">What RXPIP does not protect against	22</w:t>
+        <w:t xml:space="preserve">What RXPIP does not protect against	23</w:t>
       </w:r>
     </w:p>
     <w:p>
@@ -1413,7 +1413,7 @@
           <w:sz w:val="21"/>
           <w:szCs w:val="21"/>
         </w:rPr>
-        <w:t xml:space="preserve">Chapter 11. Restrictions and Known Problems	23</w:t>
+        <w:t xml:space="preserve">Chapter 11. Restrictions and Known Problems	24</w:t>
       </w:r>
     </w:p>
     <w:p>
@@ -1432,7 +1432,7 @@
           <w:sz w:val="18"/>
           <w:szCs w:val="18"/>
         </w:rPr>
-        <w:t xml:space="preserve">What has been tested	23</w:t>
+        <w:t xml:space="preserve">What has been tested	24</w:t>
       </w:r>
     </w:p>
     <w:p>
@@ -1451,7 +1451,7 @@
           <w:sz w:val="18"/>
           <w:szCs w:val="18"/>
         </w:rPr>
-        <w:t xml:space="preserve">What has not been tested	23</w:t>
+        <w:t xml:space="preserve">What has not been tested	24</w:t>
       </w:r>
     </w:p>
     <w:p>
@@ -1470,7 +1470,7 @@
           <w:sz w:val="18"/>
           <w:szCs w:val="18"/>
         </w:rPr>
-        <w:t xml:space="preserve">Known limitations	23</w:t>
+        <w:t xml:space="preserve">Known limitations	24</w:t>
       </w:r>
     </w:p>
     <w:p>
@@ -1489,7 +1489,7 @@
           <w:sz w:val="21"/>
           <w:szCs w:val="21"/>
         </w:rPr>
-        <w:t xml:space="preserve">Appendix A. Command Summary	24</w:t>
+        <w:t xml:space="preserve">Appendix A. Command Summary	25</w:t>
       </w:r>
     </w:p>
     <w:p>
@@ -1508,7 +1508,7 @@
           <w:sz w:val="18"/>
           <w:szCs w:val="18"/>
         </w:rPr>
-        <w:t xml:space="preserve">Client commands	24</w:t>
+        <w:t xml:space="preserve">Client commands	25</w:t>
       </w:r>
     </w:p>
     <w:p>
@@ -1527,7 +1527,7 @@
           <w:sz w:val="21"/>
           <w:szCs w:val="21"/>
         </w:rPr>
-        <w:t xml:space="preserve">Appendix B. Server Administration Commands	25</w:t>
+        <w:t xml:space="preserve">Appendix B. Server Administration Commands	26</w:t>
       </w:r>
     </w:p>
     <w:p>
@@ -1546,7 +1546,7 @@
           <w:sz w:val="21"/>
           <w:szCs w:val="21"/>
         </w:rPr>
-        <w:t xml:space="preserve">Appendix C. Environment Variables and Files	26</w:t>
+        <w:t xml:space="preserve">Appendix C. Environment Variables and Files	27</w:t>
       </w:r>
     </w:p>
     <w:p>
@@ -1565,7 +1565,7 @@
           <w:sz w:val="18"/>
           <w:szCs w:val="18"/>
         </w:rPr>
-        <w:t xml:space="preserve">Environment variables	26</w:t>
+        <w:t xml:space="preserve">Environment variables	27</w:t>
       </w:r>
     </w:p>
     <w:p>
@@ -1584,7 +1584,7 @@
           <w:sz w:val="18"/>
           <w:szCs w:val="18"/>
         </w:rPr>
-        <w:t xml:space="preserve">Files	26</w:t>
+        <w:t xml:space="preserve">Files	27</w:t>
       </w:r>
     </w:p>
     <w:p>
@@ -1603,7 +1603,7 @@
           <w:sz w:val="21"/>
           <w:szCs w:val="21"/>
         </w:rPr>
-        <w:t xml:space="preserve">Appendix D. Contents of the Kit	27</w:t>
+        <w:t xml:space="preserve">Appendix D. Contents of the Kit	28</w:t>
       </w:r>
     </w:p>
     <w:p>
@@ -3268,7 +3268,7 @@
           <w:sz w:val="21"/>
           <w:szCs w:val="21"/>
         </w:rPr>
-        <w:t xml:space="preserve">Classic REXX interpreters, Regina included, do not look in the current directory for a file named after an external routine. A file called </w:t>
+        <w:t xml:space="preserve">Regina and ooRexx find an external routine by file name: a call to </w:t>
       </w:r>
       <w:r>
         <w:rPr>
@@ -3278,15 +3278,15 @@
           <w:sz w:val="19"/>
           <w:szCs w:val="19"/>
         </w:rPr>
-        <w:t xml:space="preserve">Square.rexx</w:t>
-      </w:r>
-      <w:r>
-        <w:rPr>
-          <w:rFonts w:ascii="Times New Roman" w:cs="Times New Roman" w:eastAsia="Times New Roman" w:hAnsi="Times New Roman"/>
-          <w:sz w:val="21"/>
-          <w:szCs w:val="21"/>
-        </w:rPr>
-        <w:t xml:space="preserve"> is not found when your program calls </w:t>
+        <w:t xml:space="preserve">Square(7)</w:t>
+      </w:r>
+      <w:r>
+        <w:rPr>
+          <w:rFonts w:ascii="Times New Roman" w:cs="Times New Roman" w:eastAsia="Times New Roman" w:hAnsi="Times New Roman"/>
+          <w:sz w:val="21"/>
+          <w:szCs w:val="21"/>
+        </w:rPr>
+        <w:t xml:space="preserve"> runs the file </w:t>
       </w:r>
       <w:r>
         <w:rPr>
@@ -3296,15 +3296,15 @@
           <w:sz w:val="19"/>
           <w:szCs w:val="19"/>
         </w:rPr>
-        <w:t xml:space="preserve">Square(7)</w:t>
-      </w:r>
-      <w:r>
-        <w:rPr>
-          <w:rFonts w:ascii="Times New Roman" w:cs="Times New Roman" w:eastAsia="Times New Roman" w:hAnsi="Times New Roman"/>
-          <w:sz w:val="21"/>
-          <w:szCs w:val="21"/>
-        </w:rPr>
-        <w:t xml:space="preserve">. RXPIP therefore uses the one method that works identically everywhere: it joins your program, a safety </w:t>
+        <w:t xml:space="preserve">Square.rexx</w:t>
+      </w:r>
+      <w:r>
+        <w:rPr>
+          <w:rFonts w:ascii="Times New Roman" w:cs="Times New Roman" w:eastAsia="Times New Roman" w:hAnsi="Times New Roman"/>
+          <w:sz w:val="21"/>
+          <w:szCs w:val="21"/>
+        </w:rPr>
+        <w:t xml:space="preserve"> (or </w:t>
       </w:r>
       <w:r>
         <w:rPr>
@@ -3314,15 +3314,15 @@
           <w:sz w:val="19"/>
           <w:szCs w:val="19"/>
         </w:rPr>
-        <w:t xml:space="preserve">exit</w:t>
-      </w:r>
-      <w:r>
-        <w:rPr>
-          <w:rFonts w:ascii="Times New Roman" w:cs="Times New Roman" w:eastAsia="Times New Roman" w:hAnsi="Times New Roman"/>
-          <w:sz w:val="21"/>
-          <w:szCs w:val="21"/>
-        </w:rPr>
-        <w:t xml:space="preserve">, and the source of every installed package into one ordinary REXX program, in which every required routine is simply another label. </w:t>
+        <w:t xml:space="preserve">.rex</w:t>
+      </w:r>
+      <w:r>
+        <w:rPr>
+          <w:rFonts w:ascii="Times New Roman" w:cs="Times New Roman" w:eastAsia="Times New Roman" w:hAnsi="Times New Roman"/>
+          <w:sz w:val="21"/>
+          <w:szCs w:val="21"/>
+        </w:rPr>
+        <w:t xml:space="preserve">) in the current directory or on the </w:t>
       </w:r>
       <w:r>
         <w:rPr>
@@ -3332,15 +3332,15 @@
           <w:sz w:val="19"/>
           <w:szCs w:val="19"/>
         </w:rPr>
-        <w:t xml:space="preserve">rxpip install</w:t>
-      </w:r>
-      <w:r>
-        <w:rPr>
-          <w:rFonts w:ascii="Times New Roman" w:cs="Times New Roman" w:eastAsia="Times New Roman" w:hAnsi="Times New Roman"/>
-          <w:sz w:val="21"/>
-          <w:szCs w:val="21"/>
-        </w:rPr>
-        <w:t xml:space="preserve"> on its own only fetches the files; </w:t>
+        <w:t xml:space="preserve">PATH</w:t>
+      </w:r>
+      <w:r>
+        <w:rPr>
+          <w:rFonts w:ascii="Times New Roman" w:cs="Times New Roman" w:eastAsia="Times New Roman" w:hAnsi="Times New Roman"/>
+          <w:sz w:val="21"/>
+          <w:szCs w:val="21"/>
+        </w:rPr>
+        <w:t xml:space="preserve">. That works for a package whose files each hold one routine and are named after it, and you can use such a package straight from the directory it was installed in. It does not work when one file holds several routines, or when a routine in one file needs a label in another. For those cases RXPIP uses a method that works identically everywhere: it joins your program, a safety </w:t>
       </w:r>
       <w:r>
         <w:rPr>
@@ -3350,15 +3350,15 @@
           <w:sz w:val="19"/>
           <w:szCs w:val="19"/>
         </w:rPr>
-        <w:t xml:space="preserve">run</w:t>
-      </w:r>
-      <w:r>
-        <w:rPr>
-          <w:rFonts w:ascii="Times New Roman" w:cs="Times New Roman" w:eastAsia="Times New Roman" w:hAnsi="Times New Roman"/>
-          <w:sz w:val="21"/>
-          <w:szCs w:val="21"/>
-        </w:rPr>
-        <w:t xml:space="preserve"> and </w:t>
+        <w:t xml:space="preserve">exit</w:t>
+      </w:r>
+      <w:r>
+        <w:rPr>
+          <w:rFonts w:ascii="Times New Roman" w:cs="Times New Roman" w:eastAsia="Times New Roman" w:hAnsi="Times New Roman"/>
+          <w:sz w:val="21"/>
+          <w:szCs w:val="21"/>
+        </w:rPr>
+        <w:t xml:space="preserve">, and the source of every installed package of the shared store into one ordinary REXX program, in which every required routine is simply another label. </w:t>
       </w:r>
       <w:r>
         <w:rPr>
@@ -3368,6 +3368,24 @@
           <w:sz w:val="19"/>
           <w:szCs w:val="19"/>
         </w:rPr>
+        <w:t xml:space="preserve">run</w:t>
+      </w:r>
+      <w:r>
+        <w:rPr>
+          <w:rFonts w:ascii="Times New Roman" w:cs="Times New Roman" w:eastAsia="Times New Roman" w:hAnsi="Times New Roman"/>
+          <w:sz w:val="21"/>
+          <w:szCs w:val="21"/>
+        </w:rPr>
+        <w:t xml:space="preserve"> and </w:t>
+      </w:r>
+      <w:r>
+        <w:rPr>
+          <w:rFonts w:ascii="Courier New" w:cs="Courier New" w:eastAsia="Courier New" w:hAnsi="Courier New"/>
+          <w:b w:val="false"/>
+          <w:bCs w:val="false"/>
+          <w:sz w:val="19"/>
+          <w:szCs w:val="19"/>
+        </w:rPr>
         <w:t xml:space="preserve">build</w:t>
       </w:r>
       <w:r>
@@ -3376,7 +3394,7 @@
           <w:sz w:val="21"/>
           <w:szCs w:val="21"/>
         </w:rPr>
-        <w:t xml:space="preserve"> make them callable.</w:t>
+        <w:t xml:space="preserve"> do this.</w:t>
       </w:r>
     </w:p>
     <w:p>
@@ -7744,28 +7762,15 @@
                 <w:sz w:val="17"/>
                 <w:szCs w:val="17"/>
               </w:rPr>
-              <w:t xml:space="preserve">rxpip uninstall &lt;name&gt;</w:t>
-            </w:r>
-          </w:p>
-        </w:tc>
-        <w:tc>
-          <w:tcPr>
-            <w:tcW w:type="dxa" w:w="6138"/>
-            <w:tcMar>
-              <w:top w:type="dxa" w:w="60"/>
-              <w:left w:type="dxa" w:w="100"/>
-              <w:bottom w:type="dxa" w:w="60"/>
-              <w:right w:type="dxa" w:w="100"/>
-            </w:tcMar>
-          </w:tcPr>
-          <w:p>
-            <w:r>
-              <w:rPr>
-                <w:rFonts w:ascii="Times New Roman" w:cs="Times New Roman" w:eastAsia="Times New Roman" w:hAnsi="Times New Roman"/>
-                <w:sz w:val="18"/>
-                <w:szCs w:val="18"/>
-              </w:rPr>
-              <w:t xml:space="preserve">Remove a package from </w:t>
+              <w:t xml:space="preserve">rxpip install --upgrade &lt;name&gt;</w:t>
+            </w:r>
+            <w:r>
+              <w:rPr>
+                <w:rFonts w:ascii="Times New Roman" w:cs="Times New Roman" w:eastAsia="Times New Roman" w:hAnsi="Times New Roman"/>
+                <w:sz w:val="18"/>
+                <w:szCs w:val="18"/>
+              </w:rPr>
+              <w:t xml:space="preserve"> (or </w:t>
             </w:r>
             <w:r>
               <w:rPr>
@@ -7775,15 +7780,36 @@
                 <w:sz w:val="17"/>
                 <w:szCs w:val="17"/>
               </w:rPr>
-              <w:t xml:space="preserve">lib/</w:t>
-            </w:r>
-            <w:r>
-              <w:rPr>
-                <w:rFonts w:ascii="Times New Roman" w:cs="Times New Roman" w:eastAsia="Times New Roman" w:hAnsi="Times New Roman"/>
-                <w:sz w:val="18"/>
-                <w:szCs w:val="18"/>
-              </w:rPr>
-              <w:t xml:space="preserve"> and from the installed list. Packages it required are left in place.</w:t>
+              <w:t xml:space="preserve">-U</w:t>
+            </w:r>
+            <w:r>
+              <w:rPr>
+                <w:rFonts w:ascii="Times New Roman" w:cs="Times New Roman" w:eastAsia="Times New Roman" w:hAnsi="Times New Roman"/>
+                <w:sz w:val="18"/>
+                <w:szCs w:val="18"/>
+              </w:rPr>
+              <w:t xml:space="preserve">)</w:t>
+            </w:r>
+          </w:p>
+        </w:tc>
+        <w:tc>
+          <w:tcPr>
+            <w:tcW w:type="dxa" w:w="6138"/>
+            <w:tcMar>
+              <w:top w:type="dxa" w:w="60"/>
+              <w:left w:type="dxa" w:w="100"/>
+              <w:bottom w:type="dxa" w:w="60"/>
+              <w:right w:type="dxa" w:w="100"/>
+            </w:tcMar>
+          </w:tcPr>
+          <w:p>
+            <w:r>
+              <w:rPr>
+                <w:rFonts w:ascii="Times New Roman" w:cs="Times New Roman" w:eastAsia="Times New Roman" w:hAnsi="Times New Roman"/>
+                <w:sz w:val="18"/>
+                <w:szCs w:val="18"/>
+              </w:rPr>
+              <w:t xml:space="preserve">Replace an installed package by the newest version</w:t>
             </w:r>
           </w:p>
         </w:tc>
@@ -7811,7 +7837,7 @@
                 <w:sz w:val="17"/>
                 <w:szCs w:val="17"/>
               </w:rPr>
-              <w:t xml:space="preserve">rxpip list</w:t>
+              <w:t xml:space="preserve">rxpip uninstall &lt;name&gt;</w:t>
             </w:r>
           </w:p>
         </w:tc>
@@ -7832,7 +7858,7 @@
                 <w:sz w:val="18"/>
                 <w:szCs w:val="18"/>
               </w:rPr>
-              <w:t xml:space="preserve">List installed packages with their versions and summaries</w:t>
+              <w:t xml:space="preserve">Remove a package’s files and its record. Packages it required are left in place.</w:t>
             </w:r>
           </w:p>
         </w:tc>
@@ -7860,7 +7886,7 @@
                 <w:sz w:val="17"/>
                 <w:szCs w:val="17"/>
               </w:rPr>
-              <w:t xml:space="preserve">rxpip freeze</w:t>
+              <w:t xml:space="preserve">rxpip list</w:t>
             </w:r>
           </w:p>
         </w:tc>
@@ -7881,8 +7907,26 @@
                 <w:sz w:val="18"/>
                 <w:szCs w:val="18"/>
               </w:rPr>
-              <w:t xml:space="preserve">Print </w:t>
-            </w:r>
+              <w:t xml:space="preserve">List installed packages with their versions and summaries</w:t>
+            </w:r>
+          </w:p>
+        </w:tc>
+      </w:tr>
+      <w:tr>
+        <w:trPr>
+          <w:cantSplit/>
+        </w:trPr>
+        <w:tc>
+          <w:tcPr>
+            <w:tcW w:type="dxa" w:w="3500"/>
+            <w:tcMar>
+              <w:top w:type="dxa" w:w="60"/>
+              <w:left w:type="dxa" w:w="100"/>
+              <w:bottom w:type="dxa" w:w="60"/>
+              <w:right w:type="dxa" w:w="100"/>
+            </w:tcMar>
+          </w:tcPr>
+          <w:p>
             <w:r>
               <w:rPr>
                 <w:rFonts w:ascii="Courier New" w:cs="Courier New" w:eastAsia="Courier New" w:hAnsi="Courier New"/>
@@ -7891,6 +7935,37 @@
                 <w:sz w:val="17"/>
                 <w:szCs w:val="17"/>
               </w:rPr>
+              <w:t xml:space="preserve">rxpip freeze</w:t>
+            </w:r>
+          </w:p>
+        </w:tc>
+        <w:tc>
+          <w:tcPr>
+            <w:tcW w:type="dxa" w:w="6138"/>
+            <w:tcMar>
+              <w:top w:type="dxa" w:w="60"/>
+              <w:left w:type="dxa" w:w="100"/>
+              <w:bottom w:type="dxa" w:w="60"/>
+              <w:right w:type="dxa" w:w="100"/>
+            </w:tcMar>
+          </w:tcPr>
+          <w:p>
+            <w:r>
+              <w:rPr>
+                <w:rFonts w:ascii="Times New Roman" w:cs="Times New Roman" w:eastAsia="Times New Roman" w:hAnsi="Times New Roman"/>
+                <w:sz w:val="18"/>
+                <w:szCs w:val="18"/>
+              </w:rPr>
+              <w:t xml:space="preserve">Print </w:t>
+            </w:r>
+            <w:r>
+              <w:rPr>
+                <w:rFonts w:ascii="Courier New" w:cs="Courier New" w:eastAsia="Courier New" w:hAnsi="Courier New"/>
+                <w:b w:val="false"/>
+                <w:bCs w:val="false"/>
+                <w:sz w:val="17"/>
+                <w:szCs w:val="17"/>
+              </w:rPr>
               <w:t xml:space="preserve">name==version</w:t>
             </w:r>
             <w:r>
@@ -7900,6 +7975,73 @@
                 <w:szCs w:val="18"/>
               </w:rPr>
               <w:t xml:space="preserve"> for every installed package, one per line, suitable for a requirements file</w:t>
+            </w:r>
+          </w:p>
+        </w:tc>
+      </w:tr>
+      <w:tr>
+        <w:trPr>
+          <w:cantSplit/>
+        </w:trPr>
+        <w:tc>
+          <w:tcPr>
+            <w:tcW w:type="dxa" w:w="3500"/>
+            <w:tcMar>
+              <w:top w:type="dxa" w:w="60"/>
+              <w:left w:type="dxa" w:w="100"/>
+              <w:bottom w:type="dxa" w:w="60"/>
+              <w:right w:type="dxa" w:w="100"/>
+            </w:tcMar>
+          </w:tcPr>
+          <w:p>
+            <w:r>
+              <w:rPr>
+                <w:rFonts w:ascii="Courier New" w:cs="Courier New" w:eastAsia="Courier New" w:hAnsi="Courier New"/>
+                <w:b w:val="false"/>
+                <w:bCs w:val="false"/>
+                <w:sz w:val="17"/>
+                <w:szCs w:val="17"/>
+              </w:rPr>
+              <w:t xml:space="preserve">rxpip find [dir...] [--sync]</w:t>
+            </w:r>
+          </w:p>
+        </w:tc>
+        <w:tc>
+          <w:tcPr>
+            <w:tcW w:type="dxa" w:w="6138"/>
+            <w:tcMar>
+              <w:top w:type="dxa" w:w="60"/>
+              <w:left w:type="dxa" w:w="100"/>
+              <w:bottom w:type="dxa" w:w="60"/>
+              <w:right w:type="dxa" w:w="100"/>
+            </w:tcMar>
+          </w:tcPr>
+          <w:p>
+            <w:r>
+              <w:rPr>
+                <w:rFonts w:ascii="Times New Roman" w:cs="Times New Roman" w:eastAsia="Times New Roman" w:hAnsi="Times New Roman"/>
+                <w:sz w:val="18"/>
+                <w:szCs w:val="18"/>
+              </w:rPr>
+              <w:t xml:space="preserve">Find every RXPIP install below the given directories (default: the current one) and the shared store; show duplicates and older copies. </w:t>
+            </w:r>
+            <w:r>
+              <w:rPr>
+                <w:rFonts w:ascii="Courier New" w:cs="Courier New" w:eastAsia="Courier New" w:hAnsi="Courier New"/>
+                <w:b w:val="false"/>
+                <w:bCs w:val="false"/>
+                <w:sz w:val="17"/>
+                <w:szCs w:val="17"/>
+              </w:rPr>
+              <w:t xml:space="preserve">--sync</w:t>
+            </w:r>
+            <w:r>
+              <w:rPr>
+                <w:rFonts w:ascii="Times New Roman" w:cs="Times New Roman" w:eastAsia="Times New Roman" w:hAnsi="Times New Roman"/>
+                <w:sz w:val="18"/>
+                <w:szCs w:val="18"/>
+              </w:rPr>
+              <w:t xml:space="preserve"> brings the older copies up to the newest version found.</w:t>
             </w:r>
           </w:p>
         </w:tc>
@@ -7957,7 +8099,7 @@
           <w:sz w:val="21"/>
           <w:szCs w:val="21"/>
         </w:rPr>
-        <w:t xml:space="preserve">, unpacks it into </w:t>
+        <w:t xml:space="preserve"> and unpacks it into </w:t>
       </w:r>
       <w:r>
         <w:rPr>
@@ -7975,7 +8117,38 @@
           <w:sz w:val="21"/>
           <w:szCs w:val="21"/>
         </w:rPr>
-        <w:t xml:space="preserve"> and copies its </w:t>
+        <w:t xml:space="preserve"> in the RXPIP home directory.</w:t>
+      </w:r>
+    </w:p>
+    <w:p>
+      <w:pPr>
+        <w:pStyle w:val="Heading3"/>
+        <w:keepNext/>
+        <w:spacing w:after="100" w:before="220"/>
+      </w:pPr>
+      <w:r>
+        <w:rPr>
+          <w:rFonts w:ascii="Arial" w:cs="Arial" w:eastAsia="Arial" w:hAnsi="Arial"/>
+          <w:b/>
+          <w:bCs/>
+          <w:color w:val="000000"/>
+          <w:sz w:val="22"/>
+          <w:szCs w:val="22"/>
+        </w:rPr>
+        <w:t xml:space="preserve">Where packages are installed</w:t>
+      </w:r>
+    </w:p>
+    <w:p>
+      <w:pPr>
+        <w:spacing w:after="120"/>
+      </w:pPr>
+      <w:r>
+        <w:rPr>
+          <w:rFonts w:ascii="Times New Roman" w:cs="Times New Roman" w:eastAsia="Times New Roman" w:hAnsi="Times New Roman"/>
+          <w:sz w:val="21"/>
+          <w:szCs w:val="21"/>
+        </w:rPr>
+        <w:t xml:space="preserve">By default </w:t>
       </w:r>
       <w:r>
         <w:rPr>
@@ -7985,15 +8158,15 @@
           <w:sz w:val="19"/>
           <w:szCs w:val="19"/>
         </w:rPr>
-        <w:t xml:space="preserve">.rexx</w:t>
-      </w:r>
-      <w:r>
-        <w:rPr>
-          <w:rFonts w:ascii="Times New Roman" w:cs="Times New Roman" w:eastAsia="Times New Roman" w:hAnsi="Times New Roman"/>
-          <w:sz w:val="21"/>
-          <w:szCs w:val="21"/>
-        </w:rPr>
-        <w:t xml:space="preserve"> files into </w:t>
+        <w:t xml:space="preserve">install</w:t>
+      </w:r>
+      <w:r>
+        <w:rPr>
+          <w:rFonts w:ascii="Times New Roman" w:cs="Times New Roman" w:eastAsia="Times New Roman" w:hAnsi="Times New Roman"/>
+          <w:sz w:val="21"/>
+          <w:szCs w:val="21"/>
+        </w:rPr>
+        <w:t xml:space="preserve">, </w:t>
       </w:r>
       <w:r>
         <w:rPr>
@@ -8003,15 +8176,496 @@
           <w:sz w:val="19"/>
           <w:szCs w:val="19"/>
         </w:rPr>
-        <w:t xml:space="preserve">lib/</w:t>
-      </w:r>
-      <w:r>
-        <w:rPr>
-          <w:rFonts w:ascii="Times New Roman" w:cs="Times New Roman" w:eastAsia="Times New Roman" w:hAnsi="Times New Roman"/>
-          <w:sz w:val="21"/>
-          <w:szCs w:val="21"/>
-        </w:rPr>
-        <w:t xml:space="preserve">.</w:t>
+        <w:t xml:space="preserve">uninstall</w:t>
+      </w:r>
+      <w:r>
+        <w:rPr>
+          <w:rFonts w:ascii="Times New Roman" w:cs="Times New Roman" w:eastAsia="Times New Roman" w:hAnsi="Times New Roman"/>
+          <w:sz w:val="21"/>
+          <w:szCs w:val="21"/>
+        </w:rPr>
+        <w:t xml:space="preserve">, </w:t>
+      </w:r>
+      <w:r>
+        <w:rPr>
+          <w:rFonts w:ascii="Courier New" w:cs="Courier New" w:eastAsia="Courier New" w:hAnsi="Courier New"/>
+          <w:b w:val="false"/>
+          <w:bCs w:val="false"/>
+          <w:sz w:val="19"/>
+          <w:szCs w:val="19"/>
+        </w:rPr>
+        <w:t xml:space="preserve">list</w:t>
+      </w:r>
+      <w:r>
+        <w:rPr>
+          <w:rFonts w:ascii="Times New Roman" w:cs="Times New Roman" w:eastAsia="Times New Roman" w:hAnsi="Times New Roman"/>
+          <w:sz w:val="21"/>
+          <w:szCs w:val="21"/>
+        </w:rPr>
+        <w:t xml:space="preserve">, </w:t>
+      </w:r>
+      <w:r>
+        <w:rPr>
+          <w:rFonts w:ascii="Courier New" w:cs="Courier New" w:eastAsia="Courier New" w:hAnsi="Courier New"/>
+          <w:b w:val="false"/>
+          <w:bCs w:val="false"/>
+          <w:sz w:val="19"/>
+          <w:szCs w:val="19"/>
+        </w:rPr>
+        <w:t xml:space="preserve">freeze</w:t>
+      </w:r>
+      <w:r>
+        <w:rPr>
+          <w:rFonts w:ascii="Times New Roman" w:cs="Times New Roman" w:eastAsia="Times New Roman" w:hAnsi="Times New Roman"/>
+          <w:sz w:val="21"/>
+          <w:szCs w:val="21"/>
+        </w:rPr>
+        <w:t xml:space="preserve"> and </w:t>
+      </w:r>
+      <w:r>
+        <w:rPr>
+          <w:rFonts w:ascii="Courier New" w:cs="Courier New" w:eastAsia="Courier New" w:hAnsi="Courier New"/>
+          <w:b w:val="false"/>
+          <w:bCs w:val="false"/>
+          <w:sz w:val="19"/>
+          <w:szCs w:val="19"/>
+        </w:rPr>
+        <w:t xml:space="preserve">scan</w:t>
+      </w:r>
+      <w:r>
+        <w:rPr>
+          <w:rFonts w:ascii="Times New Roman" w:cs="Times New Roman" w:eastAsia="Times New Roman" w:hAnsi="Times New Roman"/>
+          <w:sz w:val="21"/>
+          <w:szCs w:val="21"/>
+        </w:rPr>
+        <w:t xml:space="preserve"> work on the </w:t>
+      </w:r>
+      <w:r>
+        <w:rPr>
+          <w:rFonts w:ascii="Times New Roman" w:cs="Times New Roman" w:eastAsia="Times New Roman" w:hAnsi="Times New Roman"/>
+          <w:b/>
+          <w:bCs/>
+          <w:sz w:val="21"/>
+          <w:szCs w:val="21"/>
+        </w:rPr>
+        <w:t xml:space="preserve">current directory</w:t>
+      </w:r>
+      <w:r>
+        <w:rPr>
+          <w:rFonts w:ascii="Times New Roman" w:cs="Times New Roman" w:eastAsia="Times New Roman" w:hAnsi="Times New Roman"/>
+          <w:sz w:val="21"/>
+          <w:szCs w:val="21"/>
+        </w:rPr>
+        <w:t xml:space="preserve">. The package files are copied into it as ordinary files, and RXPIP keeps a small record of what it installed in the subdirectory </w:t>
+      </w:r>
+      <w:r>
+        <w:rPr>
+          <w:rFonts w:ascii="Courier New" w:cs="Courier New" w:eastAsia="Courier New" w:hAnsi="Courier New"/>
+          <w:b w:val="false"/>
+          <w:bCs w:val="false"/>
+          <w:sz w:val="19"/>
+          <w:szCs w:val="19"/>
+        </w:rPr>
+        <w:t xml:space="preserve">.rxpip</w:t>
+      </w:r>
+      <w:r>
+        <w:rPr>
+          <w:rFonts w:ascii="Times New Roman" w:cs="Times New Roman" w:eastAsia="Times New Roman" w:hAnsi="Times New Roman"/>
+          <w:sz w:val="21"/>
+          <w:szCs w:val="21"/>
+        </w:rPr>
+        <w:t xml:space="preserve">. Two projects can therefore hold different versions of the same package. A program in that directory can use the files like any other file in the directory, without RXPIP at run time.</w:t>
+      </w:r>
+    </w:p>
+    <w:tbl>
+      <w:tblPr>
+        <w:tblW w:type="dxa" w:w="9638"/>
+        <w:tblBorders>
+          <w:top w:val="single" w:color="808080" w:sz="4"/>
+          <w:left w:val="single" w:color="808080" w:sz="4"/>
+          <w:bottom w:val="single" w:color="808080" w:sz="4"/>
+          <w:right w:val="single" w:color="808080" w:sz="4"/>
+          <w:insideH w:val="single" w:color="808080" w:sz="4"/>
+          <w:insideV w:val="single" w:color="808080" w:sz="4"/>
+        </w:tblBorders>
+      </w:tblPr>
+      <w:tblGrid>
+        <w:gridCol w:w="3500"/>
+        <w:gridCol w:w="6138"/>
+      </w:tblGrid>
+      <w:tr>
+        <w:trPr>
+          <w:cantSplit/>
+          <w:tblHeader/>
+        </w:trPr>
+        <w:tc>
+          <w:tcPr>
+            <w:tcW w:type="dxa" w:w="3500"/>
+            <w:shd w:fill="D9D9D9" w:color="auto" w:val="clear"/>
+            <w:tcMar>
+              <w:top w:type="dxa" w:w="60"/>
+              <w:left w:type="dxa" w:w="100"/>
+              <w:bottom w:type="dxa" w:w="60"/>
+              <w:right w:type="dxa" w:w="100"/>
+            </w:tcMar>
+          </w:tcPr>
+          <w:p>
+            <w:r>
+              <w:rPr>
+                <w:rFonts w:ascii="Arial" w:cs="Arial" w:eastAsia="Arial" w:hAnsi="Arial"/>
+                <w:b/>
+                <w:bCs/>
+                <w:sz w:val="18"/>
+                <w:szCs w:val="18"/>
+              </w:rPr>
+              <w:t xml:space="preserve">Option</w:t>
+            </w:r>
+          </w:p>
+        </w:tc>
+        <w:tc>
+          <w:tcPr>
+            <w:tcW w:type="dxa" w:w="6138"/>
+            <w:shd w:fill="D9D9D9" w:color="auto" w:val="clear"/>
+            <w:tcMar>
+              <w:top w:type="dxa" w:w="60"/>
+              <w:left w:type="dxa" w:w="100"/>
+              <w:bottom w:type="dxa" w:w="60"/>
+              <w:right w:type="dxa" w:w="100"/>
+            </w:tcMar>
+          </w:tcPr>
+          <w:p>
+            <w:r>
+              <w:rPr>
+                <w:rFonts w:ascii="Arial" w:cs="Arial" w:eastAsia="Arial" w:hAnsi="Arial"/>
+                <w:b/>
+                <w:bCs/>
+                <w:sz w:val="18"/>
+                <w:szCs w:val="18"/>
+              </w:rPr>
+              <w:t xml:space="preserve">Effect</w:t>
+            </w:r>
+          </w:p>
+        </w:tc>
+      </w:tr>
+      <w:tr>
+        <w:trPr>
+          <w:cantSplit/>
+        </w:trPr>
+        <w:tc>
+          <w:tcPr>
+            <w:tcW w:type="dxa" w:w="3500"/>
+            <w:tcMar>
+              <w:top w:type="dxa" w:w="60"/>
+              <w:left w:type="dxa" w:w="100"/>
+              <w:bottom w:type="dxa" w:w="60"/>
+              <w:right w:type="dxa" w:w="100"/>
+            </w:tcMar>
+          </w:tcPr>
+          <w:p>
+            <w:r>
+              <w:rPr>
+                <w:rFonts w:ascii="Courier New" w:cs="Courier New" w:eastAsia="Courier New" w:hAnsi="Courier New"/>
+                <w:b w:val="false"/>
+                <w:bCs w:val="false"/>
+                <w:sz w:val="17"/>
+                <w:szCs w:val="17"/>
+              </w:rPr>
+              <w:t xml:space="preserve">--global</w:t>
+            </w:r>
+            <w:r>
+              <w:rPr>
+                <w:rFonts w:ascii="Times New Roman" w:cs="Times New Roman" w:eastAsia="Times New Roman" w:hAnsi="Times New Roman"/>
+                <w:sz w:val="18"/>
+                <w:szCs w:val="18"/>
+              </w:rPr>
+              <w:t xml:space="preserve">, </w:t>
+            </w:r>
+            <w:r>
+              <w:rPr>
+                <w:rFonts w:ascii="Courier New" w:cs="Courier New" w:eastAsia="Courier New" w:hAnsi="Courier New"/>
+                <w:b w:val="false"/>
+                <w:bCs w:val="false"/>
+                <w:sz w:val="17"/>
+                <w:szCs w:val="17"/>
+              </w:rPr>
+              <w:t xml:space="preserve">-g</w:t>
+            </w:r>
+          </w:p>
+        </w:tc>
+        <w:tc>
+          <w:tcPr>
+            <w:tcW w:type="dxa" w:w="6138"/>
+            <w:tcMar>
+              <w:top w:type="dxa" w:w="60"/>
+              <w:left w:type="dxa" w:w="100"/>
+              <w:bottom w:type="dxa" w:w="60"/>
+              <w:right w:type="dxa" w:w="100"/>
+            </w:tcMar>
+          </w:tcPr>
+          <w:p>
+            <w:r>
+              <w:rPr>
+                <w:rFonts w:ascii="Times New Roman" w:cs="Times New Roman" w:eastAsia="Times New Roman" w:hAnsi="Times New Roman"/>
+                <w:sz w:val="18"/>
+                <w:szCs w:val="18"/>
+              </w:rPr>
+              <w:t xml:space="preserve">Use the shared store in the RXPIP home directory (</w:t>
+            </w:r>
+            <w:r>
+              <w:rPr>
+                <w:rFonts w:ascii="Courier New" w:cs="Courier New" w:eastAsia="Courier New" w:hAnsi="Courier New"/>
+                <w:b w:val="false"/>
+                <w:bCs w:val="false"/>
+                <w:sz w:val="17"/>
+                <w:szCs w:val="17"/>
+              </w:rPr>
+              <w:t xml:space="preserve">lib/</w:t>
+            </w:r>
+            <w:r>
+              <w:rPr>
+                <w:rFonts w:ascii="Times New Roman" w:cs="Times New Roman" w:eastAsia="Times New Roman" w:hAnsi="Times New Roman"/>
+                <w:sz w:val="18"/>
+                <w:szCs w:val="18"/>
+              </w:rPr>
+              <w:t xml:space="preserve">, </w:t>
+            </w:r>
+            <w:r>
+              <w:rPr>
+                <w:rFonts w:ascii="Courier New" w:cs="Courier New" w:eastAsia="Courier New" w:hAnsi="Courier New"/>
+                <w:b w:val="false"/>
+                <w:bCs w:val="false"/>
+                <w:sz w:val="17"/>
+                <w:szCs w:val="17"/>
+              </w:rPr>
+              <w:t xml:space="preserve">installed.txt</w:t>
+            </w:r>
+            <w:r>
+              <w:rPr>
+                <w:rFonts w:ascii="Times New Roman" w:cs="Times New Roman" w:eastAsia="Times New Roman" w:hAnsi="Times New Roman"/>
+                <w:sz w:val="18"/>
+                <w:szCs w:val="18"/>
+              </w:rPr>
+              <w:t xml:space="preserve">) instead of the current directory. </w:t>
+            </w:r>
+            <w:r>
+              <w:rPr>
+                <w:rFonts w:ascii="Courier New" w:cs="Courier New" w:eastAsia="Courier New" w:hAnsi="Courier New"/>
+                <w:b w:val="false"/>
+                <w:bCs w:val="false"/>
+                <w:sz w:val="17"/>
+                <w:szCs w:val="17"/>
+              </w:rPr>
+              <w:t xml:space="preserve">run</w:t>
+            </w:r>
+            <w:r>
+              <w:rPr>
+                <w:rFonts w:ascii="Times New Roman" w:cs="Times New Roman" w:eastAsia="Times New Roman" w:hAnsi="Times New Roman"/>
+                <w:sz w:val="18"/>
+                <w:szCs w:val="18"/>
+              </w:rPr>
+              <w:t xml:space="preserve"> and </w:t>
+            </w:r>
+            <w:r>
+              <w:rPr>
+                <w:rFonts w:ascii="Courier New" w:cs="Courier New" w:eastAsia="Courier New" w:hAnsi="Courier New"/>
+                <w:b w:val="false"/>
+                <w:bCs w:val="false"/>
+                <w:sz w:val="17"/>
+                <w:szCs w:val="17"/>
+              </w:rPr>
+              <w:t xml:space="preserve">build</w:t>
+            </w:r>
+            <w:r>
+              <w:rPr>
+                <w:rFonts w:ascii="Times New Roman" w:cs="Times New Roman" w:eastAsia="Times New Roman" w:hAnsi="Times New Roman"/>
+                <w:sz w:val="18"/>
+                <w:szCs w:val="18"/>
+              </w:rPr>
+              <w:t xml:space="preserve"> always use the shared store.</w:t>
+            </w:r>
+          </w:p>
+        </w:tc>
+      </w:tr>
+      <w:tr>
+        <w:trPr>
+          <w:cantSplit/>
+        </w:trPr>
+        <w:tc>
+          <w:tcPr>
+            <w:tcW w:type="dxa" w:w="3500"/>
+            <w:tcMar>
+              <w:top w:type="dxa" w:w="60"/>
+              <w:left w:type="dxa" w:w="100"/>
+              <w:bottom w:type="dxa" w:w="60"/>
+              <w:right w:type="dxa" w:w="100"/>
+            </w:tcMar>
+          </w:tcPr>
+          <w:p>
+            <w:r>
+              <w:rPr>
+                <w:rFonts w:ascii="Courier New" w:cs="Courier New" w:eastAsia="Courier New" w:hAnsi="Courier New"/>
+                <w:b w:val="false"/>
+                <w:bCs w:val="false"/>
+                <w:sz w:val="17"/>
+                <w:szCs w:val="17"/>
+              </w:rPr>
+              <w:t xml:space="preserve">--target=DIR</w:t>
+            </w:r>
+            <w:r>
+              <w:rPr>
+                <w:rFonts w:ascii="Times New Roman" w:cs="Times New Roman" w:eastAsia="Times New Roman" w:hAnsi="Times New Roman"/>
+                <w:sz w:val="18"/>
+                <w:szCs w:val="18"/>
+              </w:rPr>
+              <w:t xml:space="preserve">, </w:t>
+            </w:r>
+            <w:r>
+              <w:rPr>
+                <w:rFonts w:ascii="Courier New" w:cs="Courier New" w:eastAsia="Courier New" w:hAnsi="Courier New"/>
+                <w:b w:val="false"/>
+                <w:bCs w:val="false"/>
+                <w:sz w:val="17"/>
+                <w:szCs w:val="17"/>
+              </w:rPr>
+              <w:t xml:space="preserve">-t DIR</w:t>
+            </w:r>
+          </w:p>
+        </w:tc>
+        <w:tc>
+          <w:tcPr>
+            <w:tcW w:type="dxa" w:w="6138"/>
+            <w:tcMar>
+              <w:top w:type="dxa" w:w="60"/>
+              <w:left w:type="dxa" w:w="100"/>
+              <w:bottom w:type="dxa" w:w="60"/>
+              <w:right w:type="dxa" w:w="100"/>
+            </w:tcMar>
+          </w:tcPr>
+          <w:p>
+            <w:r>
+              <w:rPr>
+                <w:rFonts w:ascii="Times New Roman" w:cs="Times New Roman" w:eastAsia="Times New Roman" w:hAnsi="Times New Roman"/>
+                <w:sz w:val="18"/>
+                <w:szCs w:val="18"/>
+              </w:rPr>
+              <w:t xml:space="preserve">Use the directory DIR instead of the current directory</w:t>
+            </w:r>
+          </w:p>
+        </w:tc>
+      </w:tr>
+      <w:tr>
+        <w:trPr>
+          <w:cantSplit/>
+        </w:trPr>
+        <w:tc>
+          <w:tcPr>
+            <w:tcW w:type="dxa" w:w="3500"/>
+            <w:tcMar>
+              <w:top w:type="dxa" w:w="60"/>
+              <w:left w:type="dxa" w:w="100"/>
+              <w:bottom w:type="dxa" w:w="60"/>
+              <w:right w:type="dxa" w:w="100"/>
+            </w:tcMar>
+          </w:tcPr>
+          <w:p>
+            <w:r>
+              <w:rPr>
+                <w:rFonts w:ascii="Courier New" w:cs="Courier New" w:eastAsia="Courier New" w:hAnsi="Courier New"/>
+                <w:b w:val="false"/>
+                <w:bCs w:val="false"/>
+                <w:sz w:val="17"/>
+                <w:szCs w:val="17"/>
+              </w:rPr>
+              <w:t xml:space="preserve">--force</w:t>
+            </w:r>
+          </w:p>
+        </w:tc>
+        <w:tc>
+          <w:tcPr>
+            <w:tcW w:type="dxa" w:w="6138"/>
+            <w:tcMar>
+              <w:top w:type="dxa" w:w="60"/>
+              <w:left w:type="dxa" w:w="100"/>
+              <w:bottom w:type="dxa" w:w="60"/>
+              <w:right w:type="dxa" w:w="100"/>
+            </w:tcMar>
+          </w:tcPr>
+          <w:p>
+            <w:r>
+              <w:rPr>
+                <w:rFonts w:ascii="Times New Roman" w:cs="Times New Roman" w:eastAsia="Times New Roman" w:hAnsi="Times New Roman"/>
+                <w:sz w:val="18"/>
+                <w:szCs w:val="18"/>
+              </w:rPr>
+              <w:t xml:space="preserve">Overwrite a file that RXPIP did not put there. Without it RXPIP refuses, so a file of your own with the same name is never replaced.</w:t>
+            </w:r>
+          </w:p>
+        </w:tc>
+      </w:tr>
+    </w:tbl>
+    <w:p>
+      <w:pPr>
+        <w:keepLines/>
+        <w:spacing w:after="200" w:before="80"/>
+      </w:pPr>
+      <w:r>
+        <w:rPr>
+          <w:rFonts w:ascii="Arial" w:cs="Arial" w:eastAsia="Arial" w:hAnsi="Arial"/>
+          <w:b/>
+          <w:bCs/>
+          <w:sz w:val="18"/>
+          <w:szCs w:val="18"/>
+        </w:rPr>
+        <w:t xml:space="preserve">Figure 11. </w:t>
+      </w:r>
+      <w:r>
+        <w:rPr>
+          <w:rFonts w:ascii="Arial" w:cs="Arial" w:eastAsia="Arial" w:hAnsi="Arial"/>
+          <w:sz w:val="18"/>
+          <w:szCs w:val="18"/>
+        </w:rPr>
+        <w:t xml:space="preserve">Scope options</w:t>
+      </w:r>
+    </w:p>
+    <w:p>
+      <w:pPr>
+        <w:spacing w:after="120"/>
+      </w:pPr>
+      <w:r>
+        <w:rPr>
+          <w:rFonts w:ascii="Courier New" w:cs="Courier New" w:eastAsia="Courier New" w:hAnsi="Courier New"/>
+          <w:b w:val="false"/>
+          <w:bCs w:val="false"/>
+          <w:sz w:val="19"/>
+          <w:szCs w:val="19"/>
+        </w:rPr>
+        <w:t xml:space="preserve">rxpip find</w:t>
+      </w:r>
+      <w:r>
+        <w:rPr>
+          <w:rFonts w:ascii="Times New Roman" w:cs="Times New Roman" w:eastAsia="Times New Roman" w:hAnsi="Times New Roman"/>
+          <w:sz w:val="21"/>
+          <w:szCs w:val="21"/>
+        </w:rPr>
+        <w:t xml:space="preserve"> helps when installs have spread over several directories. It lists every install it finds, marks a package that exists in more than one place and marks the copies that are older than the newest version found. </w:t>
+      </w:r>
+      <w:r>
+        <w:rPr>
+          <w:rFonts w:ascii="Courier New" w:cs="Courier New" w:eastAsia="Courier New" w:hAnsi="Courier New"/>
+          <w:b w:val="false"/>
+          <w:bCs w:val="false"/>
+          <w:sz w:val="19"/>
+          <w:szCs w:val="19"/>
+        </w:rPr>
+        <w:t xml:space="preserve">rxpip find --sync</w:t>
+      </w:r>
+      <w:r>
+        <w:rPr>
+          <w:rFonts w:ascii="Times New Roman" w:cs="Times New Roman" w:eastAsia="Times New Roman" w:hAnsi="Times New Roman"/>
+          <w:sz w:val="21"/>
+          <w:szCs w:val="21"/>
+        </w:rPr>
+        <w:t xml:space="preserve"> then updates those copies in place.</w:t>
       </w:r>
     </w:p>
     <w:p>
@@ -8367,7 +9021,7 @@
           <w:sz w:val="18"/>
           <w:szCs w:val="18"/>
         </w:rPr>
-        <w:t xml:space="preserve">Figure 11. </w:t>
+        <w:t xml:space="preserve">Figure 12. </w:t>
       </w:r>
       <w:r>
         <w:rPr>
@@ -8672,7 +9326,7 @@
           <w:sz w:val="18"/>
           <w:szCs w:val="18"/>
         </w:rPr>
-        <w:t xml:space="preserve">Figure 12. </w:t>
+        <w:t xml:space="preserve">Figure 13. </w:t>
       </w:r>
       <w:r>
         <w:rPr>
@@ -9118,7 +9772,7 @@
           <w:sz w:val="18"/>
           <w:szCs w:val="18"/>
         </w:rPr>
-        <w:t xml:space="preserve">Figure 13. </w:t>
+        <w:t xml:space="preserve">Figure 14. </w:t>
       </w:r>
       <w:r>
         <w:rPr>
@@ -9448,7 +10102,7 @@
           <w:sz w:val="18"/>
           <w:szCs w:val="18"/>
         </w:rPr>
-        <w:t xml:space="preserve">Figure 14. </w:t>
+        <w:t xml:space="preserve">Figure 15. </w:t>
       </w:r>
       <w:r>
         <w:rPr>
@@ -9779,7 +10433,7 @@
           <w:sz w:val="18"/>
           <w:szCs w:val="18"/>
         </w:rPr>
-        <w:t xml:space="preserve">Figure 15. </w:t>
+        <w:t xml:space="preserve">Figure 16. </w:t>
       </w:r>
       <w:r>
         <w:rPr>
@@ -10482,7 +11136,7 @@
           <w:sz w:val="18"/>
           <w:szCs w:val="18"/>
         </w:rPr>
-        <w:t xml:space="preserve">Figure 16. </w:t>
+        <w:t xml:space="preserve">Figure 17. </w:t>
       </w:r>
       <w:r>
         <w:rPr>
@@ -10819,7 +11473,7 @@
           <w:sz w:val="18"/>
           <w:szCs w:val="18"/>
         </w:rPr>
-        <w:t xml:space="preserve">Figure 17. </w:t>
+        <w:t xml:space="preserve">Figure 18. </w:t>
       </w:r>
       <w:r>
         <w:rPr>
@@ -11558,7 +12212,7 @@
           <w:sz w:val="18"/>
           <w:szCs w:val="18"/>
         </w:rPr>
-        <w:t xml:space="preserve">Figure 18. </w:t>
+        <w:t xml:space="preserve">Figure 19. </w:t>
       </w:r>
       <w:r>
         <w:rPr>
@@ -11831,7 +12485,7 @@
           <w:sz w:val="18"/>
           <w:szCs w:val="18"/>
         </w:rPr>
-        <w:t xml:space="preserve">Figure 19. </w:t>
+        <w:t xml:space="preserve">Figure 20. </w:t>
       </w:r>
       <w:r>
         <w:rPr>
@@ -12372,7 +13026,7 @@
           <w:sz w:val="18"/>
           <w:szCs w:val="18"/>
         </w:rPr>
-        <w:t xml:space="preserve">Figure 20. </w:t>
+        <w:t xml:space="preserve">Figure 21. </w:t>
       </w:r>
       <w:r>
         <w:rPr>
@@ -12679,7 +13333,7 @@
           <w:sz w:val="18"/>
           <w:szCs w:val="18"/>
         </w:rPr>
-        <w:t xml:space="preserve">Figure 21. </w:t>
+        <w:t xml:space="preserve">Figure 22. </w:t>
       </w:r>
       <w:r>
         <w:rPr>
@@ -12944,7 +13598,7 @@
           <w:sz w:val="18"/>
           <w:szCs w:val="18"/>
         </w:rPr>
-        <w:t xml:space="preserve">Figure 22. </w:t>
+        <w:t xml:space="preserve">Figure 23. </w:t>
       </w:r>
       <w:r>
         <w:rPr>
@@ -13418,7 +14072,7 @@
           <w:sz w:val="18"/>
           <w:szCs w:val="18"/>
         </w:rPr>
-        <w:t xml:space="preserve">Figure 23. </w:t>
+        <w:t xml:space="preserve">Figure 24. </w:t>
       </w:r>
       <w:r>
         <w:rPr>
@@ -14024,7 +14678,7 @@
           <w:sz w:val="18"/>
           <w:szCs w:val="18"/>
         </w:rPr>
-        <w:t xml:space="preserve">Figure 24. </w:t>
+        <w:t xml:space="preserve">Figure 25. </w:t>
       </w:r>
       <w:r>
         <w:rPr>
@@ -14411,7 +15065,7 @@
           <w:sz w:val="18"/>
           <w:szCs w:val="18"/>
         </w:rPr>
-        <w:t xml:space="preserve">Figure 25. </w:t>
+        <w:t xml:space="preserve">Figure 26. </w:t>
       </w:r>
       <w:r>
         <w:rPr>
@@ -14690,7 +15344,7 @@
           <w:sz w:val="18"/>
           <w:szCs w:val="18"/>
         </w:rPr>
-        <w:t xml:space="preserve">Figure 26. </w:t>
+        <w:t xml:space="preserve">Figure 27. </w:t>
       </w:r>
       <w:r>
         <w:rPr>
@@ -15081,7 +15735,7 @@
           <w:sz w:val="18"/>
           <w:szCs w:val="18"/>
         </w:rPr>
-        <w:t xml:space="preserve">Figure 27. </w:t>
+        <w:t xml:space="preserve">Figure 28. </w:t>
       </w:r>
       <w:r>
         <w:rPr>
@@ -15262,7 +15916,7 @@
           <w:sz w:val="18"/>
           <w:szCs w:val="18"/>
         </w:rPr>
-        <w:t xml:space="preserve">Figure 28. </w:t>
+        <w:t xml:space="preserve">Figure 29. </w:t>
       </w:r>
       <w:r>
         <w:rPr>
@@ -15484,7 +16138,7 @@
           <w:sz w:val="18"/>
           <w:szCs w:val="18"/>
         </w:rPr>
-        <w:t xml:space="preserve">Figure 29. </w:t>
+        <w:t xml:space="preserve">Figure 30. </w:t>
       </w:r>
       <w:r>
         <w:rPr>
@@ -15696,7 +16350,7 @@
           <w:sz w:val="18"/>
           <w:szCs w:val="18"/>
         </w:rPr>
-        <w:t xml:space="preserve">Figure 30. </w:t>
+        <w:t xml:space="preserve">Figure 31. </w:t>
       </w:r>
       <w:r>
         <w:rPr>
@@ -15900,7 +16554,7 @@
           <w:sz w:val="18"/>
           <w:szCs w:val="18"/>
         </w:rPr>
-        <w:t xml:space="preserve">Figure 31. </w:t>
+        <w:t xml:space="preserve">Figure 32. </w:t>
       </w:r>
       <w:r>
         <w:rPr>
@@ -16142,7 +16796,7 @@
           <w:sz w:val="18"/>
           <w:szCs w:val="18"/>
         </w:rPr>
-        <w:t xml:space="preserve">Figure 32. </w:t>
+        <w:t xml:space="preserve">Figure 33. </w:t>
       </w:r>
       <w:r>
         <w:rPr>
@@ -16388,7 +17042,7 @@
           <w:sz w:val="18"/>
           <w:szCs w:val="18"/>
         </w:rPr>
-        <w:t xml:space="preserve">Figure 33. </w:t>
+        <w:t xml:space="preserve">Figure 34. </w:t>
       </w:r>
       <w:r>
         <w:rPr>
@@ -16520,7 +17174,7 @@
           <w:sz w:val="18"/>
           <w:szCs w:val="18"/>
         </w:rPr>
-        <w:t xml:space="preserve">Figure 34. </w:t>
+        <w:t xml:space="preserve">Figure 35. </w:t>
       </w:r>
       <w:r>
         <w:rPr>
@@ -17120,7 +17774,7 @@
           <w:sz w:val="18"/>
           <w:szCs w:val="18"/>
         </w:rPr>
-        <w:t xml:space="preserve">Figure 35. </w:t>
+        <w:t xml:space="preserve">Figure 36. </w:t>
       </w:r>
       <w:r>
         <w:rPr>
@@ -17808,7 +18462,7 @@
           <w:sz w:val="18"/>
           <w:szCs w:val="18"/>
         </w:rPr>
-        <w:t xml:space="preserve">Figure 36. </w:t>
+        <w:t xml:space="preserve">Figure 37. </w:t>
       </w:r>
       <w:r>
         <w:rPr>
@@ -18161,7 +18815,7 @@
           <w:sz w:val="18"/>
           <w:szCs w:val="18"/>
         </w:rPr>
-        <w:t xml:space="preserve">Figure 37. </w:t>
+        <w:t xml:space="preserve">Figure 38. </w:t>
       </w:r>
       <w:r>
         <w:rPr>
@@ -19570,7 +20224,7 @@
           <w:sz w:val="18"/>
           <w:szCs w:val="18"/>
         </w:rPr>
-        <w:t xml:space="preserve">Figure 38. </w:t>
+        <w:t xml:space="preserve">Figure 39. </w:t>
       </w:r>
       <w:r>
         <w:rPr>
@@ -20327,7 +20981,7 @@
           <w:sz w:val="18"/>
           <w:szCs w:val="18"/>
         </w:rPr>
-        <w:t xml:space="preserve">Figure 39. </w:t>
+        <w:t xml:space="preserve">Figure 40. </w:t>
       </w:r>
       <w:r>
         <w:rPr>
@@ -21590,7 +22244,7 @@
           <w:sz w:val="18"/>
           <w:szCs w:val="18"/>
         </w:rPr>
-        <w:t xml:space="preserve">Figure 40. </w:t>
+        <w:t xml:space="preserve">Figure 41. </w:t>
       </w:r>
       <w:r>
         <w:rPr>
@@ -24116,7 +24770,7 @@
           <w:sz w:val="18"/>
           <w:szCs w:val="18"/>
         </w:rPr>
-        <w:t xml:space="preserve">Figure 41. </w:t>
+        <w:t xml:space="preserve">Figure 42. </w:t>
       </w:r>
       <w:r>
         <w:rPr>
@@ -24705,7 +25359,7 @@
           <w:sz w:val="18"/>
           <w:szCs w:val="18"/>
         </w:rPr>
-        <w:t xml:space="preserve">Figure 42. </w:t>
+        <w:t xml:space="preserve">Figure 43. </w:t>
       </w:r>
       <w:r>
         <w:rPr>
@@ -25797,7 +26451,7 @@
           <w:sz w:val="18"/>
           <w:szCs w:val="18"/>
         </w:rPr>
-        <w:t xml:space="preserve">Figure 43. </w:t>
+        <w:t xml:space="preserve">Figure 44. </w:t>
       </w:r>
       <w:r>
         <w:rPr>
@@ -26443,7 +27097,7 @@
           <w:sz w:val="18"/>
           <w:szCs w:val="18"/>
         </w:rPr>
-        <w:t xml:space="preserve">Figure 44. </w:t>
+        <w:t xml:space="preserve">Figure 45. </w:t>
       </w:r>
       <w:r>
         <w:rPr>
@@ -27418,7 +28072,7 @@
           <w:sz w:val="18"/>
           <w:szCs w:val="18"/>
         </w:rPr>
-        <w:t xml:space="preserve">Figure 45. </w:t>
+        <w:t xml:space="preserve">Figure 46. </w:t>
       </w:r>
       <w:r>
         <w:rPr>

</xml_diff>

<commit_message>
NetRexx and cREXX clients: token on reads, --private, visibility and reader commands; document private packages and the closed repository
Co-Authored-By: Claude Sonnet 5.5 <noreply@anthropic.com>
Claude-Session: https://claude.ai/code/session_012C2HMKLkyaTRCjXA8PHoVA
</commit_message>
<xml_diff>
--- a/docs/RXPIP-Guide.docx
+++ b/docs/RXPIP-Guide.docx
@@ -787,6 +787,25 @@
           <w:szCs w:val="18"/>
         </w:rPr>
         <w:t xml:space="preserve">Owners	12</w:t>
+      </w:r>
+    </w:p>
+    <w:p>
+      <w:pPr>
+        <w:tabs>
+          <w:tab w:val="right" w:pos="9638" w:leader="dot"/>
+        </w:tabs>
+        <w:spacing w:after="20" w:before="0"/>
+        <w:ind w:left="280"/>
+      </w:pPr>
+      <w:r>
+        <w:rPr>
+          <w:rFonts w:ascii="Times New Roman" w:cs="Times New Roman" w:eastAsia="Times New Roman" w:hAnsi="Times New Roman"/>
+          <w:b w:val="false"/>
+          <w:bCs w:val="false"/>
+          <w:sz w:val="18"/>
+          <w:szCs w:val="18"/>
+        </w:rPr>
+        <w:t xml:space="preserve">Private packages	13</w:t>
       </w:r>
     </w:p>
     <w:p>
@@ -13344,6 +13363,207 @@
         <w:t xml:space="preserve">Managing owners</w:t>
       </w:r>
     </w:p>
+    <w:p>
+      <w:pPr>
+        <w:pStyle w:val="Heading2"/>
+        <w:keepNext/>
+        <w:spacing w:after="140" w:before="320"/>
+      </w:pPr>
+      <w:r>
+        <w:rPr>
+          <w:rFonts w:ascii="Arial" w:cs="Arial" w:eastAsia="Arial" w:hAnsi="Arial"/>
+          <w:b/>
+          <w:bCs/>
+          <w:color w:val="000000"/>
+          <w:sz w:val="26"/>
+          <w:szCs w:val="26"/>
+        </w:rPr>
+        <w:t xml:space="preserve">Private packages</w:t>
+      </w:r>
+    </w:p>
+    <w:p>
+      <w:pPr>
+        <w:spacing w:after="120"/>
+      </w:pPr>
+      <w:r>
+        <w:rPr>
+          <w:rFonts w:ascii="Times New Roman" w:cs="Times New Roman" w:eastAsia="Times New Roman" w:hAnsi="Times New Roman"/>
+          <w:sz w:val="21"/>
+          <w:szCs w:val="21"/>
+        </w:rPr>
+        <w:t xml:space="preserve">A package can be hidden from the public. Publish it with </w:t>
+      </w:r>
+      <w:r>
+        <w:rPr>
+          <w:rFonts w:ascii="Courier New" w:cs="Courier New" w:eastAsia="Courier New" w:hAnsi="Courier New"/>
+          <w:b w:val="false"/>
+          <w:bCs w:val="false"/>
+          <w:sz w:val="19"/>
+          <w:szCs w:val="19"/>
+        </w:rPr>
+        <w:t xml:space="preserve">--private</w:t>
+      </w:r>
+      <w:r>
+        <w:rPr>
+          <w:rFonts w:ascii="Times New Roman" w:cs="Times New Roman" w:eastAsia="Times New Roman" w:hAnsi="Times New Roman"/>
+          <w:sz w:val="21"/>
+          <w:szCs w:val="21"/>
+        </w:rPr>
+        <w:t xml:space="preserve">, or change it later with </w:t>
+      </w:r>
+      <w:r>
+        <w:rPr>
+          <w:rFonts w:ascii="Courier New" w:cs="Courier New" w:eastAsia="Courier New" w:hAnsi="Courier New"/>
+          <w:b w:val="false"/>
+          <w:bCs w:val="false"/>
+          <w:sz w:val="19"/>
+          <w:szCs w:val="19"/>
+        </w:rPr>
+        <w:t xml:space="preserve">rxpip visibility &lt;pkg&gt; private</w:t>
+      </w:r>
+      <w:r>
+        <w:rPr>
+          <w:rFonts w:ascii="Times New Roman" w:cs="Times New Roman" w:eastAsia="Times New Roman" w:hAnsi="Times New Roman"/>
+          <w:sz w:val="21"/>
+          <w:szCs w:val="21"/>
+        </w:rPr>
+        <w:t xml:space="preserve">. A private package does not appear in lists, searches, the web pages or downloads for anyone except its owners and the users you add as readers (</w:t>
+      </w:r>
+      <w:r>
+        <w:rPr>
+          <w:rFonts w:ascii="Courier New" w:cs="Courier New" w:eastAsia="Courier New" w:hAnsi="Courier New"/>
+          <w:b w:val="false"/>
+          <w:bCs w:val="false"/>
+          <w:sz w:val="19"/>
+          <w:szCs w:val="19"/>
+        </w:rPr>
+        <w:t xml:space="preserve">rxpip reader add &lt;pkg&gt; &lt;user&gt;</w:t>
+      </w:r>
+      <w:r>
+        <w:rPr>
+          <w:rFonts w:ascii="Times New Roman" w:cs="Times New Roman" w:eastAsia="Times New Roman" w:hAnsi="Times New Roman"/>
+          <w:sz w:val="21"/>
+          <w:szCs w:val="21"/>
+        </w:rPr>
+        <w:t xml:space="preserve">). To everybody else the server answers exactly as for a package that does not exist, so the name cannot be found out by trying. The clients send your saved token with every request, so </w:t>
+      </w:r>
+      <w:r>
+        <w:rPr>
+          <w:rFonts w:ascii="Courier New" w:cs="Courier New" w:eastAsia="Courier New" w:hAnsi="Courier New"/>
+          <w:b w:val="false"/>
+          <w:bCs w:val="false"/>
+          <w:sz w:val="19"/>
+          <w:szCs w:val="19"/>
+        </w:rPr>
+        <w:t xml:space="preserve">rxpip install</w:t>
+      </w:r>
+      <w:r>
+        <w:rPr>
+          <w:rFonts w:ascii="Times New Roman" w:cs="Times New Roman" w:eastAsia="Times New Roman" w:hAnsi="Times New Roman"/>
+          <w:sz w:val="21"/>
+          <w:szCs w:val="21"/>
+        </w:rPr>
+        <w:t xml:space="preserve"> and </w:t>
+      </w:r>
+      <w:r>
+        <w:rPr>
+          <w:rFonts w:ascii="Courier New" w:cs="Courier New" w:eastAsia="Courier New" w:hAnsi="Courier New"/>
+          <w:b w:val="false"/>
+          <w:bCs w:val="false"/>
+          <w:sz w:val="19"/>
+          <w:szCs w:val="19"/>
+        </w:rPr>
+        <w:t xml:space="preserve">rxpip search</w:t>
+      </w:r>
+      <w:r>
+        <w:rPr>
+          <w:rFonts w:ascii="Times New Roman" w:cs="Times New Roman" w:eastAsia="Times New Roman" w:hAnsi="Times New Roman"/>
+          <w:sz w:val="21"/>
+          <w:szCs w:val="21"/>
+        </w:rPr>
+        <w:t xml:space="preserve"> work for you as they do for a public package.</w:t>
+      </w:r>
+    </w:p>
+    <w:p>
+      <w:pPr>
+        <w:spacing w:after="120"/>
+      </w:pPr>
+      <w:r>
+        <w:rPr>
+          <w:rFonts w:ascii="Times New Roman" w:cs="Times New Roman" w:eastAsia="Times New Roman" w:hAnsi="Times New Roman"/>
+          <w:sz w:val="21"/>
+          <w:szCs w:val="21"/>
+        </w:rPr>
+        <w:t xml:space="preserve">A public package cannot require a private one, because anonymous users could not install it; publishing is refused with </w:t>
+      </w:r>
+      <w:r>
+        <w:rPr>
+          <w:rFonts w:ascii="Courier New" w:cs="Courier New" w:eastAsia="Courier New" w:hAnsi="Courier New"/>
+          <w:b w:val="false"/>
+          <w:bCs w:val="false"/>
+          <w:sz w:val="19"/>
+          <w:szCs w:val="19"/>
+        </w:rPr>
+        <w:t xml:space="preserve">PRIVATE_DEPENDENCY</w:t>
+      </w:r>
+      <w:r>
+        <w:rPr>
+          <w:rFonts w:ascii="Times New Roman" w:cs="Times New Roman" w:eastAsia="Times New Roman" w:hAnsi="Times New Roman"/>
+          <w:sz w:val="21"/>
+          <w:szCs w:val="21"/>
+        </w:rPr>
+        <w:t xml:space="preserve">. A private package can require both kinds.</w:t>
+      </w:r>
+    </w:p>
+    <w:p>
+      <w:pPr>
+        <w:spacing w:after="120"/>
+      </w:pPr>
+      <w:r>
+        <w:rPr>
+          <w:rFonts w:ascii="Times New Roman" w:cs="Times New Roman" w:eastAsia="Times New Roman" w:hAnsi="Times New Roman"/>
+          <w:sz w:val="21"/>
+          <w:szCs w:val="21"/>
+        </w:rPr>
+        <w:t xml:space="preserve">An administrator can also make the </w:t>
+      </w:r>
+      <w:r>
+        <w:rPr>
+          <w:rFonts w:ascii="Times New Roman" w:cs="Times New Roman" w:eastAsia="Times New Roman" w:hAnsi="Times New Roman"/>
+          <w:b/>
+          <w:bCs/>
+          <w:sz w:val="21"/>
+          <w:szCs w:val="21"/>
+        </w:rPr>
+        <w:t xml:space="preserve">whole repository</w:t>
+      </w:r>
+      <w:r>
+        <w:rPr>
+          <w:rFonts w:ascii="Times New Roman" w:cs="Times New Roman" w:eastAsia="Times New Roman" w:hAnsi="Times New Roman"/>
+          <w:sz w:val="21"/>
+          <w:szCs w:val="21"/>
+        </w:rPr>
+        <w:t xml:space="preserve"> private (the setting </w:t>
+      </w:r>
+      <w:r>
+        <w:rPr>
+          <w:rFonts w:ascii="Courier New" w:cs="Courier New" w:eastAsia="Courier New" w:hAnsi="Courier New"/>
+          <w:b w:val="false"/>
+          <w:bCs w:val="false"/>
+          <w:sz w:val="19"/>
+          <w:szCs w:val="19"/>
+        </w:rPr>
+        <w:t xml:space="preserve">RXPIP_CLOSED</w:t>
+      </w:r>
+      <w:r>
+        <w:rPr>
+          <w:rFonts w:ascii="Times New Roman" w:cs="Times New Roman" w:eastAsia="Times New Roman" w:hAnsi="Times New Roman"/>
+          <w:sz w:val="21"/>
+          <w:szCs w:val="21"/>
+        </w:rPr>
+        <w:t xml:space="preserve">, described in the chapter on running the server). Then every read needs a valid token and the web pages show only a notice. The browser views do not send a token, so they list public packages only.</w:t>
+      </w:r>
+    </w:p>
     <w:tbl>
       <w:tblPr>
         <w:tblW w:type="dxa" w:w="9638"/>
@@ -16436,6 +16656,163 @@
           <w:szCs w:val="21"/>
         </w:rPr>
         <w:t xml:space="preserve"> can name another command that reads a finished message on standard input.</w:t>
+      </w:r>
+    </w:p>
+    <w:p>
+      <w:pPr>
+        <w:pStyle w:val="Heading3"/>
+        <w:keepNext/>
+        <w:spacing w:after="100" w:before="220"/>
+      </w:pPr>
+      <w:r>
+        <w:rPr>
+          <w:rFonts w:ascii="Arial" w:cs="Arial" w:eastAsia="Arial" w:hAnsi="Arial"/>
+          <w:b/>
+          <w:bCs/>
+          <w:color w:val="000000"/>
+          <w:sz w:val="22"/>
+          <w:szCs w:val="22"/>
+        </w:rPr>
+        <w:t xml:space="preserve">Private packages and a closed repository</w:t>
+      </w:r>
+    </w:p>
+    <w:p>
+      <w:pPr>
+        <w:spacing w:after="120"/>
+      </w:pPr>
+      <w:r>
+        <w:rPr>
+          <w:rFonts w:ascii="Times New Roman" w:cs="Times New Roman" w:eastAsia="Times New Roman" w:hAnsi="Times New Roman"/>
+          <w:sz w:val="21"/>
+          <w:szCs w:val="21"/>
+        </w:rPr>
+        <w:t xml:space="preserve">Visibility is kept in </w:t>
+      </w:r>
+      <w:r>
+        <w:rPr>
+          <w:rFonts w:ascii="Courier New" w:cs="Courier New" w:eastAsia="Courier New" w:hAnsi="Courier New"/>
+          <w:b w:val="false"/>
+          <w:bCs w:val="false"/>
+          <w:sz w:val="19"/>
+          <w:szCs w:val="19"/>
+        </w:rPr>
+        <w:t xml:space="preserve">repo/.auth/visibility/</w:t>
+      </w:r>
+      <w:r>
+        <w:rPr>
+          <w:rFonts w:ascii="Times New Roman" w:cs="Times New Roman" w:eastAsia="Times New Roman" w:hAnsi="Times New Roman"/>
+          <w:sz w:val="21"/>
+          <w:szCs w:val="21"/>
+        </w:rPr>
+        <w:t xml:space="preserve"> and </w:t>
+      </w:r>
+      <w:r>
+        <w:rPr>
+          <w:rFonts w:ascii="Courier New" w:cs="Courier New" w:eastAsia="Courier New" w:hAnsi="Courier New"/>
+          <w:b w:val="false"/>
+          <w:bCs w:val="false"/>
+          <w:sz w:val="19"/>
+          <w:szCs w:val="19"/>
+        </w:rPr>
+        <w:t xml:space="preserve">repo/.auth/readers/</w:t>
+      </w:r>
+      <w:r>
+        <w:rPr>
+          <w:rFonts w:ascii="Times New Roman" w:cs="Times New Roman" w:eastAsia="Times New Roman" w:hAnsi="Times New Roman"/>
+          <w:sz w:val="21"/>
+          <w:szCs w:val="21"/>
+        </w:rPr>
+        <w:t xml:space="preserve">; back them up with the rest of </w:t>
+      </w:r>
+      <w:r>
+        <w:rPr>
+          <w:rFonts w:ascii="Courier New" w:cs="Courier New" w:eastAsia="Courier New" w:hAnsi="Courier New"/>
+          <w:b w:val="false"/>
+          <w:bCs w:val="false"/>
+          <w:sz w:val="19"/>
+          <w:szCs w:val="19"/>
+        </w:rPr>
+        <w:t xml:space="preserve">.auth/</w:t>
+      </w:r>
+      <w:r>
+        <w:rPr>
+          <w:rFonts w:ascii="Times New Roman" w:cs="Times New Roman" w:eastAsia="Times New Roman" w:hAnsi="Times New Roman"/>
+          <w:sz w:val="21"/>
+          <w:szCs w:val="21"/>
+        </w:rPr>
+        <w:t xml:space="preserve">. To make the whole repository private, add </w:t>
+      </w:r>
+      <w:r>
+        <w:rPr>
+          <w:rFonts w:ascii="Courier New" w:cs="Courier New" w:eastAsia="Courier New" w:hAnsi="Courier New"/>
+          <w:b w:val="false"/>
+          <w:bCs w:val="false"/>
+          <w:sz w:val="19"/>
+          <w:szCs w:val="19"/>
+        </w:rPr>
+        <w:t xml:space="preserve">SetEnv RXPIP_CLOSED 1</w:t>
+      </w:r>
+      <w:r>
+        <w:rPr>
+          <w:rFonts w:ascii="Times New Roman" w:cs="Times New Roman" w:eastAsia="Times New Roman" w:hAnsi="Times New Roman"/>
+          <w:sz w:val="21"/>
+          <w:szCs w:val="21"/>
+        </w:rPr>
+        <w:t xml:space="preserve"> to both virtual-host files. Every read then needs a valid token (HTTP 401 otherwise); only </w:t>
+      </w:r>
+      <w:r>
+        <w:rPr>
+          <w:rFonts w:ascii="Courier New" w:cs="Courier New" w:eastAsia="Courier New" w:hAnsi="Courier New"/>
+          <w:b w:val="false"/>
+          <w:bCs w:val="false"/>
+          <w:sz w:val="19"/>
+          <w:szCs w:val="19"/>
+        </w:rPr>
+        <w:t xml:space="preserve">PING</w:t>
+      </w:r>
+      <w:r>
+        <w:rPr>
+          <w:rFonts w:ascii="Times New Roman" w:cs="Times New Roman" w:eastAsia="Times New Roman" w:hAnsi="Times New Roman"/>
+          <w:sz w:val="21"/>
+          <w:szCs w:val="21"/>
+        </w:rPr>
+        <w:t xml:space="preserve">, the sign-up form and </w:t>
+      </w:r>
+      <w:r>
+        <w:rPr>
+          <w:rFonts w:ascii="Courier New" w:cs="Courier New" w:eastAsia="Courier New" w:hAnsi="Courier New"/>
+          <w:b w:val="false"/>
+          <w:bCs w:val="false"/>
+          <w:sz w:val="19"/>
+          <w:szCs w:val="19"/>
+        </w:rPr>
+        <w:t xml:space="preserve">REGISTER</w:t>
+      </w:r>
+      <w:r>
+        <w:rPr>
+          <w:rFonts w:ascii="Times New Roman" w:cs="Times New Roman" w:eastAsia="Times New Roman" w:hAnsi="Times New Roman"/>
+          <w:sz w:val="21"/>
+          <w:szCs w:val="21"/>
+        </w:rPr>
+        <w:t xml:space="preserve"> stay open. On the server, </w:t>
+      </w:r>
+      <w:r>
+        <w:rPr>
+          <w:rFonts w:ascii="Courier New" w:cs="Courier New" w:eastAsia="Courier New" w:hAnsi="Courier New"/>
+          <w:b w:val="false"/>
+          <w:bCs w:val="false"/>
+          <w:sz w:val="19"/>
+          <w:szCs w:val="19"/>
+        </w:rPr>
+        <w:t xml:space="preserve">admin visibility &lt;pkg&gt; [public|private]</w:t>
+      </w:r>
+      <w:r>
+        <w:rPr>
+          <w:rFonts w:ascii="Times New Roman" w:cs="Times New Roman" w:eastAsia="Times New Roman" w:hAnsi="Times New Roman"/>
+          <w:sz w:val="21"/>
+          <w:szCs w:val="21"/>
+        </w:rPr>
+        <w:t xml:space="preserve"> shows or changes a package’s visibility.</w:t>
       </w:r>
     </w:p>
     <w:p>
@@ -20802,6 +21179,266 @@
                 <w:sz w:val="17"/>
                 <w:szCs w:val="17"/>
               </w:rPr>
+              <w:t xml:space="preserve">VISIBILITY</w:t>
+            </w:r>
+          </w:p>
+        </w:tc>
+        <w:tc>
+          <w:tcPr>
+            <w:tcW w:type="dxa" w:w="4400"/>
+            <w:tcMar>
+              <w:top w:type="dxa" w:w="60"/>
+              <w:left w:type="dxa" w:w="100"/>
+              <w:bottom w:type="dxa" w:w="60"/>
+              <w:right w:type="dxa" w:w="100"/>
+            </w:tcMar>
+          </w:tcPr>
+          <w:p>
+            <w:r>
+              <w:rPr>
+                <w:rFonts w:ascii="Courier New" w:cs="Courier New" w:eastAsia="Courier New" w:hAnsi="Courier New"/>
+                <w:b w:val="false"/>
+                <w:bCs w:val="false"/>
+                <w:sz w:val="17"/>
+                <w:szCs w:val="17"/>
+              </w:rPr>
+              <w:t xml:space="preserve">X-Rxpip-Name</w:t>
+            </w:r>
+            <w:r>
+              <w:rPr>
+                <w:rFonts w:ascii="Times New Roman" w:cs="Times New Roman" w:eastAsia="Times New Roman" w:hAnsi="Times New Roman"/>
+                <w:sz w:val="18"/>
+                <w:szCs w:val="18"/>
+              </w:rPr>
+              <w:t xml:space="preserve">, </w:t>
+            </w:r>
+            <w:r>
+              <w:rPr>
+                <w:rFonts w:ascii="Courier New" w:cs="Courier New" w:eastAsia="Courier New" w:hAnsi="Courier New"/>
+                <w:b w:val="false"/>
+                <w:bCs w:val="false"/>
+                <w:sz w:val="17"/>
+                <w:szCs w:val="17"/>
+              </w:rPr>
+              <w:t xml:space="preserve">X-Rxpip-Value</w:t>
+            </w:r>
+            <w:r>
+              <w:rPr>
+                <w:rFonts w:ascii="Times New Roman" w:cs="Times New Roman" w:eastAsia="Times New Roman" w:hAnsi="Times New Roman"/>
+                <w:sz w:val="18"/>
+                <w:szCs w:val="18"/>
+              </w:rPr>
+              <w:t xml:space="preserve"> (</w:t>
+            </w:r>
+            <w:r>
+              <w:rPr>
+                <w:rFonts w:ascii="Courier New" w:cs="Courier New" w:eastAsia="Courier New" w:hAnsi="Courier New"/>
+                <w:b w:val="false"/>
+                <w:bCs w:val="false"/>
+                <w:sz w:val="17"/>
+                <w:szCs w:val="17"/>
+              </w:rPr>
+              <w:t xml:space="preserve">public</w:t>
+            </w:r>
+            <w:r>
+              <w:rPr>
+                <w:rFonts w:ascii="Times New Roman" w:cs="Times New Roman" w:eastAsia="Times New Roman" w:hAnsi="Times New Roman"/>
+                <w:sz w:val="18"/>
+                <w:szCs w:val="18"/>
+              </w:rPr>
+              <w:t xml:space="preserve"> or </w:t>
+            </w:r>
+            <w:r>
+              <w:rPr>
+                <w:rFonts w:ascii="Courier New" w:cs="Courier New" w:eastAsia="Courier New" w:hAnsi="Courier New"/>
+                <w:b w:val="false"/>
+                <w:bCs w:val="false"/>
+                <w:sz w:val="17"/>
+                <w:szCs w:val="17"/>
+              </w:rPr>
+              <w:t xml:space="preserve">private</w:t>
+            </w:r>
+            <w:r>
+              <w:rPr>
+                <w:rFonts w:ascii="Times New Roman" w:cs="Times New Roman" w:eastAsia="Times New Roman" w:hAnsi="Times New Roman"/>
+                <w:sz w:val="18"/>
+                <w:szCs w:val="18"/>
+              </w:rPr>
+              <w:t xml:space="preserve">)</w:t>
+            </w:r>
+          </w:p>
+        </w:tc>
+        <w:tc>
+          <w:tcPr>
+            <w:tcW w:type="dxa" w:w="2838"/>
+            <w:tcMar>
+              <w:top w:type="dxa" w:w="60"/>
+              <w:left w:type="dxa" w:w="100"/>
+              <w:bottom w:type="dxa" w:w="60"/>
+              <w:right w:type="dxa" w:w="100"/>
+            </w:tcMar>
+          </w:tcPr>
+          <w:p>
+            <w:r>
+              <w:rPr>
+                <w:rFonts w:ascii="Times New Roman" w:cs="Times New Roman" w:eastAsia="Times New Roman" w:hAnsi="Times New Roman"/>
+                <w:sz w:val="18"/>
+                <w:szCs w:val="18"/>
+              </w:rPr>
+              <w:t xml:space="preserve">Sets the visibility (owners only)</w:t>
+            </w:r>
+          </w:p>
+        </w:tc>
+      </w:tr>
+      <w:tr>
+        <w:trPr>
+          <w:cantSplit/>
+        </w:trPr>
+        <w:tc>
+          <w:tcPr>
+            <w:tcW w:type="dxa" w:w="2400"/>
+            <w:tcMar>
+              <w:top w:type="dxa" w:w="60"/>
+              <w:left w:type="dxa" w:w="100"/>
+              <w:bottom w:type="dxa" w:w="60"/>
+              <w:right w:type="dxa" w:w="100"/>
+            </w:tcMar>
+          </w:tcPr>
+          <w:p>
+            <w:r>
+              <w:rPr>
+                <w:rFonts w:ascii="Courier New" w:cs="Courier New" w:eastAsia="Courier New" w:hAnsi="Courier New"/>
+                <w:b w:val="false"/>
+                <w:bCs w:val="false"/>
+                <w:sz w:val="17"/>
+                <w:szCs w:val="17"/>
+              </w:rPr>
+              <w:t xml:space="preserve">READERS</w:t>
+            </w:r>
+            <w:r>
+              <w:rPr>
+                <w:rFonts w:ascii="Times New Roman" w:cs="Times New Roman" w:eastAsia="Times New Roman" w:hAnsi="Times New Roman"/>
+                <w:sz w:val="18"/>
+                <w:szCs w:val="18"/>
+              </w:rPr>
+              <w:t xml:space="preserve">, </w:t>
+            </w:r>
+            <w:r>
+              <w:rPr>
+                <w:rFonts w:ascii="Courier New" w:cs="Courier New" w:eastAsia="Courier New" w:hAnsi="Courier New"/>
+                <w:b w:val="false"/>
+                <w:bCs w:val="false"/>
+                <w:sz w:val="17"/>
+                <w:szCs w:val="17"/>
+              </w:rPr>
+              <w:t xml:space="preserve">ADDREADER</w:t>
+            </w:r>
+            <w:r>
+              <w:rPr>
+                <w:rFonts w:ascii="Times New Roman" w:cs="Times New Roman" w:eastAsia="Times New Roman" w:hAnsi="Times New Roman"/>
+                <w:sz w:val="18"/>
+                <w:szCs w:val="18"/>
+              </w:rPr>
+              <w:t xml:space="preserve">, </w:t>
+            </w:r>
+            <w:r>
+              <w:rPr>
+                <w:rFonts w:ascii="Courier New" w:cs="Courier New" w:eastAsia="Courier New" w:hAnsi="Courier New"/>
+                <w:b w:val="false"/>
+                <w:bCs w:val="false"/>
+                <w:sz w:val="17"/>
+                <w:szCs w:val="17"/>
+              </w:rPr>
+              <w:t xml:space="preserve">REMOVEREADER</w:t>
+            </w:r>
+          </w:p>
+        </w:tc>
+        <w:tc>
+          <w:tcPr>
+            <w:tcW w:type="dxa" w:w="4400"/>
+            <w:tcMar>
+              <w:top w:type="dxa" w:w="60"/>
+              <w:left w:type="dxa" w:w="100"/>
+              <w:bottom w:type="dxa" w:w="60"/>
+              <w:right w:type="dxa" w:w="100"/>
+            </w:tcMar>
+          </w:tcPr>
+          <w:p>
+            <w:r>
+              <w:rPr>
+                <w:rFonts w:ascii="Courier New" w:cs="Courier New" w:eastAsia="Courier New" w:hAnsi="Courier New"/>
+                <w:b w:val="false"/>
+                <w:bCs w:val="false"/>
+                <w:sz w:val="17"/>
+                <w:szCs w:val="17"/>
+              </w:rPr>
+              <w:t xml:space="preserve">X-Rxpip-Name</w:t>
+            </w:r>
+            <w:r>
+              <w:rPr>
+                <w:rFonts w:ascii="Times New Roman" w:cs="Times New Roman" w:eastAsia="Times New Roman" w:hAnsi="Times New Roman"/>
+                <w:sz w:val="18"/>
+                <w:szCs w:val="18"/>
+              </w:rPr>
+              <w:t xml:space="preserve">, </w:t>
+            </w:r>
+            <w:r>
+              <w:rPr>
+                <w:rFonts w:ascii="Courier New" w:cs="Courier New" w:eastAsia="Courier New" w:hAnsi="Courier New"/>
+                <w:b w:val="false"/>
+                <w:bCs w:val="false"/>
+                <w:sz w:val="17"/>
+                <w:szCs w:val="17"/>
+              </w:rPr>
+              <w:t xml:space="preserve">X-Rxpip-User</w:t>
+            </w:r>
+          </w:p>
+        </w:tc>
+        <w:tc>
+          <w:tcPr>
+            <w:tcW w:type="dxa" w:w="2838"/>
+            <w:tcMar>
+              <w:top w:type="dxa" w:w="60"/>
+              <w:left w:type="dxa" w:w="100"/>
+              <w:bottom w:type="dxa" w:w="60"/>
+              <w:right w:type="dxa" w:w="100"/>
+            </w:tcMar>
+          </w:tcPr>
+          <w:p>
+            <w:r>
+              <w:rPr>
+                <w:rFonts w:ascii="Times New Roman" w:cs="Times New Roman" w:eastAsia="Times New Roman" w:hAnsi="Times New Roman"/>
+                <w:sz w:val="18"/>
+                <w:szCs w:val="18"/>
+              </w:rPr>
+              <w:t xml:space="preserve">The visibility and reader list (owners only)</w:t>
+            </w:r>
+          </w:p>
+        </w:tc>
+      </w:tr>
+      <w:tr>
+        <w:trPr>
+          <w:cantSplit/>
+        </w:trPr>
+        <w:tc>
+          <w:tcPr>
+            <w:tcW w:type="dxa" w:w="2400"/>
+            <w:tcMar>
+              <w:top w:type="dxa" w:w="60"/>
+              <w:left w:type="dxa" w:w="100"/>
+              <w:bottom w:type="dxa" w:w="60"/>
+              <w:right w:type="dxa" w:w="100"/>
+            </w:tcMar>
+          </w:tcPr>
+          <w:p>
+            <w:r>
+              <w:rPr>
+                <w:rFonts w:ascii="Courier New" w:cs="Courier New" w:eastAsia="Courier New" w:hAnsi="Courier New"/>
+                <w:b w:val="false"/>
+                <w:bCs w:val="false"/>
+                <w:sz w:val="17"/>
+                <w:szCs w:val="17"/>
+              </w:rPr>
               <w:t xml:space="preserve">PUBLISH</w:t>
             </w:r>
           </w:p>
@@ -24730,6 +25367,153 @@
                 <w:sz w:val="17"/>
                 <w:szCs w:val="17"/>
               </w:rPr>
+              <w:t xml:space="preserve">rxpip publish &lt;file&gt; ... --private</w:t>
+            </w:r>
+          </w:p>
+        </w:tc>
+        <w:tc>
+          <w:tcPr>
+            <w:tcW w:type="dxa" w:w="5038"/>
+            <w:tcMar>
+              <w:top w:type="dxa" w:w="60"/>
+              <w:left w:type="dxa" w:w="100"/>
+              <w:bottom w:type="dxa" w:w="60"/>
+              <w:right w:type="dxa" w:w="100"/>
+            </w:tcMar>
+          </w:tcPr>
+          <w:p>
+            <w:r>
+              <w:rPr>
+                <w:rFonts w:ascii="Times New Roman" w:cs="Times New Roman" w:eastAsia="Times New Roman" w:hAnsi="Times New Roman"/>
+                <w:sz w:val="18"/>
+                <w:szCs w:val="18"/>
+              </w:rPr>
+              <w:t xml:space="preserve">Publish a package that only its owners and readers can see</w:t>
+            </w:r>
+          </w:p>
+        </w:tc>
+      </w:tr>
+      <w:tr>
+        <w:trPr>
+          <w:cantSplit/>
+        </w:trPr>
+        <w:tc>
+          <w:tcPr>
+            <w:tcW w:type="dxa" w:w="4600"/>
+            <w:tcMar>
+              <w:top w:type="dxa" w:w="60"/>
+              <w:left w:type="dxa" w:w="100"/>
+              <w:bottom w:type="dxa" w:w="60"/>
+              <w:right w:type="dxa" w:w="100"/>
+            </w:tcMar>
+          </w:tcPr>
+          <w:p>
+            <w:r>
+              <w:rPr>
+                <w:rFonts w:ascii="Courier New" w:cs="Courier New" w:eastAsia="Courier New" w:hAnsi="Courier New"/>
+                <w:b w:val="false"/>
+                <w:bCs w:val="false"/>
+                <w:sz w:val="17"/>
+                <w:szCs w:val="17"/>
+              </w:rPr>
+              <w:t xml:space="preserve">rxpip visibility &lt;pkg&gt; [public|private]</w:t>
+            </w:r>
+          </w:p>
+        </w:tc>
+        <w:tc>
+          <w:tcPr>
+            <w:tcW w:type="dxa" w:w="5038"/>
+            <w:tcMar>
+              <w:top w:type="dxa" w:w="60"/>
+              <w:left w:type="dxa" w:w="100"/>
+              <w:bottom w:type="dxa" w:w="60"/>
+              <w:right w:type="dxa" w:w="100"/>
+            </w:tcMar>
+          </w:tcPr>
+          <w:p>
+            <w:r>
+              <w:rPr>
+                <w:rFonts w:ascii="Times New Roman" w:cs="Times New Roman" w:eastAsia="Times New Roman" w:hAnsi="Times New Roman"/>
+                <w:sz w:val="18"/>
+                <w:szCs w:val="18"/>
+              </w:rPr>
+              <w:t xml:space="preserve">Show or change a package’s visibility (owners)</w:t>
+            </w:r>
+          </w:p>
+        </w:tc>
+      </w:tr>
+      <w:tr>
+        <w:trPr>
+          <w:cantSplit/>
+        </w:trPr>
+        <w:tc>
+          <w:tcPr>
+            <w:tcW w:type="dxa" w:w="4600"/>
+            <w:tcMar>
+              <w:top w:type="dxa" w:w="60"/>
+              <w:left w:type="dxa" w:w="100"/>
+              <w:bottom w:type="dxa" w:w="60"/>
+              <w:right w:type="dxa" w:w="100"/>
+            </w:tcMar>
+          </w:tcPr>
+          <w:p>
+            <w:r>
+              <w:rPr>
+                <w:rFonts w:ascii="Courier New" w:cs="Courier New" w:eastAsia="Courier New" w:hAnsi="Courier New"/>
+                <w:b w:val="false"/>
+                <w:bCs w:val="false"/>
+                <w:sz w:val="17"/>
+                <w:szCs w:val="17"/>
+              </w:rPr>
+              <w:t xml:space="preserve">rxpip reader list|add|remove &lt;pkg&gt; [&lt;user&gt;]</w:t>
+            </w:r>
+          </w:p>
+        </w:tc>
+        <w:tc>
+          <w:tcPr>
+            <w:tcW w:type="dxa" w:w="5038"/>
+            <w:tcMar>
+              <w:top w:type="dxa" w:w="60"/>
+              <w:left w:type="dxa" w:w="100"/>
+              <w:bottom w:type="dxa" w:w="60"/>
+              <w:right w:type="dxa" w:w="100"/>
+            </w:tcMar>
+          </w:tcPr>
+          <w:p>
+            <w:r>
+              <w:rPr>
+                <w:rFonts w:ascii="Times New Roman" w:cs="Times New Roman" w:eastAsia="Times New Roman" w:hAnsi="Times New Roman"/>
+                <w:sz w:val="18"/>
+                <w:szCs w:val="18"/>
+              </w:rPr>
+              <w:t xml:space="preserve">Who else may read a private package</w:t>
+            </w:r>
+          </w:p>
+        </w:tc>
+      </w:tr>
+      <w:tr>
+        <w:trPr>
+          <w:cantSplit/>
+        </w:trPr>
+        <w:tc>
+          <w:tcPr>
+            <w:tcW w:type="dxa" w:w="4600"/>
+            <w:tcMar>
+              <w:top w:type="dxa" w:w="60"/>
+              <w:left w:type="dxa" w:w="100"/>
+              <w:bottom w:type="dxa" w:w="60"/>
+              <w:right w:type="dxa" w:w="100"/>
+            </w:tcMar>
+          </w:tcPr>
+          <w:p>
+            <w:r>
+              <w:rPr>
+                <w:rFonts w:ascii="Courier New" w:cs="Courier New" w:eastAsia="Courier New" w:hAnsi="Courier New"/>
+                <w:b w:val="false"/>
+                <w:bCs w:val="false"/>
+                <w:sz w:val="17"/>
+                <w:szCs w:val="17"/>
+              </w:rPr>
               <w:t xml:space="preserve">rxpip config [get &lt;key&gt; | set &lt;key&gt; &lt;value&gt;]</w:t>
             </w:r>
           </w:p>
@@ -25949,6 +26733,86 @@
                 <w:szCs w:val="18"/>
               </w:rPr>
               <w:t xml:space="preserve">Where sign-up review mails go; sign-up is off while unset</w:t>
+            </w:r>
+          </w:p>
+        </w:tc>
+      </w:tr>
+      <w:tr>
+        <w:trPr>
+          <w:cantSplit/>
+        </w:trPr>
+        <w:tc>
+          <w:tcPr>
+            <w:tcW w:type="dxa" w:w="2700"/>
+            <w:tcMar>
+              <w:top w:type="dxa" w:w="60"/>
+              <w:left w:type="dxa" w:w="100"/>
+              <w:bottom w:type="dxa" w:w="60"/>
+              <w:right w:type="dxa" w:w="100"/>
+            </w:tcMar>
+          </w:tcPr>
+          <w:p>
+            <w:r>
+              <w:rPr>
+                <w:rFonts w:ascii="Courier New" w:cs="Courier New" w:eastAsia="Courier New" w:hAnsi="Courier New"/>
+                <w:b w:val="false"/>
+                <w:bCs w:val="false"/>
+                <w:sz w:val="17"/>
+                <w:szCs w:val="17"/>
+              </w:rPr>
+              <w:t xml:space="preserve">RXPIP_CLOSED</w:t>
+            </w:r>
+          </w:p>
+        </w:tc>
+        <w:tc>
+          <w:tcPr>
+            <w:tcW w:type="dxa" w:w="1300"/>
+            <w:tcMar>
+              <w:top w:type="dxa" w:w="60"/>
+              <w:left w:type="dxa" w:w="100"/>
+              <w:bottom w:type="dxa" w:w="60"/>
+              <w:right w:type="dxa" w:w="100"/>
+            </w:tcMar>
+          </w:tcPr>
+          <w:p>
+            <w:r>
+              <w:rPr>
+                <w:rFonts w:ascii="Times New Roman" w:cs="Times New Roman" w:eastAsia="Times New Roman" w:hAnsi="Times New Roman"/>
+                <w:sz w:val="18"/>
+                <w:szCs w:val="18"/>
+              </w:rPr>
+              <w:t xml:space="preserve">server</w:t>
+            </w:r>
+          </w:p>
+        </w:tc>
+        <w:tc>
+          <w:tcPr>
+            <w:tcW w:type="dxa" w:w="5638"/>
+            <w:tcMar>
+              <w:top w:type="dxa" w:w="60"/>
+              <w:left w:type="dxa" w:w="100"/>
+              <w:bottom w:type="dxa" w:w="60"/>
+              <w:right w:type="dxa" w:w="100"/>
+            </w:tcMar>
+          </w:tcPr>
+          <w:p>
+            <w:r>
+              <w:rPr>
+                <w:rFonts w:ascii="Courier New" w:cs="Courier New" w:eastAsia="Courier New" w:hAnsi="Courier New"/>
+                <w:b w:val="false"/>
+                <w:bCs w:val="false"/>
+                <w:sz w:val="17"/>
+                <w:szCs w:val="17"/>
+              </w:rPr>
+              <w:t xml:space="preserve">1</w:t>
+            </w:r>
+            <w:r>
+              <w:rPr>
+                <w:rFonts w:ascii="Times New Roman" w:cs="Times New Roman" w:eastAsia="Times New Roman" w:hAnsi="Times New Roman"/>
+                <w:sz w:val="18"/>
+                <w:szCs w:val="18"/>
+              </w:rPr>
+              <w:t xml:space="preserve"> makes the whole repository private: every read needs a token</w:t>
             </w:r>
           </w:p>
         </w:tc>

</xml_diff>

<commit_message>
Manual: RXPIP on VM/370plus (bridge and prepared native CMS backend)
Co-Authored-By: Claude Sonnet 5.5 <noreply@anthropic.com>
Claude-Session: https://claude.ai/code/session_012C2HMKLkyaTRCjXA8PHoVA
</commit_message>
<xml_diff>
--- a/docs/RXPIP-Guide.docx
+++ b/docs/RXPIP-Guide.docx
@@ -445,6 +445,25 @@
           <w:szCs w:val="18"/>
         </w:rPr>
         <w:t xml:space="preserve">Keeping the client up to date	6</w:t>
+      </w:r>
+    </w:p>
+    <w:p>
+      <w:pPr>
+        <w:tabs>
+          <w:tab w:val="right" w:pos="9638" w:leader="dot"/>
+        </w:tabs>
+        <w:spacing w:after="20" w:before="0"/>
+        <w:ind w:left="280"/>
+      </w:pPr>
+      <w:r>
+        <w:rPr>
+          <w:rFonts w:ascii="Times New Roman" w:cs="Times New Roman" w:eastAsia="Times New Roman" w:hAnsi="Times New Roman"/>
+          <w:b w:val="false"/>
+          <w:bCs w:val="false"/>
+          <w:sz w:val="18"/>
+          <w:szCs w:val="18"/>
+        </w:rPr>
+        <w:t xml:space="preserve">RXPIP on VM/370plus (CMS)	7</w:t>
       </w:r>
     </w:p>
     <w:p>
@@ -7709,6 +7728,327 @@
     </w:p>
     <w:p>
       <w:pPr>
+        <w:pStyle w:val="Heading2"/>
+        <w:keepNext/>
+        <w:spacing w:after="140" w:before="320"/>
+      </w:pPr>
+      <w:r>
+        <w:rPr>
+          <w:rFonts w:ascii="Arial" w:cs="Arial" w:eastAsia="Arial" w:hAnsi="Arial"/>
+          <w:b/>
+          <w:bCs/>
+          <w:color w:val="000000"/>
+          <w:sz w:val="26"/>
+          <w:szCs w:val="26"/>
+        </w:rPr>
+        <w:t xml:space="preserve">RXPIP on VM/370plus (CMS)</w:t>
+      </w:r>
+    </w:p>
+    <w:p>
+      <w:pPr>
+        <w:spacing w:after="120"/>
+      </w:pPr>
+      <w:r>
+        <w:rPr>
+          <w:rFonts w:ascii="Times New Roman" w:cs="Times New Roman" w:eastAsia="Times New Roman" w:hAnsi="Times New Roman"/>
+          <w:sz w:val="21"/>
+          <w:szCs w:val="21"/>
+        </w:rPr>
+        <w:t xml:space="preserve">VM/370plus has no directories, file names of at most 8+8 characters, and keeps settings with GLOBALV instead of in files. RXPIP covers this system in two ways.</w:t>
+      </w:r>
+    </w:p>
+    <w:p>
+      <w:pPr>
+        <w:pStyle w:val="ListParagraph"/>
+        <w:numPr>
+          <w:ilvl w:val="0"/>
+          <w:numId w:val="2"/>
+        </w:numPr>
+        <w:spacing w:after="60"/>
+      </w:pPr>
+      <w:r>
+        <w:rPr>
+          <w:rFonts w:ascii="Times New Roman" w:cs="Times New Roman" w:eastAsia="Times New Roman" w:hAnsi="Times New Roman"/>
+          <w:b/>
+          <w:bCs/>
+          <w:sz w:val="21"/>
+          <w:szCs w:val="21"/>
+        </w:rPr>
+        <w:t xml:space="preserve">Through a bridge (works today).</w:t>
+      </w:r>
+      <w:r>
+        <w:rPr>
+          <w:rFonts w:ascii="Times New Roman" w:cs="Times New Roman" w:eastAsia="Times New Roman" w:hAnsi="Times New Roman"/>
+          <w:sz w:val="21"/>
+          <w:szCs w:val="21"/>
+        </w:rPr>
+        <w:t xml:space="preserve"> The VM/370plus kit contains </w:t>
+      </w:r>
+      <w:r>
+        <w:rPr>
+          <w:rFonts w:ascii="Courier New" w:cs="Courier New" w:eastAsia="Courier New" w:hAnsi="Courier New"/>
+          <w:b w:val="false"/>
+          <w:bCs w:val="false"/>
+          <w:sz w:val="19"/>
+          <w:szCs w:val="19"/>
+        </w:rPr>
+        <w:t xml:space="preserve">RXPIP EXEC</w:t>
+      </w:r>
+      <w:r>
+        <w:rPr>
+          <w:rFonts w:ascii="Times New Roman" w:cs="Times New Roman" w:eastAsia="Times New Roman" w:hAnsi="Times New Roman"/>
+          <w:sz w:val="21"/>
+          <w:szCs w:val="21"/>
+        </w:rPr>
+        <w:t xml:space="preserve">, which sends requests as spool files to a Linux guest. There the Regina client runs against the repository and sends the answer back. From CMS you use </w:t>
+      </w:r>
+      <w:r>
+        <w:rPr>
+          <w:rFonts w:ascii="Courier New" w:cs="Courier New" w:eastAsia="Courier New" w:hAnsi="Courier New"/>
+          <w:b w:val="false"/>
+          <w:bCs w:val="false"/>
+          <w:sz w:val="19"/>
+          <w:szCs w:val="19"/>
+        </w:rPr>
+        <w:t xml:space="preserve">RXPIP SEARCH</w:t>
+      </w:r>
+      <w:r>
+        <w:rPr>
+          <w:rFonts w:ascii="Times New Roman" w:cs="Times New Roman" w:eastAsia="Times New Roman" w:hAnsi="Times New Roman"/>
+          <w:sz w:val="21"/>
+          <w:szCs w:val="21"/>
+        </w:rPr>
+        <w:t xml:space="preserve">, </w:t>
+      </w:r>
+      <w:r>
+        <w:rPr>
+          <w:rFonts w:ascii="Courier New" w:cs="Courier New" w:eastAsia="Courier New" w:hAnsi="Courier New"/>
+          <w:b w:val="false"/>
+          <w:bCs w:val="false"/>
+          <w:sz w:val="19"/>
+          <w:szCs w:val="19"/>
+        </w:rPr>
+        <w:t xml:space="preserve">SHOW</w:t>
+      </w:r>
+      <w:r>
+        <w:rPr>
+          <w:rFonts w:ascii="Times New Roman" w:cs="Times New Roman" w:eastAsia="Times New Roman" w:hAnsi="Times New Roman"/>
+          <w:sz w:val="21"/>
+          <w:szCs w:val="21"/>
+        </w:rPr>
+        <w:t xml:space="preserve">, </w:t>
+      </w:r>
+      <w:r>
+        <w:rPr>
+          <w:rFonts w:ascii="Courier New" w:cs="Courier New" w:eastAsia="Courier New" w:hAnsi="Courier New"/>
+          <w:b w:val="false"/>
+          <w:bCs w:val="false"/>
+          <w:sz w:val="19"/>
+          <w:szCs w:val="19"/>
+        </w:rPr>
+        <w:t xml:space="preserve">AVAIL</w:t>
+      </w:r>
+      <w:r>
+        <w:rPr>
+          <w:rFonts w:ascii="Times New Roman" w:cs="Times New Roman" w:eastAsia="Times New Roman" w:hAnsi="Times New Roman"/>
+          <w:sz w:val="21"/>
+          <w:szCs w:val="21"/>
+        </w:rPr>
+        <w:t xml:space="preserve">, </w:t>
+      </w:r>
+      <w:r>
+        <w:rPr>
+          <w:rFonts w:ascii="Courier New" w:cs="Courier New" w:eastAsia="Courier New" w:hAnsi="Courier New"/>
+          <w:b w:val="false"/>
+          <w:bCs w:val="false"/>
+          <w:sz w:val="19"/>
+          <w:szCs w:val="19"/>
+        </w:rPr>
+        <w:t xml:space="preserve">BUILD</w:t>
+      </w:r>
+      <w:r>
+        <w:rPr>
+          <w:rFonts w:ascii="Times New Roman" w:cs="Times New Roman" w:eastAsia="Times New Roman" w:hAnsi="Times New Roman"/>
+          <w:sz w:val="21"/>
+          <w:szCs w:val="21"/>
+        </w:rPr>
+        <w:t xml:space="preserve"> and </w:t>
+      </w:r>
+      <w:r>
+        <w:rPr>
+          <w:rFonts w:ascii="Courier New" w:cs="Courier New" w:eastAsia="Courier New" w:hAnsi="Courier New"/>
+          <w:b w:val="false"/>
+          <w:bCs w:val="false"/>
+          <w:sz w:val="19"/>
+          <w:szCs w:val="19"/>
+        </w:rPr>
+        <w:t xml:space="preserve">GET</w:t>
+      </w:r>
+      <w:r>
+        <w:rPr>
+          <w:rFonts w:ascii="Times New Roman" w:cs="Times New Roman" w:eastAsia="Times New Roman" w:hAnsi="Times New Roman"/>
+          <w:sz w:val="21"/>
+          <w:szCs w:val="21"/>
+        </w:rPr>
+        <w:t xml:space="preserve">. </w:t>
+      </w:r>
+      <w:r>
+        <w:rPr>
+          <w:rFonts w:ascii="Courier New" w:cs="Courier New" w:eastAsia="Courier New" w:hAnsi="Courier New"/>
+          <w:b w:val="false"/>
+          <w:bCs w:val="false"/>
+          <w:sz w:val="19"/>
+          <w:szCs w:val="19"/>
+        </w:rPr>
+        <w:t xml:space="preserve">GET</w:t>
+      </w:r>
+      <w:r>
+        <w:rPr>
+          <w:rFonts w:ascii="Times New Roman" w:cs="Times New Roman" w:eastAsia="Times New Roman" w:hAnsi="Times New Roman"/>
+          <w:sz w:val="21"/>
+          <w:szCs w:val="21"/>
+        </w:rPr>
+        <w:t xml:space="preserve"> installs into the shared store on the Linux side and returns the source files; </w:t>
+      </w:r>
+      <w:r>
+        <w:rPr>
+          <w:rFonts w:ascii="Courier New" w:cs="Courier New" w:eastAsia="Courier New" w:hAnsi="Courier New"/>
+          <w:b w:val="false"/>
+          <w:bCs w:val="false"/>
+          <w:sz w:val="19"/>
+          <w:szCs w:val="19"/>
+        </w:rPr>
+        <w:t xml:space="preserve">BUILD</w:t>
+      </w:r>
+      <w:r>
+        <w:rPr>
+          <w:rFonts w:ascii="Times New Roman" w:cs="Times New Roman" w:eastAsia="Times New Roman" w:hAnsi="Times New Roman"/>
+          <w:sz w:val="21"/>
+          <w:szCs w:val="21"/>
+        </w:rPr>
+        <w:t xml:space="preserve"> returns a program that has all its </w:t>
+      </w:r>
+      <w:r>
+        <w:rPr>
+          <w:rFonts w:ascii="Courier New" w:cs="Courier New" w:eastAsia="Courier New" w:hAnsi="Courier New"/>
+          <w:b w:val="false"/>
+          <w:bCs w:val="false"/>
+          <w:sz w:val="19"/>
+          <w:szCs w:val="19"/>
+        </w:rPr>
+        <w:t xml:space="preserve">/* REQUIRE */</w:t>
+      </w:r>
+      <w:r>
+        <w:rPr>
+          <w:rFonts w:ascii="Times New Roman" w:cs="Times New Roman" w:eastAsia="Times New Roman" w:hAnsi="Times New Roman"/>
+          <w:sz w:val="21"/>
+          <w:szCs w:val="21"/>
+        </w:rPr>
+        <w:t xml:space="preserve"> packages merged in, ready to run under BREXX or cREXX on CMS. The bridge belongs to the VM/370plus project, not to this kit. Its client is updated like any other (</w:t>
+      </w:r>
+      <w:r>
+        <w:rPr>
+          <w:rFonts w:ascii="Courier New" w:cs="Courier New" w:eastAsia="Courier New" w:hAnsi="Courier New"/>
+          <w:b w:val="false"/>
+          <w:bCs w:val="false"/>
+          <w:sz w:val="19"/>
+          <w:szCs w:val="19"/>
+        </w:rPr>
+        <w:t xml:space="preserve">rxpip update</w:t>
+      </w:r>
+      <w:r>
+        <w:rPr>
+          <w:rFonts w:ascii="Times New Roman" w:cs="Times New Roman" w:eastAsia="Times New Roman" w:hAnsi="Times New Roman"/>
+          <w:sz w:val="21"/>
+          <w:szCs w:val="21"/>
+        </w:rPr>
+        <w:t xml:space="preserve"> on the Linux guest, or </w:t>
+      </w:r>
+      <w:r>
+        <w:rPr>
+          <w:rFonts w:ascii="Courier New" w:cs="Courier New" w:eastAsia="Courier New" w:hAnsi="Courier New"/>
+          <w:b w:val="false"/>
+          <w:bCs w:val="false"/>
+          <w:sz w:val="19"/>
+          <w:szCs w:val="19"/>
+        </w:rPr>
+        <w:t xml:space="preserve">git pull</w:t>
+      </w:r>
+      <w:r>
+        <w:rPr>
+          <w:rFonts w:ascii="Times New Roman" w:cs="Times New Roman" w:eastAsia="Times New Roman" w:hAnsi="Times New Roman"/>
+          <w:sz w:val="21"/>
+          <w:szCs w:val="21"/>
+        </w:rPr>
+        <w:t xml:space="preserve">), and it should have </w:t>
+      </w:r>
+      <w:r>
+        <w:rPr>
+          <w:rFonts w:ascii="Courier New" w:cs="Courier New" w:eastAsia="Courier New" w:hAnsi="Courier New"/>
+          <w:b w:val="false"/>
+          <w:bCs w:val="false"/>
+          <w:sz w:val="19"/>
+          <w:szCs w:val="19"/>
+        </w:rPr>
+        <w:t xml:space="preserve">RXPIP_NO_UPDATE_CHECK=1</w:t>
+      </w:r>
+      <w:r>
+        <w:rPr>
+          <w:rFonts w:ascii="Times New Roman" w:cs="Times New Roman" w:eastAsia="Times New Roman" w:hAnsi="Times New Roman"/>
+          <w:sz w:val="21"/>
+          <w:szCs w:val="21"/>
+        </w:rPr>
+        <w:t xml:space="preserve"> set so that the daily hint does not appear in CMS output.</w:t>
+      </w:r>
+    </w:p>
+    <w:p>
+      <w:pPr>
+        <w:pStyle w:val="ListParagraph"/>
+        <w:numPr>
+          <w:ilvl w:val="0"/>
+          <w:numId w:val="2"/>
+        </w:numPr>
+        <w:spacing w:after="60"/>
+      </w:pPr>
+      <w:r>
+        <w:rPr>
+          <w:rFonts w:ascii="Times New Roman" w:cs="Times New Roman" w:eastAsia="Times New Roman" w:hAnsi="Times New Roman"/>
+          <w:b/>
+          <w:bCs/>
+          <w:sz w:val="21"/>
+          <w:szCs w:val="21"/>
+        </w:rPr>
+        <w:t xml:space="preserve">Natively on CMS (prepared, not working yet).</w:t>
+      </w:r>
+      <w:r>
+        <w:rPr>
+          <w:rFonts w:ascii="Times New Roman" w:cs="Times New Roman" w:eastAsia="Times New Roman" w:hAnsi="Times New Roman"/>
+          <w:sz w:val="21"/>
+          <w:szCs w:val="21"/>
+        </w:rPr>
+        <w:t xml:space="preserve"> The Regina client is written so that all access to installed packages goes through a few storage routines. A CMS variant of these routines keeps the installed-package records in GLOBALV and copies files between minidisks instead of directories; the client uses it when it runs on CMS. Only a skeleton exists, and it has never been run on a real system. It needs a TCP/IP client on CMS, or a service machine that speaks the RXPIP protocol, to reach the repository.</w:t>
+      </w:r>
+    </w:p>
+    <w:p>
+      <w:pPr>
+        <w:spacing w:after="60"/>
+      </w:pPr>
+    </w:p>
+    <w:p>
+      <w:pPr>
+        <w:spacing w:after="120"/>
+      </w:pPr>
+      <w:r>
+        <w:rPr>
+          <w:rFonts w:ascii="Times New Roman" w:cs="Times New Roman" w:eastAsia="Times New Roman" w:hAnsi="Times New Roman"/>
+          <w:sz w:val="21"/>
+          <w:szCs w:val="21"/>
+        </w:rPr>
+        <w:t xml:space="preserve">Packages meant for CMS must keep to the 8-character name limit for their files. Private packages work through the bridge when the bridge has a token (a dedicated user that is a reader of those packages).</w:t>
+      </w:r>
+    </w:p>
+    <w:p>
+      <w:pPr>
         <w:pStyle w:val="Heading1"/>
         <w:pageBreakBefore/>
         <w:pBdr>
@@ -26253,6 +26593,34 @@
           <w:szCs w:val="26"/>
         </w:rPr>
         <w:t xml:space="preserve">Known limitations</w:t>
+      </w:r>
+    </w:p>
+    <w:p>
+      <w:pPr>
+        <w:pStyle w:val="ListParagraph"/>
+        <w:numPr>
+          <w:ilvl w:val="0"/>
+          <w:numId w:val="2"/>
+        </w:numPr>
+        <w:spacing w:after="60"/>
+      </w:pPr>
+      <w:r>
+        <w:rPr>
+          <w:rFonts w:ascii="Times New Roman" w:cs="Times New Roman" w:eastAsia="Times New Roman" w:hAnsi="Times New Roman"/>
+          <w:b/>
+          <w:bCs/>
+          <w:sz w:val="21"/>
+          <w:szCs w:val="21"/>
+        </w:rPr>
+        <w:t xml:space="preserve">CMS.</w:t>
+      </w:r>
+      <w:r>
+        <w:rPr>
+          <w:rFonts w:ascii="Times New Roman" w:cs="Times New Roman" w:eastAsia="Times New Roman" w:hAnsi="Times New Roman"/>
+          <w:sz w:val="21"/>
+          <w:szCs w:val="21"/>
+        </w:rPr>
+        <w:t xml:space="preserve"> The native CMS storage backend (GLOBALV records, minidisk copies) is only a skeleton and untested; use the bridge in the VM/370plus kit.</w:t>
       </w:r>
     </w:p>
     <w:p>

</xml_diff>

<commit_message>
Website: client download page; releases carry launchers; publish-clients.sh
DOWNLOADS page lists the newest release of each client with file links
(public, also in a closed repository); header link on every page; client
files are sent as attachments. ooRexx launchers work next to rxpip.rexx;
updates keep files executable. tools/publish-clients.sh publishes all four
kinds. Tests and docs updated.

Co-Authored-By: Claude Sonnet 5.5 <noreply@anthropic.com>
Claude-Session: https://claude.ai/code/session_012C2HMKLkyaTRCjXA8PHoVA
</commit_message>
<xml_diff>
--- a/docs/RXPIP-Guide.docx
+++ b/docs/RXPIP-Guide.docx
@@ -330,7 +330,7 @@
           <w:sz w:val="18"/>
           <w:szCs w:val="18"/>
         </w:rPr>
-        <w:t xml:space="preserve">What you need	5</w:t>
+        <w:t xml:space="preserve">Downloading the client	5</w:t>
       </w:r>
     </w:p>
     <w:p>
@@ -349,7 +349,7 @@
           <w:sz w:val="18"/>
           <w:szCs w:val="18"/>
         </w:rPr>
-        <w:t xml:space="preserve">Linux and macOS	5</w:t>
+        <w:t xml:space="preserve">What you need	5</w:t>
       </w:r>
     </w:p>
     <w:p>
@@ -368,7 +368,7 @@
           <w:sz w:val="18"/>
           <w:szCs w:val="18"/>
         </w:rPr>
-        <w:t xml:space="preserve">Windows	5</w:t>
+        <w:t xml:space="preserve">Linux and macOS	5</w:t>
       </w:r>
     </w:p>
     <w:p>
@@ -387,7 +387,7 @@
           <w:sz w:val="18"/>
           <w:szCs w:val="18"/>
         </w:rPr>
-        <w:t xml:space="preserve">The other clients	5</w:t>
+        <w:t xml:space="preserve">Windows	5</w:t>
       </w:r>
     </w:p>
     <w:p>
@@ -406,7 +406,7 @@
           <w:sz w:val="18"/>
           <w:szCs w:val="18"/>
         </w:rPr>
-        <w:t xml:space="preserve">Pointing the client at a repository	6</w:t>
+        <w:t xml:space="preserve">The other clients	6</w:t>
       </w:r>
     </w:p>
     <w:p>
@@ -425,7 +425,7 @@
           <w:sz w:val="18"/>
           <w:szCs w:val="18"/>
         </w:rPr>
-        <w:t xml:space="preserve">Files in the home directory	6</w:t>
+        <w:t xml:space="preserve">Pointing the client at a repository	6</w:t>
       </w:r>
     </w:p>
     <w:p>
@@ -444,7 +444,26 @@
           <w:sz w:val="18"/>
           <w:szCs w:val="18"/>
         </w:rPr>
-        <w:t xml:space="preserve">Keeping the client up to date	6</w:t>
+        <w:t xml:space="preserve">Files in the home directory	6</w:t>
+      </w:r>
+    </w:p>
+    <w:p>
+      <w:pPr>
+        <w:tabs>
+          <w:tab w:val="right" w:pos="9638" w:leader="dot"/>
+        </w:tabs>
+        <w:spacing w:after="20" w:before="0"/>
+        <w:ind w:left="280"/>
+      </w:pPr>
+      <w:r>
+        <w:rPr>
+          <w:rFonts w:ascii="Times New Roman" w:cs="Times New Roman" w:eastAsia="Times New Roman" w:hAnsi="Times New Roman"/>
+          <w:b w:val="false"/>
+          <w:bCs w:val="false"/>
+          <w:sz w:val="18"/>
+          <w:szCs w:val="18"/>
+        </w:rPr>
+        <w:t xml:space="preserve">Keeping the client up to date	7</w:t>
       </w:r>
     </w:p>
     <w:p>
@@ -2436,6 +2455,70 @@
           <w:szCs w:val="21"/>
         </w:rPr>
         <w:t xml:space="preserve">This edition is kept up to date as RXPIP grows; each change is listed here, newest first.</w:t>
+      </w:r>
+    </w:p>
+    <w:p>
+      <w:pPr>
+        <w:pStyle w:val="ListParagraph"/>
+        <w:numPr>
+          <w:ilvl w:val="0"/>
+          <w:numId w:val="2"/>
+        </w:numPr>
+        <w:spacing w:after="60"/>
+      </w:pPr>
+      <w:r>
+        <w:rPr>
+          <w:rFonts w:ascii="Times New Roman" w:cs="Times New Roman" w:eastAsia="Times New Roman" w:hAnsi="Times New Roman"/>
+          <w:b/>
+          <w:bCs/>
+          <w:sz w:val="21"/>
+          <w:szCs w:val="21"/>
+        </w:rPr>
+        <w:t xml:space="preserve">20 October 2026.</w:t>
+      </w:r>
+      <w:r>
+        <w:rPr>
+          <w:rFonts w:ascii="Times New Roman" w:cs="Times New Roman" w:eastAsia="Times New Roman" w:hAnsi="Times New Roman"/>
+          <w:sz w:val="21"/>
+          <w:szCs w:val="21"/>
+        </w:rPr>
+        <w:t xml:space="preserve"> A download page for the clients on the website (</w:t>
+      </w:r>
+      <w:r>
+        <w:rPr>
+          <w:rFonts w:ascii="Courier New" w:cs="Courier New" w:eastAsia="Courier New" w:hAnsi="Courier New"/>
+          <w:b w:val="false"/>
+          <w:bCs w:val="false"/>
+          <w:sz w:val="19"/>
+          <w:szCs w:val="19"/>
+        </w:rPr>
+        <w:t xml:space="preserve">?action=DOWNLOADS</w:t>
+      </w:r>
+      <w:r>
+        <w:rPr>
+          <w:rFonts w:ascii="Times New Roman" w:cs="Times New Roman" w:eastAsia="Times New Roman" w:hAnsi="Times New Roman"/>
+          <w:sz w:val="21"/>
+          <w:szCs w:val="21"/>
+        </w:rPr>
+        <w:t xml:space="preserve">); client releases include the launchers; </w:t>
+      </w:r>
+      <w:r>
+        <w:rPr>
+          <w:rFonts w:ascii="Courier New" w:cs="Courier New" w:eastAsia="Courier New" w:hAnsi="Courier New"/>
+          <w:b w:val="false"/>
+          <w:bCs w:val="false"/>
+          <w:sz w:val="19"/>
+          <w:szCs w:val="19"/>
+        </w:rPr>
+        <w:t xml:space="preserve">tools/publish-clients.sh</w:t>
+      </w:r>
+      <w:r>
+        <w:rPr>
+          <w:rFonts w:ascii="Times New Roman" w:cs="Times New Roman" w:eastAsia="Times New Roman" w:hAnsi="Times New Roman"/>
+          <w:sz w:val="21"/>
+          <w:szCs w:val="21"/>
+        </w:rPr>
+        <w:t xml:space="preserve"> publishes all four kinds; updated launchers stay executable.</w:t>
       </w:r>
     </w:p>
     <w:p>
@@ -4975,6 +5058,109 @@
           <w:sz w:val="26"/>
           <w:szCs w:val="26"/>
         </w:rPr>
+        <w:t xml:space="preserve">Downloading the client</w:t>
+      </w:r>
+    </w:p>
+    <w:p>
+      <w:pPr>
+        <w:spacing w:after="120"/>
+      </w:pPr>
+      <w:r>
+        <w:rPr>
+          <w:rFonts w:ascii="Times New Roman" w:cs="Times New Roman" w:eastAsia="Times New Roman" w:hAnsi="Times New Roman"/>
+          <w:sz w:val="21"/>
+          <w:szCs w:val="21"/>
+        </w:rPr>
+        <w:t xml:space="preserve">The repository’s web page has a </w:t>
+      </w:r>
+      <w:r>
+        <w:rPr>
+          <w:rFonts w:ascii="Times New Roman" w:cs="Times New Roman" w:eastAsia="Times New Roman" w:hAnsi="Times New Roman"/>
+          <w:b/>
+          <w:bCs/>
+          <w:sz w:val="21"/>
+          <w:szCs w:val="21"/>
+        </w:rPr>
+        <w:t xml:space="preserve">Get the rxpip client</w:t>
+      </w:r>
+      <w:r>
+        <w:rPr>
+          <w:rFonts w:ascii="Times New Roman" w:cs="Times New Roman" w:eastAsia="Times New Roman" w:hAnsi="Times New Roman"/>
+          <w:sz w:val="21"/>
+          <w:szCs w:val="21"/>
+        </w:rPr>
+        <w:t xml:space="preserve"> page (the link “get the client” at the top of every page, or </w:t>
+      </w:r>
+      <w:r>
+        <w:rPr>
+          <w:rFonts w:ascii="Courier New" w:cs="Courier New" w:eastAsia="Courier New" w:hAnsi="Courier New"/>
+          <w:b w:val="false"/>
+          <w:bCs w:val="false"/>
+          <w:sz w:val="19"/>
+          <w:szCs w:val="19"/>
+        </w:rPr>
+        <w:t xml:space="preserve">?action=DOWNLOADS</w:t>
+      </w:r>
+      <w:r>
+        <w:rPr>
+          <w:rFonts w:ascii="Times New Roman" w:cs="Times New Roman" w:eastAsia="Times New Roman" w:hAnsi="Times New Roman"/>
+          <w:sz w:val="21"/>
+          <w:szCs w:val="21"/>
+        </w:rPr>
+        <w:t xml:space="preserve">). It lists the newest release of each client, Regina, ooRexx, NetRexx and cREXX, with the files to download: the client itself and its launchers for Linux/macOS and Windows. Save all files of one client into one folder, make the launcher executable on Linux and macOS (</w:t>
+      </w:r>
+      <w:r>
+        <w:rPr>
+          <w:rFonts w:ascii="Courier New" w:cs="Courier New" w:eastAsia="Courier New" w:hAnsi="Courier New"/>
+          <w:b w:val="false"/>
+          <w:bCs w:val="false"/>
+          <w:sz w:val="19"/>
+          <w:szCs w:val="19"/>
+        </w:rPr>
+        <w:t xml:space="preserve">chmod +x</w:t>
+      </w:r>
+      <w:r>
+        <w:rPr>
+          <w:rFonts w:ascii="Times New Roman" w:cs="Times New Roman" w:eastAsia="Times New Roman" w:hAnsi="Times New Roman"/>
+          <w:sz w:val="21"/>
+          <w:szCs w:val="21"/>
+        </w:rPr>
+        <w:t xml:space="preserve">), and run it. The page is public, even when the repository is closed. Afterwards </w:t>
+      </w:r>
+      <w:r>
+        <w:rPr>
+          <w:rFonts w:ascii="Courier New" w:cs="Courier New" w:eastAsia="Courier New" w:hAnsi="Courier New"/>
+          <w:b w:val="false"/>
+          <w:bCs w:val="false"/>
+          <w:sz w:val="19"/>
+          <w:szCs w:val="19"/>
+        </w:rPr>
+        <w:t xml:space="preserve">rxpip update</w:t>
+      </w:r>
+      <w:r>
+        <w:rPr>
+          <w:rFonts w:ascii="Times New Roman" w:cs="Times New Roman" w:eastAsia="Times New Roman" w:hAnsi="Times New Roman"/>
+          <w:sz w:val="21"/>
+          <w:szCs w:val="21"/>
+        </w:rPr>
+        <w:t xml:space="preserve"> keeps the client current. If you have the source kit instead, the sections below describe the same installation from the kit.</w:t>
+      </w:r>
+    </w:p>
+    <w:p>
+      <w:pPr>
+        <w:pStyle w:val="Heading2"/>
+        <w:keepNext/>
+        <w:spacing w:after="140" w:before="320"/>
+      </w:pPr>
+      <w:r>
+        <w:rPr>
+          <w:rFonts w:ascii="Arial" w:cs="Arial" w:eastAsia="Arial" w:hAnsi="Arial"/>
+          <w:b/>
+          <w:bCs/>
+          <w:color w:val="000000"/>
+          <w:sz w:val="26"/>
+          <w:szCs w:val="26"/>
+        </w:rPr>
         <w:t xml:space="preserve">What you need</w:t>
       </w:r>
     </w:p>
@@ -20518,7 +20704,151 @@
           <w:sz w:val="21"/>
           <w:szCs w:val="21"/>
         </w:rPr>
-        <w:t xml:space="preserve">The ooRexx client uses the same file as the Regina client but is a separate kind, so publish it a second time with </w:t>
+        <w:t xml:space="preserve">For a full release, run </w:t>
+      </w:r>
+      <w:r>
+        <w:rPr>
+          <w:rFonts w:ascii="Courier New" w:cs="Courier New" w:eastAsia="Courier New" w:hAnsi="Courier New"/>
+          <w:b w:val="false"/>
+          <w:bCs w:val="false"/>
+          <w:sz w:val="19"/>
+          <w:szCs w:val="19"/>
+        </w:rPr>
+        <w:t xml:space="preserve">tools/publish-clients.sh</w:t>
+      </w:r>
+      <w:r>
+        <w:rPr>
+          <w:rFonts w:ascii="Times New Roman" w:cs="Times New Roman" w:eastAsia="Times New Roman" w:hAnsi="Times New Roman"/>
+          <w:sz w:val="21"/>
+          <w:szCs w:val="21"/>
+        </w:rPr>
+        <w:t xml:space="preserve"> from your checkout while logged in as an administrator. It reads each client’s version from its source, stages the right files (the client and its launchers: </w:t>
+      </w:r>
+      <w:r>
+        <w:rPr>
+          <w:rFonts w:ascii="Courier New" w:cs="Courier New" w:eastAsia="Courier New" w:hAnsi="Courier New"/>
+          <w:b w:val="false"/>
+          <w:bCs w:val="false"/>
+          <w:sz w:val="19"/>
+          <w:szCs w:val="19"/>
+        </w:rPr>
+        <w:t xml:space="preserve">rxpip.rexx</w:t>
+      </w:r>
+      <w:r>
+        <w:rPr>
+          <w:rFonts w:ascii="Times New Roman" w:cs="Times New Roman" w:eastAsia="Times New Roman" w:hAnsi="Times New Roman"/>
+          <w:sz w:val="21"/>
+          <w:szCs w:val="21"/>
+        </w:rPr>
+        <w:t xml:space="preserve"> and </w:t>
+      </w:r>
+      <w:r>
+        <w:rPr>
+          <w:rFonts w:ascii="Courier New" w:cs="Courier New" w:eastAsia="Courier New" w:hAnsi="Courier New"/>
+          <w:b w:val="false"/>
+          <w:bCs w:val="false"/>
+          <w:sz w:val="19"/>
+          <w:szCs w:val="19"/>
+        </w:rPr>
+        <w:t xml:space="preserve">rxpip.bat</w:t>
+      </w:r>
+      <w:r>
+        <w:rPr>
+          <w:rFonts w:ascii="Times New Roman" w:cs="Times New Roman" w:eastAsia="Times New Roman" w:hAnsi="Times New Roman"/>
+          <w:sz w:val="21"/>
+          <w:szCs w:val="21"/>
+        </w:rPr>
+        <w:t xml:space="preserve"> for Regina, </w:t>
+      </w:r>
+      <w:r>
+        <w:rPr>
+          <w:rFonts w:ascii="Courier New" w:cs="Courier New" w:eastAsia="Courier New" w:hAnsi="Courier New"/>
+          <w:b w:val="false"/>
+          <w:bCs w:val="false"/>
+          <w:sz w:val="19"/>
+          <w:szCs w:val="19"/>
+        </w:rPr>
+        <w:t xml:space="preserve">rxpip.rexx</w:t>
+      </w:r>
+      <w:r>
+        <w:rPr>
+          <w:rFonts w:ascii="Times New Roman" w:cs="Times New Roman" w:eastAsia="Times New Roman" w:hAnsi="Times New Roman"/>
+          <w:sz w:val="21"/>
+          <w:szCs w:val="21"/>
+        </w:rPr>
+        <w:t xml:space="preserve"> with the two ooRexx launchers for ooRexx, </w:t>
+      </w:r>
+      <w:r>
+        <w:rPr>
+          <w:rFonts w:ascii="Courier New" w:cs="Courier New" w:eastAsia="Courier New" w:hAnsi="Courier New"/>
+          <w:b w:val="false"/>
+          <w:bCs w:val="false"/>
+          <w:sz w:val="19"/>
+          <w:szCs w:val="19"/>
+        </w:rPr>
+        <w:t xml:space="preserve">Rxpip.nrx</w:t>
+      </w:r>
+      <w:r>
+        <w:rPr>
+          <w:rFonts w:ascii="Times New Roman" w:cs="Times New Roman" w:eastAsia="Times New Roman" w:hAnsi="Times New Roman"/>
+          <w:sz w:val="21"/>
+          <w:szCs w:val="21"/>
+        </w:rPr>
+        <w:t xml:space="preserve"> with its launchers for NetRexx, </w:t>
+      </w:r>
+      <w:r>
+        <w:rPr>
+          <w:rFonts w:ascii="Courier New" w:cs="Courier New" w:eastAsia="Courier New" w:hAnsi="Courier New"/>
+          <w:b w:val="false"/>
+          <w:bCs w:val="false"/>
+          <w:sz w:val="19"/>
+          <w:szCs w:val="19"/>
+        </w:rPr>
+        <w:t xml:space="preserve">rxpip.crexx</w:t>
+      </w:r>
+      <w:r>
+        <w:rPr>
+          <w:rFonts w:ascii="Times New Roman" w:cs="Times New Roman" w:eastAsia="Times New Roman" w:hAnsi="Times New Roman"/>
+          <w:sz w:val="21"/>
+          <w:szCs w:val="21"/>
+        </w:rPr>
+        <w:t xml:space="preserve"> with its launchers for cREXX) and publishes the four kinds; </w:t>
+      </w:r>
+      <w:r>
+        <w:rPr>
+          <w:rFonts w:ascii="Courier New" w:cs="Courier New" w:eastAsia="Courier New" w:hAnsi="Courier New"/>
+          <w:b w:val="false"/>
+          <w:bCs w:val="false"/>
+          <w:sz w:val="19"/>
+          <w:szCs w:val="19"/>
+        </w:rPr>
+        <w:t xml:space="preserve">--min=&lt;version&gt;</w:t>
+      </w:r>
+      <w:r>
+        <w:rPr>
+          <w:rFonts w:ascii="Times New Roman" w:cs="Times New Roman" w:eastAsia="Times New Roman" w:hAnsi="Times New Roman"/>
+          <w:sz w:val="21"/>
+          <w:szCs w:val="21"/>
+        </w:rPr>
+        <w:t xml:space="preserve"> sets the oldest working client, and kind names after it limit the run. The new releases appear on the download page at once. By hand: the ooRexx client uses the same </w:t>
+      </w:r>
+      <w:r>
+        <w:rPr>
+          <w:rFonts w:ascii="Courier New" w:cs="Courier New" w:eastAsia="Courier New" w:hAnsi="Courier New"/>
+          <w:b w:val="false"/>
+          <w:bCs w:val="false"/>
+          <w:sz w:val="19"/>
+          <w:szCs w:val="19"/>
+        </w:rPr>
+        <w:t xml:space="preserve">rxpip.rexx</w:t>
+      </w:r>
+      <w:r>
+        <w:rPr>
+          <w:rFonts w:ascii="Times New Roman" w:cs="Times New Roman" w:eastAsia="Times New Roman" w:hAnsi="Times New Roman"/>
+          <w:sz w:val="21"/>
+          <w:szCs w:val="21"/>
+        </w:rPr>
+        <w:t xml:space="preserve"> as the Regina client but is a separate kind, so publish it a second time with </w:t>
       </w:r>
       <w:r>
         <w:rPr>
@@ -22393,6 +22723,97 @@
                 <w:szCs w:val="18"/>
               </w:rPr>
               <w:t xml:space="preserve">New user and first token</w:t>
+            </w:r>
+          </w:p>
+        </w:tc>
+      </w:tr>
+      <w:tr>
+        <w:trPr>
+          <w:cantSplit/>
+        </w:trPr>
+        <w:tc>
+          <w:tcPr>
+            <w:tcW w:type="dxa" w:w="1500"/>
+            <w:tcMar>
+              <w:top w:type="dxa" w:w="60"/>
+              <w:left w:type="dxa" w:w="100"/>
+              <w:bottom w:type="dxa" w:w="60"/>
+              <w:right w:type="dxa" w:w="100"/>
+            </w:tcMar>
+          </w:tcPr>
+          <w:p>
+            <w:r>
+              <w:rPr>
+                <w:rFonts w:ascii="Courier New" w:cs="Courier New" w:eastAsia="Courier New" w:hAnsi="Courier New"/>
+                <w:b w:val="false"/>
+                <w:bCs w:val="false"/>
+                <w:sz w:val="17"/>
+                <w:szCs w:val="17"/>
+              </w:rPr>
+              <w:t xml:space="preserve">DOWNLOADS</w:t>
+            </w:r>
+          </w:p>
+        </w:tc>
+        <w:tc>
+          <w:tcPr>
+            <w:tcW w:type="dxa" w:w="900"/>
+            <w:tcMar>
+              <w:top w:type="dxa" w:w="60"/>
+              <w:left w:type="dxa" w:w="100"/>
+              <w:bottom w:type="dxa" w:w="60"/>
+              <w:right w:type="dxa" w:w="100"/>
+            </w:tcMar>
+          </w:tcPr>
+          <w:p>
+            <w:r>
+              <w:rPr>
+                <w:rFonts w:ascii="Times New Roman" w:cs="Times New Roman" w:eastAsia="Times New Roman" w:hAnsi="Times New Roman"/>
+                <w:sz w:val="18"/>
+                <w:szCs w:val="18"/>
+              </w:rPr>
+              <w:t xml:space="preserve">GET</w:t>
+            </w:r>
+          </w:p>
+        </w:tc>
+        <w:tc>
+          <w:tcPr>
+            <w:tcW w:type="dxa" w:w="3400"/>
+            <w:tcMar>
+              <w:top w:type="dxa" w:w="60"/>
+              <w:left w:type="dxa" w:w="100"/>
+              <w:bottom w:type="dxa" w:w="60"/>
+              <w:right w:type="dxa" w:w="100"/>
+            </w:tcMar>
+          </w:tcPr>
+          <w:p>
+            <w:r>
+              <w:rPr>
+                <w:rFonts w:ascii="Times New Roman" w:cs="Times New Roman" w:eastAsia="Times New Roman" w:hAnsi="Times New Roman"/>
+                <w:sz w:val="18"/>
+                <w:szCs w:val="18"/>
+              </w:rPr>
+              <w:t xml:space="preserve">—</w:t>
+            </w:r>
+          </w:p>
+        </w:tc>
+        <w:tc>
+          <w:tcPr>
+            <w:tcW w:type="dxa" w:w="3838"/>
+            <w:tcMar>
+              <w:top w:type="dxa" w:w="60"/>
+              <w:left w:type="dxa" w:w="100"/>
+              <w:bottom w:type="dxa" w:w="60"/>
+              <w:right w:type="dxa" w:w="100"/>
+            </w:tcMar>
+          </w:tcPr>
+          <w:p>
+            <w:r>
+              <w:rPr>
+                <w:rFonts w:ascii="Times New Roman" w:cs="Times New Roman" w:eastAsia="Times New Roman" w:hAnsi="Times New Roman"/>
+                <w:sz w:val="18"/>
+                <w:szCs w:val="18"/>
+              </w:rPr>
+              <w:t xml:space="preserve">HTML page listing the newest release of each client with download links</w:t>
             </w:r>
           </w:p>
         </w:tc>

</xml_diff>

<commit_message>
Download page: SHA-256 checksums and instructions for blocked downloads (Windows, macOS)
Co-Authored-By: Claude Sonnet 5.5 <noreply@anthropic.com>
Claude-Session: https://claude.ai/code/session_012C2HMKLkyaTRCjXA8PHoVA
</commit_message>
<xml_diff>
--- a/docs/RXPIP-Guide.docx
+++ b/docs/RXPIP-Guide.docx
@@ -444,7 +444,7 @@
           <w:sz w:val="18"/>
           <w:szCs w:val="18"/>
         </w:rPr>
-        <w:t xml:space="preserve">Files in the home directory	6</w:t>
+        <w:t xml:space="preserve">Files in the home directory	7</w:t>
       </w:r>
     </w:p>
     <w:p>
@@ -501,7 +501,7 @@
           <w:sz w:val="21"/>
           <w:szCs w:val="21"/>
         </w:rPr>
-        <w:t xml:space="preserve">Chapter 3. Using Packages	8</w:t>
+        <w:t xml:space="preserve">Chapter 3. Using Packages	9</w:t>
       </w:r>
     </w:p>
     <w:p>
@@ -520,7 +520,7 @@
           <w:sz w:val="18"/>
           <w:szCs w:val="18"/>
         </w:rPr>
-        <w:t xml:space="preserve">Finding packages	8</w:t>
+        <w:t xml:space="preserve">Finding packages	9</w:t>
       </w:r>
     </w:p>
     <w:p>
@@ -539,7 +539,7 @@
           <w:sz w:val="18"/>
           <w:szCs w:val="18"/>
         </w:rPr>
-        <w:t xml:space="preserve">Installing and removing	8</w:t>
+        <w:t xml:space="preserve">Installing and removing	9</w:t>
       </w:r>
     </w:p>
     <w:p>
@@ -558,7 +558,7 @@
           <w:sz w:val="18"/>
           <w:szCs w:val="18"/>
         </w:rPr>
-        <w:t xml:space="preserve">Version requirements	9</w:t>
+        <w:t xml:space="preserve">Version requirements	10</w:t>
       </w:r>
     </w:p>
     <w:p>
@@ -577,7 +577,7 @@
           <w:sz w:val="18"/>
           <w:szCs w:val="18"/>
         </w:rPr>
-        <w:t xml:space="preserve">Running a program	9</w:t>
+        <w:t xml:space="preserve">Running a program	10</w:t>
       </w:r>
     </w:p>
     <w:p>
@@ -596,7 +596,7 @@
           <w:sz w:val="18"/>
           <w:szCs w:val="18"/>
         </w:rPr>
-        <w:t xml:space="preserve">Building a stand-alone program	9</w:t>
+        <w:t xml:space="preserve">Building a stand-alone program	10</w:t>
       </w:r>
     </w:p>
     <w:p>
@@ -615,7 +615,7 @@
           <w:sz w:val="18"/>
           <w:szCs w:val="18"/>
         </w:rPr>
-        <w:t xml:space="preserve">How the merge works	10</w:t>
+        <w:t xml:space="preserve">How the merge works	11</w:t>
       </w:r>
     </w:p>
     <w:p>
@@ -634,7 +634,7 @@
           <w:sz w:val="21"/>
           <w:szCs w:val="21"/>
         </w:rPr>
-        <w:t xml:space="preserve">Chapter 4. Creating and Publishing a Package	11</w:t>
+        <w:t xml:space="preserve">Chapter 4. Creating and Publishing a Package	12</w:t>
       </w:r>
     </w:p>
     <w:p>
@@ -653,7 +653,7 @@
           <w:sz w:val="18"/>
           <w:szCs w:val="18"/>
         </w:rPr>
-        <w:t xml:space="preserve">What a package is	11</w:t>
+        <w:t xml:space="preserve">What a package is	12</w:t>
       </w:r>
     </w:p>
     <w:p>
@@ -672,7 +672,7 @@
           <w:sz w:val="18"/>
           <w:szCs w:val="18"/>
         </w:rPr>
-        <w:t xml:space="preserve">Writing the routines	11</w:t>
+        <w:t xml:space="preserve">Writing the routines	12</w:t>
       </w:r>
     </w:p>
     <w:p>
@@ -691,7 +691,7 @@
           <w:sz w:val="18"/>
           <w:szCs w:val="18"/>
         </w:rPr>
-        <w:t xml:space="preserve">Building the archive	11</w:t>
+        <w:t xml:space="preserve">Building the archive	12</w:t>
       </w:r>
     </w:p>
     <w:p>
@@ -710,7 +710,7 @@
           <w:sz w:val="18"/>
           <w:szCs w:val="18"/>
         </w:rPr>
-        <w:t xml:space="preserve">Publishing	12</w:t>
+        <w:t xml:space="preserve">Publishing	13</w:t>
       </w:r>
     </w:p>
     <w:p>
@@ -729,7 +729,7 @@
           <w:sz w:val="18"/>
           <w:szCs w:val="18"/>
         </w:rPr>
-        <w:t xml:space="preserve">Packages for NetRexx and cREXX	12</w:t>
+        <w:t xml:space="preserve">Packages for NetRexx and cREXX	13</w:t>
       </w:r>
     </w:p>
     <w:p>
@@ -748,7 +748,7 @@
           <w:sz w:val="18"/>
           <w:szCs w:val="18"/>
         </w:rPr>
-        <w:t xml:space="preserve">Trying a package before you publish it	13</w:t>
+        <w:t xml:space="preserve">Trying a package before you publish it	14</w:t>
       </w:r>
     </w:p>
     <w:p>
@@ -767,7 +767,7 @@
           <w:sz w:val="18"/>
           <w:szCs w:val="18"/>
         </w:rPr>
-        <w:t xml:space="preserve">Common errors	13</w:t>
+        <w:t xml:space="preserve">Common errors	14</w:t>
       </w:r>
     </w:p>
     <w:p>
@@ -786,7 +786,7 @@
           <w:sz w:val="21"/>
           <w:szCs w:val="21"/>
         </w:rPr>
-        <w:t xml:space="preserve">Chapter 5. Accounts, Tokens and Owners	14</w:t>
+        <w:t xml:space="preserve">Chapter 5. Accounts, Tokens and Owners	15</w:t>
       </w:r>
     </w:p>
     <w:p>
@@ -805,7 +805,7 @@
           <w:sz w:val="18"/>
           <w:szCs w:val="18"/>
         </w:rPr>
-        <w:t xml:space="preserve">Getting an account	14</w:t>
+        <w:t xml:space="preserve">Getting an account	15</w:t>
       </w:r>
     </w:p>
     <w:p>
@@ -824,7 +824,7 @@
           <w:sz w:val="18"/>
           <w:szCs w:val="18"/>
         </w:rPr>
-        <w:t xml:space="preserve">Tokens	14</w:t>
+        <w:t xml:space="preserve">Tokens	15</w:t>
       </w:r>
     </w:p>
     <w:p>
@@ -843,7 +843,7 @@
           <w:sz w:val="18"/>
           <w:szCs w:val="18"/>
         </w:rPr>
-        <w:t xml:space="preserve">Owners	14</w:t>
+        <w:t xml:space="preserve">Owners	15</w:t>
       </w:r>
     </w:p>
     <w:p>
@@ -862,7 +862,7 @@
           <w:sz w:val="18"/>
           <w:szCs w:val="18"/>
         </w:rPr>
-        <w:t xml:space="preserve">Private packages	15</w:t>
+        <w:t xml:space="preserve">Private packages	16</w:t>
       </w:r>
     </w:p>
     <w:p>
@@ -881,7 +881,7 @@
           <w:sz w:val="21"/>
           <w:szCs w:val="21"/>
         </w:rPr>
-        <w:t xml:space="preserve">Chapter 6. The Web Interface	16</w:t>
+        <w:t xml:space="preserve">Chapter 6. The Web Interface	17</w:t>
       </w:r>
     </w:p>
     <w:p>
@@ -900,7 +900,7 @@
           <w:sz w:val="18"/>
           <w:szCs w:val="18"/>
         </w:rPr>
-        <w:t xml:space="preserve">What you can do in a browser	16</w:t>
+        <w:t xml:space="preserve">What you can do in a browser	17</w:t>
       </w:r>
     </w:p>
     <w:p>
@@ -919,7 +919,7 @@
           <w:sz w:val="18"/>
           <w:szCs w:val="18"/>
         </w:rPr>
-        <w:t xml:space="preserve">What needs the client	16</w:t>
+        <w:t xml:space="preserve">What needs the client	17</w:t>
       </w:r>
     </w:p>
     <w:p>
@@ -938,7 +938,7 @@
           <w:sz w:val="18"/>
           <w:szCs w:val="18"/>
         </w:rPr>
-        <w:t xml:space="preserve">Requesting an account	16</w:t>
+        <w:t xml:space="preserve">Requesting an account	17</w:t>
       </w:r>
     </w:p>
     <w:p>
@@ -957,7 +957,7 @@
           <w:sz w:val="18"/>
           <w:szCs w:val="18"/>
         </w:rPr>
-        <w:t xml:space="preserve">Safety of the pages	16</w:t>
+        <w:t xml:space="preserve">Safety of the pages	17</w:t>
       </w:r>
     </w:p>
     <w:p>
@@ -976,7 +976,7 @@
           <w:sz w:val="21"/>
           <w:szCs w:val="21"/>
         </w:rPr>
-        <w:t xml:space="preserve">Chapter 7. Installing the Server	17</w:t>
+        <w:t xml:space="preserve">Chapter 7. Installing the Server	18</w:t>
       </w:r>
     </w:p>
     <w:p>
@@ -995,7 +995,7 @@
           <w:sz w:val="18"/>
           <w:szCs w:val="18"/>
         </w:rPr>
-        <w:t xml:space="preserve">Packages	17</w:t>
+        <w:t xml:space="preserve">Packages	18</w:t>
       </w:r>
     </w:p>
     <w:p>
@@ -1014,7 +1014,7 @@
           <w:sz w:val="18"/>
           <w:szCs w:val="18"/>
         </w:rPr>
-        <w:t xml:space="preserve">Directories	17</w:t>
+        <w:t xml:space="preserve">Directories	18</w:t>
       </w:r>
     </w:p>
     <w:p>
@@ -1033,7 +1033,7 @@
           <w:sz w:val="18"/>
           <w:szCs w:val="18"/>
         </w:rPr>
-        <w:t xml:space="preserve">SELinux	17</w:t>
+        <w:t xml:space="preserve">SELinux	18</w:t>
       </w:r>
     </w:p>
     <w:p>
@@ -1052,7 +1052,7 @@
           <w:sz w:val="18"/>
           <w:szCs w:val="18"/>
         </w:rPr>
-        <w:t xml:space="preserve">Apache	17</w:t>
+        <w:t xml:space="preserve">Apache	18</w:t>
       </w:r>
     </w:p>
     <w:p>
@@ -1071,7 +1071,7 @@
           <w:sz w:val="18"/>
           <w:szCs w:val="18"/>
         </w:rPr>
-        <w:t xml:space="preserve">Firewall	18</w:t>
+        <w:t xml:space="preserve">Firewall	19</w:t>
       </w:r>
     </w:p>
     <w:p>
@@ -1090,7 +1090,7 @@
           <w:sz w:val="18"/>
           <w:szCs w:val="18"/>
         </w:rPr>
-        <w:t xml:space="preserve">HTTPS	18</w:t>
+        <w:t xml:space="preserve">HTTPS	19</w:t>
       </w:r>
     </w:p>
     <w:p>
@@ -1109,7 +1109,7 @@
           <w:sz w:val="18"/>
           <w:szCs w:val="18"/>
         </w:rPr>
-        <w:t xml:space="preserve">Sign-up mail (optional)	18</w:t>
+        <w:t xml:space="preserve">Sign-up mail (optional)	19</w:t>
       </w:r>
     </w:p>
     <w:p>
@@ -1128,7 +1128,7 @@
           <w:sz w:val="18"/>
           <w:szCs w:val="18"/>
         </w:rPr>
-        <w:t xml:space="preserve">The first account	19</w:t>
+        <w:t xml:space="preserve">The first account	20</w:t>
       </w:r>
     </w:p>
     <w:p>
@@ -1147,7 +1147,7 @@
           <w:sz w:val="21"/>
           <w:szCs w:val="21"/>
         </w:rPr>
-        <w:t xml:space="preserve">Chapter 8. Operating the Server	20</w:t>
+        <w:t xml:space="preserve">Chapter 8. Operating the Server	21</w:t>
       </w:r>
     </w:p>
     <w:p>
@@ -1166,7 +1166,7 @@
           <w:sz w:val="18"/>
           <w:szCs w:val="18"/>
         </w:rPr>
-        <w:t xml:space="preserve">Administration commands	20</w:t>
+        <w:t xml:space="preserve">Administration commands	21</w:t>
       </w:r>
     </w:p>
     <w:p>
@@ -1185,7 +1185,7 @@
           <w:sz w:val="18"/>
           <w:szCs w:val="18"/>
         </w:rPr>
-        <w:t xml:space="preserve">Where things are stored	20</w:t>
+        <w:t xml:space="preserve">Where things are stored	21</w:t>
       </w:r>
     </w:p>
     <w:p>
@@ -1204,7 +1204,7 @@
           <w:sz w:val="18"/>
           <w:szCs w:val="18"/>
         </w:rPr>
-        <w:t xml:space="preserve">Backup and restore	20</w:t>
+        <w:t xml:space="preserve">Backup and restore	21</w:t>
       </w:r>
     </w:p>
     <w:p>
@@ -1223,7 +1223,7 @@
           <w:sz w:val="18"/>
           <w:szCs w:val="18"/>
         </w:rPr>
-        <w:t xml:space="preserve">Upgrading	20</w:t>
+        <w:t xml:space="preserve">Upgrading	21</w:t>
       </w:r>
     </w:p>
     <w:p>
@@ -1242,7 +1242,7 @@
           <w:sz w:val="18"/>
           <w:szCs w:val="18"/>
         </w:rPr>
-        <w:t xml:space="preserve">Limits	20</w:t>
+        <w:t xml:space="preserve">Limits	21</w:t>
       </w:r>
     </w:p>
     <w:p>
@@ -1261,7 +1261,7 @@
           <w:sz w:val="18"/>
           <w:szCs w:val="18"/>
         </w:rPr>
-        <w:t xml:space="preserve">Troubleshooting	21</w:t>
+        <w:t xml:space="preserve">Troubleshooting	22</w:t>
       </w:r>
     </w:p>
     <w:p>
@@ -1280,7 +1280,7 @@
           <w:sz w:val="18"/>
           <w:szCs w:val="18"/>
         </w:rPr>
-        <w:t xml:space="preserve">Administrators and the statistics	21</w:t>
+        <w:t xml:space="preserve">Administrators and the statistics	22</w:t>
       </w:r>
     </w:p>
     <w:p>
@@ -1299,7 +1299,7 @@
           <w:sz w:val="21"/>
           <w:szCs w:val="21"/>
         </w:rPr>
-        <w:t xml:space="preserve">Chapter 9. Protocol Reference	23</w:t>
+        <w:t xml:space="preserve">Chapter 9. Protocol Reference	24</w:t>
       </w:r>
     </w:p>
     <w:p>
@@ -1318,7 +1318,7 @@
           <w:sz w:val="18"/>
           <w:szCs w:val="18"/>
         </w:rPr>
-        <w:t xml:space="preserve">Response format	23</w:t>
+        <w:t xml:space="preserve">Response format	24</w:t>
       </w:r>
     </w:p>
     <w:p>
@@ -1337,7 +1337,7 @@
           <w:sz w:val="18"/>
           <w:szCs w:val="18"/>
         </w:rPr>
-        <w:t xml:space="preserve">Actions without a login	23</w:t>
+        <w:t xml:space="preserve">Actions without a login	24</w:t>
       </w:r>
     </w:p>
     <w:p>
@@ -1356,7 +1356,7 @@
           <w:sz w:val="18"/>
           <w:szCs w:val="18"/>
         </w:rPr>
-        <w:t xml:space="preserve">Actions that need a token	23</w:t>
+        <w:t xml:space="preserve">Actions that need a token	24</w:t>
       </w:r>
     </w:p>
     <w:p>
@@ -1375,7 +1375,7 @@
           <w:sz w:val="18"/>
           <w:szCs w:val="18"/>
         </w:rPr>
-        <w:t xml:space="preserve">Administrator actions	24</w:t>
+        <w:t xml:space="preserve">Administrator actions	25</w:t>
       </w:r>
     </w:p>
     <w:p>
@@ -1394,7 +1394,7 @@
           <w:sz w:val="18"/>
           <w:szCs w:val="18"/>
         </w:rPr>
-        <w:t xml:space="preserve">Error codes	24</w:t>
+        <w:t xml:space="preserve">Error codes	25</w:t>
       </w:r>
     </w:p>
     <w:p>
@@ -1413,7 +1413,7 @@
           <w:sz w:val="21"/>
           <w:szCs w:val="21"/>
         </w:rPr>
-        <w:t xml:space="preserve">Chapter 10. Security	26</w:t>
+        <w:t xml:space="preserve">Chapter 10. Security	27</w:t>
       </w:r>
     </w:p>
     <w:p>
@@ -1432,7 +1432,7 @@
           <w:sz w:val="18"/>
           <w:szCs w:val="18"/>
         </w:rPr>
-        <w:t xml:space="preserve">Tokens and invitations	26</w:t>
+        <w:t xml:space="preserve">Tokens and invitations	27</w:t>
       </w:r>
     </w:p>
     <w:p>
@@ -1451,7 +1451,7 @@
           <w:sz w:val="18"/>
           <w:szCs w:val="18"/>
         </w:rPr>
-        <w:t xml:space="preserve">Publishing	26</w:t>
+        <w:t xml:space="preserve">Publishing	27</w:t>
       </w:r>
     </w:p>
     <w:p>
@@ -1470,7 +1470,7 @@
           <w:sz w:val="18"/>
           <w:szCs w:val="18"/>
         </w:rPr>
-        <w:t xml:space="preserve">Sign-up requests	26</w:t>
+        <w:t xml:space="preserve">Sign-up requests	27</w:t>
       </w:r>
     </w:p>
     <w:p>
@@ -1489,7 +1489,7 @@
           <w:sz w:val="18"/>
           <w:szCs w:val="18"/>
         </w:rPr>
-        <w:t xml:space="preserve">The web pages	26</w:t>
+        <w:t xml:space="preserve">The web pages	27</w:t>
       </w:r>
     </w:p>
     <w:p>
@@ -1508,7 +1508,7 @@
           <w:sz w:val="18"/>
           <w:szCs w:val="18"/>
         </w:rPr>
-        <w:t xml:space="preserve">Usage statistics and privacy	27</w:t>
+        <w:t xml:space="preserve">Usage statistics and privacy	28</w:t>
       </w:r>
     </w:p>
     <w:p>
@@ -1527,7 +1527,7 @@
           <w:sz w:val="18"/>
           <w:szCs w:val="18"/>
         </w:rPr>
-        <w:t xml:space="preserve">What RXPIP does not protect against	27</w:t>
+        <w:t xml:space="preserve">What RXPIP does not protect against	28</w:t>
       </w:r>
     </w:p>
     <w:p>
@@ -1546,7 +1546,7 @@
           <w:sz w:val="21"/>
           <w:szCs w:val="21"/>
         </w:rPr>
-        <w:t xml:space="preserve">Chapter 11. Restrictions and Known Problems	28</w:t>
+        <w:t xml:space="preserve">Chapter 11. Restrictions and Known Problems	29</w:t>
       </w:r>
     </w:p>
     <w:p>
@@ -1565,7 +1565,7 @@
           <w:sz w:val="18"/>
           <w:szCs w:val="18"/>
         </w:rPr>
-        <w:t xml:space="preserve">What has been tested	28</w:t>
+        <w:t xml:space="preserve">What has been tested	29</w:t>
       </w:r>
     </w:p>
     <w:p>
@@ -1584,7 +1584,7 @@
           <w:sz w:val="18"/>
           <w:szCs w:val="18"/>
         </w:rPr>
-        <w:t xml:space="preserve">What has not been tested	28</w:t>
+        <w:t xml:space="preserve">What has not been tested	29</w:t>
       </w:r>
     </w:p>
     <w:p>
@@ -1603,7 +1603,7 @@
           <w:sz w:val="18"/>
           <w:szCs w:val="18"/>
         </w:rPr>
-        <w:t xml:space="preserve">Known limitations	28</w:t>
+        <w:t xml:space="preserve">Known limitations	29</w:t>
       </w:r>
     </w:p>
     <w:p>
@@ -1622,7 +1622,7 @@
           <w:sz w:val="21"/>
           <w:szCs w:val="21"/>
         </w:rPr>
-        <w:t xml:space="preserve">Appendix A. Command Summary	29</w:t>
+        <w:t xml:space="preserve">Appendix A. Command Summary	30</w:t>
       </w:r>
     </w:p>
     <w:p>
@@ -1641,7 +1641,7 @@
           <w:sz w:val="18"/>
           <w:szCs w:val="18"/>
         </w:rPr>
-        <w:t xml:space="preserve">Client commands	29</w:t>
+        <w:t xml:space="preserve">Client commands	30</w:t>
       </w:r>
     </w:p>
     <w:p>
@@ -1660,7 +1660,7 @@
           <w:sz w:val="21"/>
           <w:szCs w:val="21"/>
         </w:rPr>
-        <w:t xml:space="preserve">Appendix B. Server Administration Commands	30</w:t>
+        <w:t xml:space="preserve">Appendix B. Server Administration Commands	31</w:t>
       </w:r>
     </w:p>
     <w:p>
@@ -1679,7 +1679,7 @@
           <w:sz w:val="21"/>
           <w:szCs w:val="21"/>
         </w:rPr>
-        <w:t xml:space="preserve">Appendix C. Environment Variables and Files	31</w:t>
+        <w:t xml:space="preserve">Appendix C. Environment Variables and Files	32</w:t>
       </w:r>
     </w:p>
     <w:p>
@@ -1698,7 +1698,7 @@
           <w:sz w:val="18"/>
           <w:szCs w:val="18"/>
         </w:rPr>
-        <w:t xml:space="preserve">Environment variables	31</w:t>
+        <w:t xml:space="preserve">Environment variables	32</w:t>
       </w:r>
     </w:p>
     <w:p>
@@ -1717,7 +1717,7 @@
           <w:sz w:val="18"/>
           <w:szCs w:val="18"/>
         </w:rPr>
-        <w:t xml:space="preserve">Files	31</w:t>
+        <w:t xml:space="preserve">Files	32</w:t>
       </w:r>
     </w:p>
     <w:p>
@@ -1736,7 +1736,7 @@
           <w:sz w:val="21"/>
           <w:szCs w:val="21"/>
         </w:rPr>
-        <w:t xml:space="preserve">Appendix D. Contents of the Kit	32</w:t>
+        <w:t xml:space="preserve">Appendix D. Contents of the Kit	33</w:t>
       </w:r>
     </w:p>
     <w:p>
@@ -2482,7 +2482,7 @@
           <w:sz w:val="21"/>
           <w:szCs w:val="21"/>
         </w:rPr>
-        <w:t xml:space="preserve"> A download page for the clients on the website (</w:t>
+        <w:t xml:space="preserve"> Download page with sections for Windows, Linux and macOS, SHA-256 checksums and instructions for blocked downloads; a download page for the clients on the website (</w:t>
       </w:r>
       <w:r>
         <w:rPr>
@@ -5145,6 +5145,352 @@
         </w:rPr>
         <w:t xml:space="preserve"> keeps the client current. If you have the source kit instead, the sections below describe the same installation from the kit.</w:t>
       </w:r>
+    </w:p>
+    <w:p>
+      <w:pPr>
+        <w:pStyle w:val="Heading3"/>
+        <w:keepNext/>
+        <w:spacing w:after="100" w:before="220"/>
+      </w:pPr>
+      <w:r>
+        <w:rPr>
+          <w:rFonts w:ascii="Arial" w:cs="Arial" w:eastAsia="Arial" w:hAnsi="Arial"/>
+          <w:b/>
+          <w:bCs/>
+          <w:color w:val="000000"/>
+          <w:sz w:val="22"/>
+          <w:szCs w:val="22"/>
+        </w:rPr>
+        <w:t xml:space="preserve">If the system blocks the download</w:t>
+      </w:r>
+    </w:p>
+    <w:p>
+      <w:pPr>
+        <w:spacing w:after="120"/>
+      </w:pPr>
+      <w:r>
+        <w:rPr>
+          <w:rFonts w:ascii="Times New Roman" w:cs="Times New Roman" w:eastAsia="Times New Roman" w:hAnsi="Times New Roman"/>
+          <w:sz w:val="21"/>
+          <w:szCs w:val="21"/>
+        </w:rPr>
+        <w:t xml:space="preserve">The clients are plain-text scripts and are not code-signed. Microsoft and Apple sell signing only for their own formats, and neither can sign a REXX script or a batch file. Files fetched with </w:t>
+      </w:r>
+      <w:r>
+        <w:rPr>
+          <w:rFonts w:ascii="Courier New" w:cs="Courier New" w:eastAsia="Courier New" w:hAnsi="Courier New"/>
+          <w:b w:val="false"/>
+          <w:bCs w:val="false"/>
+          <w:sz w:val="19"/>
+          <w:szCs w:val="19"/>
+        </w:rPr>
+        <w:t xml:space="preserve">curl</w:t>
+      </w:r>
+      <w:r>
+        <w:rPr>
+          <w:rFonts w:ascii="Times New Roman" w:cs="Times New Roman" w:eastAsia="Times New Roman" w:hAnsi="Times New Roman"/>
+          <w:sz w:val="21"/>
+          <w:szCs w:val="21"/>
+        </w:rPr>
+        <w:t xml:space="preserve"> (the commands on the download page) are not marked as coming from the Internet and run without trouble. A file saved with a web browser carries that mark, and the system may refuse it:</w:t>
+      </w:r>
+    </w:p>
+    <w:p>
+      <w:pPr>
+        <w:pStyle w:val="ListParagraph"/>
+        <w:numPr>
+          <w:ilvl w:val="0"/>
+          <w:numId w:val="2"/>
+        </w:numPr>
+        <w:spacing w:after="60"/>
+      </w:pPr>
+      <w:r>
+        <w:rPr>
+          <w:rFonts w:ascii="Times New Roman" w:cs="Times New Roman" w:eastAsia="Times New Roman" w:hAnsi="Times New Roman"/>
+          <w:b/>
+          <w:bCs/>
+          <w:sz w:val="21"/>
+          <w:szCs w:val="21"/>
+        </w:rPr>
+        <w:t xml:space="preserve">Windows:</w:t>
+      </w:r>
+      <w:r>
+        <w:rPr>
+          <w:rFonts w:ascii="Times New Roman" w:cs="Times New Roman" w:eastAsia="Times New Roman" w:hAnsi="Times New Roman"/>
+          <w:sz w:val="21"/>
+          <w:szCs w:val="21"/>
+        </w:rPr>
+        <w:t xml:space="preserve"> right-click the file, choose Properties, tick Unblock and click Apply; or run </w:t>
+      </w:r>
+      <w:r>
+        <w:rPr>
+          <w:rFonts w:ascii="Courier New" w:cs="Courier New" w:eastAsia="Courier New" w:hAnsi="Courier New"/>
+          <w:b w:val="false"/>
+          <w:bCs w:val="false"/>
+          <w:sz w:val="19"/>
+          <w:szCs w:val="19"/>
+        </w:rPr>
+        <w:t xml:space="preserve">powershell Unblock-File rxpip.rexx</w:t>
+      </w:r>
+      <w:r>
+        <w:rPr>
+          <w:rFonts w:ascii="Times New Roman" w:cs="Times New Roman" w:eastAsia="Times New Roman" w:hAnsi="Times New Roman"/>
+          <w:sz w:val="21"/>
+          <w:szCs w:val="21"/>
+        </w:rPr>
+        <w:t xml:space="preserve"> (and the same for </w:t>
+      </w:r>
+      <w:r>
+        <w:rPr>
+          <w:rFonts w:ascii="Courier New" w:cs="Courier New" w:eastAsia="Courier New" w:hAnsi="Courier New"/>
+          <w:b w:val="false"/>
+          <w:bCs w:val="false"/>
+          <w:sz w:val="19"/>
+          <w:szCs w:val="19"/>
+        </w:rPr>
+        <w:t xml:space="preserve">rxpip.bat</w:t>
+      </w:r>
+      <w:r>
+        <w:rPr>
+          <w:rFonts w:ascii="Times New Roman" w:cs="Times New Roman" w:eastAsia="Times New Roman" w:hAnsi="Times New Roman"/>
+          <w:sz w:val="21"/>
+          <w:szCs w:val="21"/>
+        </w:rPr>
+        <w:t xml:space="preserve">; </w:t>
+      </w:r>
+      <w:r>
+        <w:rPr>
+          <w:rFonts w:ascii="Courier New" w:cs="Courier New" w:eastAsia="Courier New" w:hAnsi="Courier New"/>
+          <w:b w:val="false"/>
+          <w:bCs w:val="false"/>
+          <w:sz w:val="19"/>
+          <w:szCs w:val="19"/>
+        </w:rPr>
+        <w:t xml:space="preserve">powershell Unblock-File *</w:t>
+      </w:r>
+      <w:r>
+        <w:rPr>
+          <w:rFonts w:ascii="Times New Roman" w:cs="Times New Roman" w:eastAsia="Times New Roman" w:hAnsi="Times New Roman"/>
+          <w:sz w:val="21"/>
+          <w:szCs w:val="21"/>
+        </w:rPr>
+        <w:t xml:space="preserve"> unblocks everything in the folder). Do this before unpacking a zip archive, not after.</w:t>
+      </w:r>
+    </w:p>
+    <w:p>
+      <w:pPr>
+        <w:pStyle w:val="ListParagraph"/>
+        <w:numPr>
+          <w:ilvl w:val="0"/>
+          <w:numId w:val="2"/>
+        </w:numPr>
+        <w:spacing w:after="60"/>
+      </w:pPr>
+      <w:r>
+        <w:rPr>
+          <w:rFonts w:ascii="Times New Roman" w:cs="Times New Roman" w:eastAsia="Times New Roman" w:hAnsi="Times New Roman"/>
+          <w:b/>
+          <w:bCs/>
+          <w:sz w:val="21"/>
+          <w:szCs w:val="21"/>
+        </w:rPr>
+        <w:t xml:space="preserve">macOS:</w:t>
+      </w:r>
+      <w:r>
+        <w:rPr>
+          <w:rFonts w:ascii="Times New Roman" w:cs="Times New Roman" w:eastAsia="Times New Roman" w:hAnsi="Times New Roman"/>
+          <w:sz w:val="21"/>
+          <w:szCs w:val="21"/>
+        </w:rPr>
+        <w:t xml:space="preserve"> run </w:t>
+      </w:r>
+      <w:r>
+        <w:rPr>
+          <w:rFonts w:ascii="Courier New" w:cs="Courier New" w:eastAsia="Courier New" w:hAnsi="Courier New"/>
+          <w:b w:val="false"/>
+          <w:bCs w:val="false"/>
+          <w:sz w:val="19"/>
+          <w:szCs w:val="19"/>
+        </w:rPr>
+        <w:t xml:space="preserve">xattr -d com.apple.quarantine rxpip.rexx</w:t>
+      </w:r>
+      <w:r>
+        <w:rPr>
+          <w:rFonts w:ascii="Times New Roman" w:cs="Times New Roman" w:eastAsia="Times New Roman" w:hAnsi="Times New Roman"/>
+          <w:sz w:val="21"/>
+          <w:szCs w:val="21"/>
+        </w:rPr>
+        <w:t xml:space="preserve"> in Terminal (</w:t>
+      </w:r>
+      <w:r>
+        <w:rPr>
+          <w:rFonts w:ascii="Courier New" w:cs="Courier New" w:eastAsia="Courier New" w:hAnsi="Courier New"/>
+          <w:b w:val="false"/>
+          <w:bCs w:val="false"/>
+          <w:sz w:val="19"/>
+          <w:szCs w:val="19"/>
+        </w:rPr>
+        <w:t xml:space="preserve">xattr rxpip.rexx</w:t>
+      </w:r>
+      <w:r>
+        <w:rPr>
+          <w:rFonts w:ascii="Times New Roman" w:cs="Times New Roman" w:eastAsia="Times New Roman" w:hAnsi="Times New Roman"/>
+          <w:sz w:val="21"/>
+          <w:szCs w:val="21"/>
+        </w:rPr>
+        <w:t xml:space="preserve"> shows the attributes), then </w:t>
+      </w:r>
+      <w:r>
+        <w:rPr>
+          <w:rFonts w:ascii="Courier New" w:cs="Courier New" w:eastAsia="Courier New" w:hAnsi="Courier New"/>
+          <w:b w:val="false"/>
+          <w:bCs w:val="false"/>
+          <w:sz w:val="19"/>
+          <w:szCs w:val="19"/>
+        </w:rPr>
+        <w:t xml:space="preserve">chmod +x rxpip.rexx</w:t>
+      </w:r>
+      <w:r>
+        <w:rPr>
+          <w:rFonts w:ascii="Times New Roman" w:cs="Times New Roman" w:eastAsia="Times New Roman" w:hAnsi="Times New Roman"/>
+          <w:sz w:val="21"/>
+          <w:szCs w:val="21"/>
+        </w:rPr>
+        <w:t xml:space="preserve">.</w:t>
+      </w:r>
+    </w:p>
+    <w:p>
+      <w:pPr>
+        <w:pStyle w:val="ListParagraph"/>
+        <w:numPr>
+          <w:ilvl w:val="0"/>
+          <w:numId w:val="2"/>
+        </w:numPr>
+        <w:spacing w:after="60"/>
+      </w:pPr>
+      <w:r>
+        <w:rPr>
+          <w:rFonts w:ascii="Times New Roman" w:cs="Times New Roman" w:eastAsia="Times New Roman" w:hAnsi="Times New Roman"/>
+          <w:b/>
+          <w:bCs/>
+          <w:sz w:val="21"/>
+          <w:szCs w:val="21"/>
+        </w:rPr>
+        <w:t xml:space="preserve">Linux and macOS:</w:t>
+      </w:r>
+      <w:r>
+        <w:rPr>
+          <w:rFonts w:ascii="Times New Roman" w:cs="Times New Roman" w:eastAsia="Times New Roman" w:hAnsi="Times New Roman"/>
+          <w:sz w:val="21"/>
+          <w:szCs w:val="21"/>
+        </w:rPr>
+        <w:t xml:space="preserve"> if a launcher lost its execute permission, run </w:t>
+      </w:r>
+      <w:r>
+        <w:rPr>
+          <w:rFonts w:ascii="Courier New" w:cs="Courier New" w:eastAsia="Courier New" w:hAnsi="Courier New"/>
+          <w:b w:val="false"/>
+          <w:bCs w:val="false"/>
+          <w:sz w:val="19"/>
+          <w:szCs w:val="19"/>
+        </w:rPr>
+        <w:t xml:space="preserve">chmod +x</w:t>
+      </w:r>
+      <w:r>
+        <w:rPr>
+          <w:rFonts w:ascii="Times New Roman" w:cs="Times New Roman" w:eastAsia="Times New Roman" w:hAnsi="Times New Roman"/>
+          <w:sz w:val="21"/>
+          <w:szCs w:val="21"/>
+        </w:rPr>
+        <w:t xml:space="preserve"> on it.</w:t>
+      </w:r>
+    </w:p>
+    <w:p>
+      <w:pPr>
+        <w:pStyle w:val="ListParagraph"/>
+        <w:numPr>
+          <w:ilvl w:val="0"/>
+          <w:numId w:val="2"/>
+        </w:numPr>
+        <w:spacing w:after="60"/>
+      </w:pPr>
+      <w:r>
+        <w:rPr>
+          <w:rFonts w:ascii="Times New Roman" w:cs="Times New Roman" w:eastAsia="Times New Roman" w:hAnsi="Times New Roman"/>
+          <w:b/>
+          <w:bCs/>
+          <w:sz w:val="21"/>
+          <w:szCs w:val="21"/>
+        </w:rPr>
+        <w:t xml:space="preserve">Check the file:</w:t>
+      </w:r>
+      <w:r>
+        <w:rPr>
+          <w:rFonts w:ascii="Times New Roman" w:cs="Times New Roman" w:eastAsia="Times New Roman" w:hAnsi="Times New Roman"/>
+          <w:sz w:val="21"/>
+          <w:szCs w:val="21"/>
+        </w:rPr>
+        <w:t xml:space="preserve"> the download page shows the SHA-256 of every file. Compare with </w:t>
+      </w:r>
+      <w:r>
+        <w:rPr>
+          <w:rFonts w:ascii="Courier New" w:cs="Courier New" w:eastAsia="Courier New" w:hAnsi="Courier New"/>
+          <w:b w:val="false"/>
+          <w:bCs w:val="false"/>
+          <w:sz w:val="19"/>
+          <w:szCs w:val="19"/>
+        </w:rPr>
+        <w:t xml:space="preserve">certutil -hashfile &lt;file&gt; SHA256</w:t>
+      </w:r>
+      <w:r>
+        <w:rPr>
+          <w:rFonts w:ascii="Times New Roman" w:cs="Times New Roman" w:eastAsia="Times New Roman" w:hAnsi="Times New Roman"/>
+          <w:sz w:val="21"/>
+          <w:szCs w:val="21"/>
+        </w:rPr>
+        <w:t xml:space="preserve"> (Windows), </w:t>
+      </w:r>
+      <w:r>
+        <w:rPr>
+          <w:rFonts w:ascii="Courier New" w:cs="Courier New" w:eastAsia="Courier New" w:hAnsi="Courier New"/>
+          <w:b w:val="false"/>
+          <w:bCs w:val="false"/>
+          <w:sz w:val="19"/>
+          <w:szCs w:val="19"/>
+        </w:rPr>
+        <w:t xml:space="preserve">shasum -a 256 &lt;file&gt;</w:t>
+      </w:r>
+      <w:r>
+        <w:rPr>
+          <w:rFonts w:ascii="Times New Roman" w:cs="Times New Roman" w:eastAsia="Times New Roman" w:hAnsi="Times New Roman"/>
+          <w:sz w:val="21"/>
+          <w:szCs w:val="21"/>
+        </w:rPr>
+        <w:t xml:space="preserve"> (macOS) or </w:t>
+      </w:r>
+      <w:r>
+        <w:rPr>
+          <w:rFonts w:ascii="Courier New" w:cs="Courier New" w:eastAsia="Courier New" w:hAnsi="Courier New"/>
+          <w:b w:val="false"/>
+          <w:bCs w:val="false"/>
+          <w:sz w:val="19"/>
+          <w:szCs w:val="19"/>
+        </w:rPr>
+        <w:t xml:space="preserve">sha256sum &lt;file&gt;</w:t>
+      </w:r>
+      <w:r>
+        <w:rPr>
+          <w:rFonts w:ascii="Times New Roman" w:cs="Times New Roman" w:eastAsia="Times New Roman" w:hAnsi="Times New Roman"/>
+          <w:sz w:val="21"/>
+          <w:szCs w:val="21"/>
+        </w:rPr>
+        <w:t xml:space="preserve"> (Linux).</w:t>
+      </w:r>
+    </w:p>
+    <w:p>
+      <w:pPr>
+        <w:spacing w:after="60"/>
+      </w:pPr>
     </w:p>
     <w:p>
       <w:pPr>

</xml_diff>

<commit_message>
Signed client releases (minisign): signatures published and shown, verified by rxpip update
Server: .minisig files are release files, linked on the download page with
the public key. Clients (all four): update verifies each signed file with
minisign before replacing anything; bad signature always refuses,
REQUIRE_SIGNATURE=1 also refuses unsigned. publish-clients.sh signs.
client/minisign.pub holds the key. Tests and docs updated.

Co-Authored-By: Claude Sonnet 5.5 <noreply@anthropic.com>
Claude-Session: https://claude.ai/code/session_012C2HMKLkyaTRCjXA8PHoVA
</commit_message>
<xml_diff>
--- a/docs/RXPIP-Guide.docx
+++ b/docs/RXPIP-Guide.docx
@@ -387,7 +387,7 @@
           <w:sz w:val="18"/>
           <w:szCs w:val="18"/>
         </w:rPr>
-        <w:t xml:space="preserve">Windows	5</w:t>
+        <w:t xml:space="preserve">Windows	6</w:t>
       </w:r>
     </w:p>
     <w:p>
@@ -5422,6 +5422,160 @@
           <w:sz w:val="21"/>
           <w:szCs w:val="21"/>
         </w:rPr>
+        <w:t xml:space="preserve">Check who published it:</w:t>
+      </w:r>
+      <w:r>
+        <w:rPr>
+          <w:rFonts w:ascii="Times New Roman" w:cs="Times New Roman" w:eastAsia="Times New Roman" w:hAnsi="Times New Roman"/>
+          <w:sz w:val="21"/>
+          <w:szCs w:val="21"/>
+        </w:rPr>
+        <w:t xml:space="preserve"> every release file has a signature (</w:t>
+      </w:r>
+      <w:r>
+        <w:rPr>
+          <w:rFonts w:ascii="Courier New" w:cs="Courier New" w:eastAsia="Courier New" w:hAnsi="Courier New"/>
+          <w:b w:val="false"/>
+          <w:bCs w:val="false"/>
+          <w:sz w:val="19"/>
+          <w:szCs w:val="19"/>
+        </w:rPr>
+        <w:t xml:space="preserve">.minisig</w:t>
+      </w:r>
+      <w:r>
+        <w:rPr>
+          <w:rFonts w:ascii="Times New Roman" w:cs="Times New Roman" w:eastAsia="Times New Roman" w:hAnsi="Times New Roman"/>
+          <w:sz w:val="21"/>
+          <w:szCs w:val="21"/>
+        </w:rPr>
+        <w:t xml:space="preserve">) made with minisign. The public key is on the download page and in the repository (</w:t>
+      </w:r>
+      <w:r>
+        <w:rPr>
+          <w:rFonts w:ascii="Courier New" w:cs="Courier New" w:eastAsia="Courier New" w:hAnsi="Courier New"/>
+          <w:b w:val="false"/>
+          <w:bCs w:val="false"/>
+          <w:sz w:val="19"/>
+          <w:szCs w:val="19"/>
+        </w:rPr>
+        <w:t xml:space="preserve">client/minisign.pub</w:t>
+      </w:r>
+      <w:r>
+        <w:rPr>
+          <w:rFonts w:ascii="Times New Roman" w:cs="Times New Roman" w:eastAsia="Times New Roman" w:hAnsi="Times New Roman"/>
+          <w:sz w:val="21"/>
+          <w:szCs w:val="21"/>
+        </w:rPr>
+        <w:t xml:space="preserve">): </w:t>
+      </w:r>
+      <w:r>
+        <w:rPr>
+          <w:rFonts w:ascii="Courier New" w:cs="Courier New" w:eastAsia="Courier New" w:hAnsi="Courier New"/>
+          <w:b w:val="false"/>
+          <w:bCs w:val="false"/>
+          <w:sz w:val="19"/>
+          <w:szCs w:val="19"/>
+        </w:rPr>
+        <w:t xml:space="preserve">RWTwuk9ZuGM56RANzR4KRqK6p6VEGsdcFyB6+vTeRmrlWFWZouyOjcYY</w:t>
+      </w:r>
+      <w:r>
+        <w:rPr>
+          <w:rFonts w:ascii="Times New Roman" w:cs="Times New Roman" w:eastAsia="Times New Roman" w:hAnsi="Times New Roman"/>
+          <w:sz w:val="21"/>
+          <w:szCs w:val="21"/>
+        </w:rPr>
+        <w:t xml:space="preserve">. Verify a downloaded file with </w:t>
+      </w:r>
+      <w:r>
+        <w:rPr>
+          <w:rFonts w:ascii="Courier New" w:cs="Courier New" w:eastAsia="Courier New" w:hAnsi="Courier New"/>
+          <w:b w:val="false"/>
+          <w:bCs w:val="false"/>
+          <w:sz w:val="19"/>
+          <w:szCs w:val="19"/>
+        </w:rPr>
+        <w:t xml:space="preserve">minisign -V -P &lt;key&gt; -m rxpip.rexx</w:t>
+      </w:r>
+      <w:r>
+        <w:rPr>
+          <w:rFonts w:ascii="Times New Roman" w:cs="Times New Roman" w:eastAsia="Times New Roman" w:hAnsi="Times New Roman"/>
+          <w:sz w:val="21"/>
+          <w:szCs w:val="21"/>
+        </w:rPr>
+        <w:t xml:space="preserve"> (the signature file must be next to it). </w:t>
+      </w:r>
+      <w:r>
+        <w:rPr>
+          <w:rFonts w:ascii="Courier New" w:cs="Courier New" w:eastAsia="Courier New" w:hAnsi="Courier New"/>
+          <w:b w:val="false"/>
+          <w:bCs w:val="false"/>
+          <w:sz w:val="19"/>
+          <w:szCs w:val="19"/>
+        </w:rPr>
+        <w:t xml:space="preserve">rxpip update</w:t>
+      </w:r>
+      <w:r>
+        <w:rPr>
+          <w:rFonts w:ascii="Times New Roman" w:cs="Times New Roman" w:eastAsia="Times New Roman" w:hAnsi="Times New Roman"/>
+          <w:sz w:val="21"/>
+          <w:szCs w:val="21"/>
+        </w:rPr>
+        <w:t xml:space="preserve"> does this itself when </w:t>
+      </w:r>
+      <w:r>
+        <w:rPr>
+          <w:rFonts w:ascii="Courier New" w:cs="Courier New" w:eastAsia="Courier New" w:hAnsi="Courier New"/>
+          <w:b w:val="false"/>
+          <w:bCs w:val="false"/>
+          <w:sz w:val="19"/>
+          <w:szCs w:val="19"/>
+        </w:rPr>
+        <w:t xml:space="preserve">minisign</w:t>
+      </w:r>
+      <w:r>
+        <w:rPr>
+          <w:rFonts w:ascii="Times New Roman" w:cs="Times New Roman" w:eastAsia="Times New Roman" w:hAnsi="Times New Roman"/>
+          <w:sz w:val="21"/>
+          <w:szCs w:val="21"/>
+        </w:rPr>
+        <w:t xml:space="preserve"> is installed, and refuses an update whose signature is wrong; </w:t>
+      </w:r>
+      <w:r>
+        <w:rPr>
+          <w:rFonts w:ascii="Courier New" w:cs="Courier New" w:eastAsia="Courier New" w:hAnsi="Courier New"/>
+          <w:b w:val="false"/>
+          <w:bCs w:val="false"/>
+          <w:sz w:val="19"/>
+          <w:szCs w:val="19"/>
+        </w:rPr>
+        <w:t xml:space="preserve">rxpip config set REQUIRE_SIGNATURE 1</w:t>
+      </w:r>
+      <w:r>
+        <w:rPr>
+          <w:rFonts w:ascii="Times New Roman" w:cs="Times New Roman" w:eastAsia="Times New Roman" w:hAnsi="Times New Roman"/>
+          <w:sz w:val="21"/>
+          <w:szCs w:val="21"/>
+        </w:rPr>
+        <w:t xml:space="preserve"> makes it refuse unsigned releases as well. minisign is at https://jedisct1.github.io/minisign/ (Windows, macOS and Linux downloads).</w:t>
+      </w:r>
+    </w:p>
+    <w:p>
+      <w:pPr>
+        <w:pStyle w:val="ListParagraph"/>
+        <w:numPr>
+          <w:ilvl w:val="0"/>
+          <w:numId w:val="2"/>
+        </w:numPr>
+        <w:spacing w:after="60"/>
+      </w:pPr>
+      <w:r>
+        <w:rPr>
+          <w:rFonts w:ascii="Times New Roman" w:cs="Times New Roman" w:eastAsia="Times New Roman" w:hAnsi="Times New Roman"/>
+          <w:b/>
+          <w:bCs/>
+          <w:sz w:val="21"/>
+          <w:szCs w:val="21"/>
+        </w:rPr>
         <w:t xml:space="preserve">Check the file:</w:t>
       </w:r>
       <w:r>
@@ -21303,6 +21457,302 @@
           <w:szCs w:val="21"/>
         </w:rPr>
         <w:t xml:space="preserve">, which stays open even when the repository is closed, because a client must always be able to update itself.</w:t>
+      </w:r>
+    </w:p>
+    <w:p>
+      <w:pPr>
+        <w:pStyle w:val="Heading3"/>
+        <w:keepNext/>
+        <w:spacing w:after="100" w:before="220"/>
+      </w:pPr>
+      <w:r>
+        <w:rPr>
+          <w:rFonts w:ascii="Arial" w:cs="Arial" w:eastAsia="Arial" w:hAnsi="Arial"/>
+          <w:b/>
+          <w:bCs/>
+          <w:color w:val="000000"/>
+          <w:sz w:val="22"/>
+          <w:szCs w:val="22"/>
+        </w:rPr>
+        <w:t xml:space="preserve">Signing client releases</w:t>
+      </w:r>
+    </w:p>
+    <w:p>
+      <w:pPr>
+        <w:spacing w:after="120"/>
+      </w:pPr>
+      <w:r>
+        <w:rPr>
+          <w:rFonts w:ascii="Times New Roman" w:cs="Times New Roman" w:eastAsia="Times New Roman" w:hAnsi="Times New Roman"/>
+          <w:sz w:val="21"/>
+          <w:szCs w:val="21"/>
+        </w:rPr>
+        <w:t xml:space="preserve">Client releases are signed with minisign so that users can check who published them, even if the server were compromised. Generate a key pair once on your own computer with </w:t>
+      </w:r>
+      <w:r>
+        <w:rPr>
+          <w:rFonts w:ascii="Courier New" w:cs="Courier New" w:eastAsia="Courier New" w:hAnsi="Courier New"/>
+          <w:b w:val="false"/>
+          <w:bCs w:val="false"/>
+          <w:sz w:val="19"/>
+          <w:szCs w:val="19"/>
+        </w:rPr>
+        <w:t xml:space="preserve">minisign -G</w:t>
+      </w:r>
+      <w:r>
+        <w:rPr>
+          <w:rFonts w:ascii="Times New Roman" w:cs="Times New Roman" w:eastAsia="Times New Roman" w:hAnsi="Times New Roman"/>
+          <w:sz w:val="21"/>
+          <w:szCs w:val="21"/>
+        </w:rPr>
+        <w:t xml:space="preserve"> and keep the private key (</w:t>
+      </w:r>
+      <w:r>
+        <w:rPr>
+          <w:rFonts w:ascii="Courier New" w:cs="Courier New" w:eastAsia="Courier New" w:hAnsi="Courier New"/>
+          <w:b w:val="false"/>
+          <w:bCs w:val="false"/>
+          <w:sz w:val="19"/>
+          <w:szCs w:val="19"/>
+        </w:rPr>
+        <w:t xml:space="preserve">~/.minisign/minisign.key</w:t>
+      </w:r>
+      <w:r>
+        <w:rPr>
+          <w:rFonts w:ascii="Times New Roman" w:cs="Times New Roman" w:eastAsia="Times New Roman" w:hAnsi="Times New Roman"/>
+          <w:sz w:val="21"/>
+          <w:szCs w:val="21"/>
+        </w:rPr>
+        <w:t xml:space="preserve">, protected by a password) off the server, with a backup. The public key belongs on the download page (the server shows the project key by default; </w:t>
+      </w:r>
+      <w:r>
+        <w:rPr>
+          <w:rFonts w:ascii="Courier New" w:cs="Courier New" w:eastAsia="Courier New" w:hAnsi="Courier New"/>
+          <w:b w:val="false"/>
+          <w:bCs w:val="false"/>
+          <w:sz w:val="19"/>
+          <w:szCs w:val="19"/>
+        </w:rPr>
+        <w:t xml:space="preserve">RXPIP_MINISIGN_KEY</w:t>
+      </w:r>
+      <w:r>
+        <w:rPr>
+          <w:rFonts w:ascii="Times New Roman" w:cs="Times New Roman" w:eastAsia="Times New Roman" w:hAnsi="Times New Roman"/>
+          <w:sz w:val="21"/>
+          <w:szCs w:val="21"/>
+        </w:rPr>
+        <w:t xml:space="preserve"> overrides it), in </w:t>
+      </w:r>
+      <w:r>
+        <w:rPr>
+          <w:rFonts w:ascii="Courier New" w:cs="Courier New" w:eastAsia="Courier New" w:hAnsi="Courier New"/>
+          <w:b w:val="false"/>
+          <w:bCs w:val="false"/>
+          <w:sz w:val="19"/>
+          <w:szCs w:val="19"/>
+        </w:rPr>
+        <w:t xml:space="preserve">client/minisign.pub</w:t>
+      </w:r>
+      <w:r>
+        <w:rPr>
+          <w:rFonts w:ascii="Times New Roman" w:cs="Times New Roman" w:eastAsia="Times New Roman" w:hAnsi="Times New Roman"/>
+          <w:sz w:val="21"/>
+          <w:szCs w:val="21"/>
+        </w:rPr>
+        <w:t xml:space="preserve"> and in the clients (the constant in </w:t>
+      </w:r>
+      <w:r>
+        <w:rPr>
+          <w:rFonts w:ascii="Courier New" w:cs="Courier New" w:eastAsia="Courier New" w:hAnsi="Courier New"/>
+          <w:b w:val="false"/>
+          <w:bCs w:val="false"/>
+          <w:sz w:val="19"/>
+          <w:szCs w:val="19"/>
+        </w:rPr>
+        <w:t xml:space="preserve">SignKey</w:t>
+      </w:r>
+      <w:r>
+        <w:rPr>
+          <w:rFonts w:ascii="Times New Roman" w:cs="Times New Roman" w:eastAsia="Times New Roman" w:hAnsi="Times New Roman"/>
+          <w:sz w:val="21"/>
+          <w:szCs w:val="21"/>
+        </w:rPr>
+        <w:t xml:space="preserve">).</w:t>
+      </w:r>
+    </w:p>
+    <w:p>
+      <w:pPr>
+        <w:spacing w:after="120"/>
+      </w:pPr>
+      <w:r>
+        <w:rPr>
+          <w:rFonts w:ascii="Times New Roman" w:cs="Times New Roman" w:eastAsia="Times New Roman" w:hAnsi="Times New Roman"/>
+          <w:sz w:val="21"/>
+          <w:szCs w:val="21"/>
+        </w:rPr>
+        <w:t xml:space="preserve">To release signed files, sign each file with </w:t>
+      </w:r>
+      <w:r>
+        <w:rPr>
+          <w:rFonts w:ascii="Courier New" w:cs="Courier New" w:eastAsia="Courier New" w:hAnsi="Courier New"/>
+          <w:b w:val="false"/>
+          <w:bCs w:val="false"/>
+          <w:sz w:val="19"/>
+          <w:szCs w:val="19"/>
+        </w:rPr>
+        <w:t xml:space="preserve">minisign -S -m &lt;file&gt;</w:t>
+      </w:r>
+      <w:r>
+        <w:rPr>
+          <w:rFonts w:ascii="Times New Roman" w:cs="Times New Roman" w:eastAsia="Times New Roman" w:hAnsi="Times New Roman"/>
+          <w:sz w:val="21"/>
+          <w:szCs w:val="21"/>
+        </w:rPr>
+        <w:t xml:space="preserve"> (this writes </w:t>
+      </w:r>
+      <w:r>
+        <w:rPr>
+          <w:rFonts w:ascii="Courier New" w:cs="Courier New" w:eastAsia="Courier New" w:hAnsi="Courier New"/>
+          <w:b w:val="false"/>
+          <w:bCs w:val="false"/>
+          <w:sz w:val="19"/>
+          <w:szCs w:val="19"/>
+        </w:rPr>
+        <w:t xml:space="preserve">&lt;file&gt;.minisig</w:t>
+      </w:r>
+      <w:r>
+        <w:rPr>
+          <w:rFonts w:ascii="Times New Roman" w:cs="Times New Roman" w:eastAsia="Times New Roman" w:hAnsi="Times New Roman"/>
+          <w:sz w:val="21"/>
+          <w:szCs w:val="21"/>
+        </w:rPr>
+        <w:t xml:space="preserve">) and give both to </w:t>
+      </w:r>
+      <w:r>
+        <w:rPr>
+          <w:rFonts w:ascii="Courier New" w:cs="Courier New" w:eastAsia="Courier New" w:hAnsi="Courier New"/>
+          <w:b w:val="false"/>
+          <w:bCs w:val="false"/>
+          <w:sz w:val="19"/>
+          <w:szCs w:val="19"/>
+        </w:rPr>
+        <w:t xml:space="preserve">client-publish</w:t>
+      </w:r>
+      <w:r>
+        <w:rPr>
+          <w:rFonts w:ascii="Times New Roman" w:cs="Times New Roman" w:eastAsia="Times New Roman" w:hAnsi="Times New Roman"/>
+          <w:sz w:val="21"/>
+          <w:szCs w:val="21"/>
+        </w:rPr>
+        <w:t xml:space="preserve">, for example </w:t>
+      </w:r>
+      <w:r>
+        <w:rPr>
+          <w:rFonts w:ascii="Courier New" w:cs="Courier New" w:eastAsia="Courier New" w:hAnsi="Courier New"/>
+          <w:b w:val="false"/>
+          <w:bCs w:val="false"/>
+          <w:sz w:val="19"/>
+          <w:szCs w:val="19"/>
+        </w:rPr>
+        <w:t xml:space="preserve">rxpip admin client-publish regina --version=1.3.0 rxpip.rexx rxpip.rexx.minisig rxpip.bat rxpip.bat.minisig</w:t>
+      </w:r>
+      <w:r>
+        <w:rPr>
+          <w:rFonts w:ascii="Times New Roman" w:cs="Times New Roman" w:eastAsia="Times New Roman" w:hAnsi="Times New Roman"/>
+          <w:sz w:val="21"/>
+          <w:szCs w:val="21"/>
+        </w:rPr>
+        <w:t xml:space="preserve">. </w:t>
+      </w:r>
+      <w:r>
+        <w:rPr>
+          <w:rFonts w:ascii="Courier New" w:cs="Courier New" w:eastAsia="Courier New" w:hAnsi="Courier New"/>
+          <w:b w:val="false"/>
+          <w:bCs w:val="false"/>
+          <w:sz w:val="19"/>
+          <w:szCs w:val="19"/>
+        </w:rPr>
+        <w:t xml:space="preserve">tools/publish-clients.sh</w:t>
+      </w:r>
+      <w:r>
+        <w:rPr>
+          <w:rFonts w:ascii="Times New Roman" w:cs="Times New Roman" w:eastAsia="Times New Roman" w:hAnsi="Times New Roman"/>
+          <w:sz w:val="21"/>
+          <w:szCs w:val="21"/>
+        </w:rPr>
+        <w:t xml:space="preserve"> signs for you when </w:t>
+      </w:r>
+      <w:r>
+        <w:rPr>
+          <w:rFonts w:ascii="Courier New" w:cs="Courier New" w:eastAsia="Courier New" w:hAnsi="Courier New"/>
+          <w:b w:val="false"/>
+          <w:bCs w:val="false"/>
+          <w:sz w:val="19"/>
+          <w:szCs w:val="19"/>
+        </w:rPr>
+        <w:t xml:space="preserve">minisign</w:t>
+      </w:r>
+      <w:r>
+        <w:rPr>
+          <w:rFonts w:ascii="Times New Roman" w:cs="Times New Roman" w:eastAsia="Times New Roman" w:hAnsi="Times New Roman"/>
+          <w:sz w:val="21"/>
+          <w:szCs w:val="21"/>
+        </w:rPr>
+        <w:t xml:space="preserve"> is installed. The download page links each signature, and </w:t>
+      </w:r>
+      <w:r>
+        <w:rPr>
+          <w:rFonts w:ascii="Courier New" w:cs="Courier New" w:eastAsia="Courier New" w:hAnsi="Courier New"/>
+          <w:b w:val="false"/>
+          <w:bCs w:val="false"/>
+          <w:sz w:val="19"/>
+          <w:szCs w:val="19"/>
+        </w:rPr>
+        <w:t xml:space="preserve">rxpip update</w:t>
+      </w:r>
+      <w:r>
+        <w:rPr>
+          <w:rFonts w:ascii="Times New Roman" w:cs="Times New Roman" w:eastAsia="Times New Roman" w:hAnsi="Times New Roman"/>
+          <w:sz w:val="21"/>
+          <w:szCs w:val="21"/>
+        </w:rPr>
+        <w:t xml:space="preserve"> verifies it before it replaces any file: a wrong signature always stops the update, a missing one only warns unless </w:t>
+      </w:r>
+      <w:r>
+        <w:rPr>
+          <w:rFonts w:ascii="Courier New" w:cs="Courier New" w:eastAsia="Courier New" w:hAnsi="Courier New"/>
+          <w:b w:val="false"/>
+          <w:bCs w:val="false"/>
+          <w:sz w:val="19"/>
+          <w:szCs w:val="19"/>
+        </w:rPr>
+        <w:t xml:space="preserve">REQUIRE_SIGNATURE</w:t>
+      </w:r>
+      <w:r>
+        <w:rPr>
+          <w:rFonts w:ascii="Times New Roman" w:cs="Times New Roman" w:eastAsia="Times New Roman" w:hAnsi="Times New Roman"/>
+          <w:sz w:val="21"/>
+          <w:szCs w:val="21"/>
+        </w:rPr>
+        <w:t xml:space="preserve"> is </w:t>
+      </w:r>
+      <w:r>
+        <w:rPr>
+          <w:rFonts w:ascii="Courier New" w:cs="Courier New" w:eastAsia="Courier New" w:hAnsi="Courier New"/>
+          <w:b w:val="false"/>
+          <w:bCs w:val="false"/>
+          <w:sz w:val="19"/>
+          <w:szCs w:val="19"/>
+        </w:rPr>
+        <w:t xml:space="preserve">1</w:t>
+      </w:r>
+      <w:r>
+        <w:rPr>
+          <w:rFonts w:ascii="Times New Roman" w:cs="Times New Roman" w:eastAsia="Times New Roman" w:hAnsi="Times New Roman"/>
+          <w:sz w:val="21"/>
+          <w:szCs w:val="21"/>
+        </w:rPr>
+        <w:t xml:space="preserve">. The private key is the one thing that must not be lost or leaked: with it anyone can sign as you. Changing the key means releasing new clients that contain the new public key, so existing users must update by hand once.</w:t>
       </w:r>
     </w:p>
     <w:p>

</xml_diff>

<commit_message>
Clients remove the Internet mark from what they download and unpack
Windows Zone.Identifier / macOS quarantine are removed from package archives,
unpacked trees and client update files (only files rxpip fetched itself), so
packages with binaries, DLLs or .so files work without manual unblocking.
Failures are ignored. Docs updated.

Co-Authored-By: Claude Sonnet 5.5 <noreply@anthropic.com>
Claude-Session: https://claude.ai/code/session_012C2HMKLkyaTRCjXA8PHoVA
</commit_message>
<xml_diff>
--- a/docs/RXPIP-Guide.docx
+++ b/docs/RXPIP-Guide.docx
@@ -368,7 +368,7 @@
           <w:sz w:val="18"/>
           <w:szCs w:val="18"/>
         </w:rPr>
-        <w:t xml:space="preserve">Linux and macOS	5</w:t>
+        <w:t xml:space="preserve">Linux and macOS	6</w:t>
       </w:r>
     </w:p>
     <w:p>
@@ -425,7 +425,7 @@
           <w:sz w:val="18"/>
           <w:szCs w:val="18"/>
         </w:rPr>
-        <w:t xml:space="preserve">Pointing the client at a repository	6</w:t>
+        <w:t xml:space="preserve">Pointing the client at a repository	7</w:t>
       </w:r>
     </w:p>
     <w:p>
@@ -482,7 +482,7 @@
           <w:sz w:val="18"/>
           <w:szCs w:val="18"/>
         </w:rPr>
-        <w:t xml:space="preserve">RXPIP on VM/370plus (CMS)	7</w:t>
+        <w:t xml:space="preserve">RXPIP on VM/370plus (CMS)	8</w:t>
       </w:r>
     </w:p>
     <w:p>
@@ -5144,6 +5144,91 @@
           <w:szCs w:val="21"/>
         </w:rPr>
         <w:t xml:space="preserve"> keeps the client current. If you have the source kit instead, the sections below describe the same installation from the kit.</w:t>
+      </w:r>
+    </w:p>
+    <w:p>
+      <w:pPr>
+        <w:pStyle w:val="Heading3"/>
+        <w:keepNext/>
+        <w:spacing w:after="100" w:before="220"/>
+      </w:pPr>
+      <w:r>
+        <w:rPr>
+          <w:rFonts w:ascii="Arial" w:cs="Arial" w:eastAsia="Arial" w:hAnsi="Arial"/>
+          <w:b/>
+          <w:bCs/>
+          <w:color w:val="000000"/>
+          <w:sz w:val="22"/>
+          <w:szCs w:val="22"/>
+        </w:rPr>
+        <w:t xml:space="preserve">Packages and the Internet mark</w:t>
+      </w:r>
+    </w:p>
+    <w:p>
+      <w:pPr>
+        <w:spacing w:after="120"/>
+      </w:pPr>
+      <w:r>
+        <w:rPr>
+          <w:rFonts w:ascii="Times New Roman" w:cs="Times New Roman" w:eastAsia="Times New Roman" w:hAnsi="Times New Roman"/>
+          <w:sz w:val="21"/>
+          <w:szCs w:val="21"/>
+        </w:rPr>
+        <w:t xml:space="preserve">Windows and macOS refuse to start binaries that came from the Internet and still carry the mark that says so; this includes the contents of an archive that was unpacked from a marked file. REXX scripts are not affected, because the REXX interpreter starts them, not the operating system. A package that contains a binary, a DLL or a </w:t>
+      </w:r>
+      <w:r>
+        <w:rPr>
+          <w:rFonts w:ascii="Courier New" w:cs="Courier New" w:eastAsia="Courier New" w:hAnsi="Courier New"/>
+          <w:b w:val="false"/>
+          <w:bCs w:val="false"/>
+          <w:sz w:val="19"/>
+          <w:szCs w:val="19"/>
+        </w:rPr>
+        <w:t xml:space="preserve">.so</w:t>
+      </w:r>
+      <w:r>
+        <w:rPr>
+          <w:rFonts w:ascii="Times New Roman" w:cs="Times New Roman" w:eastAsia="Times New Roman" w:hAnsi="Times New Roman"/>
+          <w:sz w:val="21"/>
+          <w:szCs w:val="21"/>
+        </w:rPr>
+        <w:t xml:space="preserve"> file, however, would stop working. </w:t>
+      </w:r>
+      <w:r>
+        <w:rPr>
+          <w:rFonts w:ascii="Courier New" w:cs="Courier New" w:eastAsia="Courier New" w:hAnsi="Courier New"/>
+          <w:b w:val="false"/>
+          <w:bCs w:val="false"/>
+          <w:sz w:val="19"/>
+          <w:szCs w:val="19"/>
+        </w:rPr>
+        <w:t xml:space="preserve">rxpip</w:t>
+      </w:r>
+      <w:r>
+        <w:rPr>
+          <w:rFonts w:ascii="Times New Roman" w:cs="Times New Roman" w:eastAsia="Times New Roman" w:hAnsi="Times New Roman"/>
+          <w:sz w:val="21"/>
+          <w:szCs w:val="21"/>
+        </w:rPr>
+        <w:t xml:space="preserve"> therefore removes the mark (on Windows the </w:t>
+      </w:r>
+      <w:r>
+        <w:rPr>
+          <w:rFonts w:ascii="Courier New" w:cs="Courier New" w:eastAsia="Courier New" w:hAnsi="Courier New"/>
+          <w:b w:val="false"/>
+          <w:bCs w:val="false"/>
+          <w:sz w:val="19"/>
+          <w:szCs w:val="19"/>
+        </w:rPr>
+        <w:t xml:space="preserve">Zone.Identifier</w:t>
+      </w:r>
+      <w:r>
+        <w:rPr>
+          <w:rFonts w:ascii="Times New Roman" w:cs="Times New Roman" w:eastAsia="Times New Roman" w:hAnsi="Times New Roman"/>
+          <w:sz w:val="21"/>
+          <w:szCs w:val="21"/>
+        </w:rPr>
+        <w:t xml:space="preserve"> stream, on macOS the quarantine attribute) from every archive it downloads and from the unpacked files before it installs them, and from the files of a client update before it replaces the old ones. It does this only for files that rxpip itself fetched, never for other files in your folder, and it never reports an error if it cannot. Files that you download with a browser yourself are not touched; for them see the next section.</w:t>
       </w:r>
     </w:p>
     <w:p>

</xml_diff>

<commit_message>
Replace publish-clients.cmd with a cross-platform publish-clients.rexx
Co-Authored-By: Claude Sonnet 5.5 <noreply@anthropic.com>
Claude-Session: https://claude.ai/code/session_012C2HMKLkyaTRCjXA8PHoVA
</commit_message>
<xml_diff>
--- a/docs/RXPIP-Guide.docx
+++ b/docs/RXPIP-Guide.docx
@@ -23210,7 +23210,25 @@
           <w:sz w:val="21"/>
           <w:szCs w:val="21"/>
         </w:rPr>
-        <w:t xml:space="preserve"> signs for you when </w:t>
+        <w:t xml:space="preserve"> (Linux and macOS) or </w:t>
+      </w:r>
+      <w:r>
+        <w:rPr>
+          <w:rFonts w:ascii="Courier New" w:cs="Courier New" w:eastAsia="Courier New" w:hAnsi="Courier New"/>
+          <w:b w:val="false"/>
+          <w:bCs w:val="false"/>
+          <w:sz w:val="19"/>
+          <w:szCs w:val="19"/>
+        </w:rPr>
+        <w:t xml:space="preserve">regina -a tools/publish-clients.rexx</w:t>
+      </w:r>
+      <w:r>
+        <w:rPr>
+          <w:rFonts w:ascii="Times New Roman" w:cs="Times New Roman" w:eastAsia="Times New Roman" w:hAnsi="Times New Roman"/>
+          <w:sz w:val="21"/>
+          <w:szCs w:val="21"/>
+        </w:rPr>
+        <w:t xml:space="preserve"> (also Windows) signs for you when </w:t>
       </w:r>
       <w:r>
         <w:rPr>

</xml_diff>

<commit_message>
Virus scanning of uploads (fail closed), like/recommend mechanism, client 1.5.0
Co-Authored-By: Claude Sonnet 5.5 <noreply@anthropic.com>
Claude-Session: https://claude.ai/code/session_012C2HMKLkyaTRCjXA8PHoVA
</commit_message>
<xml_diff>
--- a/docs/RXPIP-Guide.docx
+++ b/docs/RXPIP-Guide.docx
@@ -9270,6 +9270,101 @@
     </w:p>
     <w:p>
       <w:pPr>
+        <w:spacing w:after="120"/>
+      </w:pPr>
+      <w:r>
+        <w:rPr>
+          <w:rFonts w:ascii="Times New Roman" w:cs="Times New Roman" w:eastAsia="Times New Roman" w:hAnsi="Times New Roman"/>
+          <w:b/>
+          <w:bCs/>
+          <w:sz w:val="21"/>
+          <w:szCs w:val="21"/>
+        </w:rPr>
+        <w:t xml:space="preserve">Recommending packages.</w:t>
+      </w:r>
+      <w:r>
+        <w:rPr>
+          <w:rFonts w:ascii="Times New Roman" w:cs="Times New Roman" w:eastAsia="Times New Roman" w:hAnsi="Times New Roman"/>
+          <w:sz w:val="21"/>
+          <w:szCs w:val="21"/>
+        </w:rPr>
+        <w:t xml:space="preserve"> </w:t>
+      </w:r>
+      <w:r>
+        <w:rPr>
+          <w:rFonts w:ascii="Courier New" w:cs="Courier New" w:eastAsia="Courier New" w:hAnsi="Courier New"/>
+          <w:b w:val="false"/>
+          <w:bCs w:val="false"/>
+          <w:sz w:val="19"/>
+          <w:szCs w:val="19"/>
+        </w:rPr>
+        <w:t xml:space="preserve">rxpip like &lt;name&gt;</w:t>
+      </w:r>
+      <w:r>
+        <w:rPr>
+          <w:rFonts w:ascii="Times New Roman" w:cs="Times New Roman" w:eastAsia="Times New Roman" w:hAnsi="Times New Roman"/>
+          <w:sz w:val="21"/>
+          <w:szCs w:val="21"/>
+        </w:rPr>
+        <w:t xml:space="preserve"> recommends a public package (one recommendation per user; not your own packages) and </w:t>
+      </w:r>
+      <w:r>
+        <w:rPr>
+          <w:rFonts w:ascii="Courier New" w:cs="Courier New" w:eastAsia="Courier New" w:hAnsi="Courier New"/>
+          <w:b w:val="false"/>
+          <w:bCs w:val="false"/>
+          <w:sz w:val="19"/>
+          <w:szCs w:val="19"/>
+        </w:rPr>
+        <w:t xml:space="preserve">rxpip unlike &lt;name&gt;</w:t>
+      </w:r>
+      <w:r>
+        <w:rPr>
+          <w:rFonts w:ascii="Times New Roman" w:cs="Times New Roman" w:eastAsia="Times New Roman" w:hAnsi="Times New Roman"/>
+          <w:sz w:val="21"/>
+          <w:szCs w:val="21"/>
+        </w:rPr>
+        <w:t xml:space="preserve"> takes it back. </w:t>
+      </w:r>
+      <w:r>
+        <w:rPr>
+          <w:rFonts w:ascii="Courier New" w:cs="Courier New" w:eastAsia="Courier New" w:hAnsi="Courier New"/>
+          <w:b w:val="false"/>
+          <w:bCs w:val="false"/>
+          <w:sz w:val="19"/>
+          <w:szCs w:val="19"/>
+        </w:rPr>
+        <w:t xml:space="preserve">rxpip search --sort=likes</w:t>
+      </w:r>
+      <w:r>
+        <w:rPr>
+          <w:rFonts w:ascii="Times New Roman" w:cs="Times New Roman" w:eastAsia="Times New Roman" w:hAnsi="Times New Roman"/>
+          <w:sz w:val="21"/>
+          <w:szCs w:val="21"/>
+        </w:rPr>
+        <w:t xml:space="preserve"> lists the most recommended first, and </w:t>
+      </w:r>
+      <w:r>
+        <w:rPr>
+          <w:rFonts w:ascii="Courier New" w:cs="Courier New" w:eastAsia="Courier New" w:hAnsi="Courier New"/>
+          <w:b w:val="false"/>
+          <w:bCs w:val="false"/>
+          <w:sz w:val="19"/>
+          <w:szCs w:val="19"/>
+        </w:rPr>
+        <w:t xml:space="preserve">show</w:t>
+      </w:r>
+      <w:r>
+        <w:rPr>
+          <w:rFonts w:ascii="Times New Roman" w:cs="Times New Roman" w:eastAsia="Times New Roman" w:hAnsi="Times New Roman"/>
+          <w:sz w:val="21"/>
+          <w:szCs w:val="21"/>
+        </w:rPr>
+        <w:t xml:space="preserve"> and the web pages display the count.</w:t>
+      </w:r>
+    </w:p>
+    <w:p>
+      <w:pPr>
         <w:pStyle w:val="Heading2"/>
         <w:keepNext/>
         <w:spacing w:after="140" w:before="320"/>
@@ -15335,6 +15430,65 @@
           <w:szCs w:val="21"/>
         </w:rPr>
         <w:t xml:space="preserve">: every user who can publish is somebody whose code other people will run, and an open sign-up on a code repository is an easy way to distribute malware.</w:t>
+      </w:r>
+    </w:p>
+    <w:p>
+      <w:pPr>
+        <w:spacing w:after="120"/>
+      </w:pPr>
+      <w:r>
+        <w:rPr>
+          <w:rFonts w:ascii="Times New Roman" w:cs="Times New Roman" w:eastAsia="Times New Roman" w:hAnsi="Times New Roman"/>
+          <w:b/>
+          <w:bCs/>
+          <w:sz w:val="21"/>
+          <w:szCs w:val="21"/>
+        </w:rPr>
+        <w:t xml:space="preserve">Virus scanning.</w:t>
+      </w:r>
+      <w:r>
+        <w:rPr>
+          <w:rFonts w:ascii="Times New Roman" w:cs="Times New Roman" w:eastAsia="Times New Roman" w:hAnsi="Times New Roman"/>
+          <w:sz w:val="21"/>
+          <w:szCs w:val="21"/>
+        </w:rPr>
+        <w:t xml:space="preserve"> Every upload is scanned by ClamAV before the repository keeps it. An infected upload is rejected (</w:t>
+      </w:r>
+      <w:r>
+        <w:rPr>
+          <w:rFonts w:ascii="Courier New" w:cs="Courier New" w:eastAsia="Courier New" w:hAnsi="Courier New"/>
+          <w:b w:val="false"/>
+          <w:bCs w:val="false"/>
+          <w:sz w:val="19"/>
+          <w:szCs w:val="19"/>
+        </w:rPr>
+        <w:t xml:space="preserve">VIRUS_FOUND</w:t>
+      </w:r>
+      <w:r>
+        <w:rPr>
+          <w:rFonts w:ascii="Times New Roman" w:cs="Times New Roman" w:eastAsia="Times New Roman" w:hAnsi="Times New Roman"/>
+          <w:sz w:val="21"/>
+          <w:szCs w:val="21"/>
+        </w:rPr>
+        <w:t xml:space="preserve">), and if the scanner is not available the upload is refused (</w:t>
+      </w:r>
+      <w:r>
+        <w:rPr>
+          <w:rFonts w:ascii="Courier New" w:cs="Courier New" w:eastAsia="Courier New" w:hAnsi="Courier New"/>
+          <w:b w:val="false"/>
+          <w:bCs w:val="false"/>
+          <w:sz w:val="19"/>
+          <w:szCs w:val="19"/>
+        </w:rPr>
+        <w:t xml:space="preserve">SCANNER_UNAVAILABLE</w:t>
+      </w:r>
+      <w:r>
+        <w:rPr>
+          <w:rFonts w:ascii="Times New Roman" w:cs="Times New Roman" w:eastAsia="Times New Roman" w:hAnsi="Times New Roman"/>
+          <w:sz w:val="21"/>
+          <w:szCs w:val="21"/>
+        </w:rPr>
+        <w:t xml:space="preserve">) rather than accepted unchecked; try again later or tell the operator. The whole repository is rescanned weekly.</w:t>
       </w:r>
     </w:p>
     <w:p>

</xml_diff>